<commit_message>
docs(thesis): polish image captions and regenerate exports
</commit_message>
<xml_diff>
--- a/Thesis/docx_export/BAB_3_METODOLOGI_PENELITIAN.docx
+++ b/Thesis/docx_export/BAB_3_METODOLOGI_PENELITIAN.docx
@@ -13086,7 +13086,7 @@
           <w:i/>
           <w:sz w:val="19"/>
         </w:rPr>
-        <w:t>[Gambar 3.3. Papan Pengendali Penerbangan (**Flight Controller**) Pixhawk 2.4.8]</w:t>
+        <w:t>[Gambar 3.3. Papan Pengendali Penerbangan (*Flight Controller*) Pixhawk 2.4.8]</w:t>
       </w:r>
     </w:p>
     <w:p>
@@ -13101,7 +13101,7 @@
           <w:i/>
           <w:sz w:val="19"/>
         </w:rPr>
-        <w:t>[Gambar 3.4. Komputer Pendamping (**Companion Computer**) Raspberry Pi 4B]</w:t>
+        <w:t>[Gambar 3.4. Komputer Pendamping (*Companion Computer*) Raspberry Pi 4B]</w:t>
       </w:r>
     </w:p>
     <w:p>
@@ -13116,7 +13116,7 @@
           <w:i/>
           <w:sz w:val="19"/>
         </w:rPr>
-        <w:t>[Gambar 3.5. Modul Pengendali Kecepatan Elektronik (*Basic *Electronic Speed Controller** / ESC)]</w:t>
+        <w:t>[Gambar 3.5. Modul Pengendali Kecepatan Elektronik (*Basic Electronic Speed Controller* / ESC)]</w:t>
       </w:r>
     </w:p>
     <w:p>
@@ -13131,7 +13131,7 @@
           <w:i/>
           <w:sz w:val="19"/>
         </w:rPr>
-        <w:t>[Gambar 3.6. Motor Pendorong (**Thruster**) T200]</w:t>
+        <w:t>[Gambar 3.6. Motor Pendorong (*Thruster*) T200]</w:t>
       </w:r>
     </w:p>
     <w:p>

</xml_diff>

<commit_message>
docs(thesis): update proposal title, department affiliation, and sanitize markdown artifacts in docx
</commit_message>
<xml_diff>
--- a/Thesis/docx_export/BAB_3_METODOLOGI_PENELITIAN.docx
+++ b/Thesis/docx_export/BAB_3_METODOLOGI_PENELITIAN.docx
@@ -26,11 +26,33 @@
       <w:r>
         <w:rPr>
           <w:rFonts w:ascii="Arial" w:hAnsi="Arial"/>
+          <w:i/>
+          <w:sz w:val="19"/>
+        </w:rPr>
+        <w:t>Penulis</w:t>
+      </w:r>
+      <w:r>
+        <w:rPr>
+          <w:rFonts w:ascii="Arial" w:hAnsi="Arial"/>
+          <w:i/>
+          <w:sz w:val="19"/>
+        </w:rPr>
+        <w:t>: Radhi Shafeeq</w:t>
+      </w:r>
+    </w:p>
+    <w:p>
+      <w:pPr>
+        <w:spacing w:after="80"/>
+        <w:ind w:left="680"/>
+      </w:pPr>
+      <w:r>
+        <w:rPr>
+          <w:rFonts w:ascii="Arial" w:hAnsi="Arial"/>
           <w:b/>
           <w:i/>
           <w:sz w:val="19"/>
         </w:rPr>
-        <w:t>Penulis</w:t>
+        <w:t>NIM</w:t>
       </w:r>
       <w:r>
         <w:rPr>
@@ -38,7 +60,7 @@
           <w:i/>
           <w:sz w:val="19"/>
         </w:rPr>
-        <w:t>: Radhi Shafeeq</w:t>
+        <w:t>: D021201000</w:t>
       </w:r>
     </w:p>
     <w:p>
@@ -53,7 +75,7 @@
           <w:i/>
           <w:sz w:val="19"/>
         </w:rPr>
-        <w:t>NIM</w:t>
+        <w:t>Program Studi</w:t>
       </w:r>
       <w:r>
         <w:rPr>
@@ -61,7 +83,7 @@
           <w:i/>
           <w:sz w:val="19"/>
         </w:rPr>
-        <w:t>: D021201000</w:t>
+        <w:t>: Sarjana (S1) Departemen Teknik Mesin</w:t>
       </w:r>
     </w:p>
     <w:p>
@@ -76,7 +98,7 @@
           <w:i/>
           <w:sz w:val="19"/>
         </w:rPr>
-        <w:t>Program Studi</w:t>
+        <w:t>Fakultas</w:t>
       </w:r>
       <w:r>
         <w:rPr>
@@ -84,7 +106,7 @@
           <w:i/>
           <w:sz w:val="19"/>
         </w:rPr>
-        <w:t>: Sarjana (S1) Departemen Teknik Mesin</w:t>
+        <w:t>: Fakultas Teknik, Universitas Hasanuddin</w:t>
       </w:r>
     </w:p>
     <w:p>
@@ -95,11 +117,10 @@
       <w:r>
         <w:rPr>
           <w:rFonts w:ascii="Arial" w:hAnsi="Arial"/>
-          <w:b/>
           <w:i/>
           <w:sz w:val="19"/>
         </w:rPr>
-        <w:t>Fakultas</w:t>
+        <w:t>Format Penulisan</w:t>
       </w:r>
       <w:r>
         <w:rPr>
@@ -107,7 +128,7 @@
           <w:i/>
           <w:sz w:val="19"/>
         </w:rPr>
-        <w:t>: Fakultas Teknik, Universitas Hasanuddin</w:t>
+        <w:t>: Sesuai dengan Pedoman Tugas Akhir Mahasiswa Fakultas Teknik Universitas Hasanuddin</w:t>
       </w:r>
     </w:p>
     <w:p>
@@ -118,11 +139,10 @@
       <w:r>
         <w:rPr>
           <w:rFonts w:ascii="Arial" w:hAnsi="Arial"/>
-          <w:b/>
           <w:i/>
           <w:sz w:val="19"/>
         </w:rPr>
-        <w:t>Format Penulisan</w:t>
+        <w:t>Standar Notasi</w:t>
       </w:r>
       <w:r>
         <w:rPr>
@@ -130,30 +150,29 @@
           <w:i/>
           <w:sz w:val="19"/>
         </w:rPr>
-        <w:t xml:space="preserve">: Sesuai dengan </w:t>
-      </w:r>
+        <w:t>: Society of Naval Architects and Marine Engineers (SNAME, 1950) &amp; Fossen (2021)</w:t>
+      </w:r>
+    </w:p>
+    <w:p>
+      <w:pPr>
+        <w:spacing w:after="80"/>
+        <w:ind w:left="680"/>
+      </w:pPr>
       <w:r>
         <w:rPr>
           <w:rFonts w:ascii="Arial" w:hAnsi="Arial"/>
           <w:i/>
           <w:sz w:val="19"/>
         </w:rPr>
-        <w:t>Pedoman Tugas Akhir Mahasiswa Fakultas Teknik Universitas Hasanuddin</w:t>
-      </w:r>
-    </w:p>
-    <w:p>
-      <w:pPr>
-        <w:spacing w:after="80"/>
-        <w:ind w:left="680"/>
-      </w:pPr>
-      <w:r>
-        <w:rPr>
-          <w:rFonts w:ascii="Arial" w:hAnsi="Arial"/>
-          <w:b/>
+        <w:t>Format Matematis</w:t>
+      </w:r>
+      <w:r>
+        <w:rPr>
+          <w:rFonts w:ascii="Arial" w:hAnsi="Arial"/>
           <w:i/>
           <w:sz w:val="19"/>
         </w:rPr>
-        <w:t>Standar Notasi</w:t>
+        <w:t xml:space="preserve">: Seluruh persamaan dan variabel skalar/vektor/matriks diformat secara ketat menggunakan delimitasi </w:t>
       </w:r>
       <w:r>
         <w:rPr>
@@ -161,62 +180,15 @@
           <w:i/>
           <w:sz w:val="19"/>
         </w:rPr>
-        <w:t>: Society of Naval Architects and Marine Engineers (SNAME, 1950) &amp; Fossen (2021)</w:t>
-      </w:r>
-    </w:p>
-    <w:p>
-      <w:pPr>
-        <w:spacing w:after="80"/>
-        <w:ind w:left="680"/>
-      </w:pPr>
-      <w:r>
-        <w:rPr>
-          <w:rFonts w:ascii="Arial" w:hAnsi="Arial"/>
-          <w:b/>
+        <w:t>$$...$$</w:t>
+      </w:r>
+      <w:r>
+        <w:rPr>
+          <w:rFonts w:ascii="Arial" w:hAnsi="Arial"/>
           <w:i/>
           <w:sz w:val="19"/>
         </w:rPr>
-        <w:t>Format Matematis</w:t>
-      </w:r>
-      <w:r>
-        <w:rPr>
-          <w:rFonts w:ascii="Arial" w:hAnsi="Arial"/>
-          <w:i/>
-          <w:sz w:val="19"/>
-        </w:rPr>
-        <w:t xml:space="preserve">: Seluruh persamaan dan variabel skalar/vektor/matriks diformat secara ketat menggunakan delimitasi </w:t>
-      </w:r>
-      <w:r>
-        <w:rPr>
-          <w:rFonts w:ascii="Arial" w:hAnsi="Arial"/>
-          <w:i/>
-          <w:sz w:val="19"/>
-        </w:rPr>
-        <w:t>$$...$$</w:t>
-      </w:r>
-      <w:r>
-        <w:rPr>
-          <w:rFonts w:ascii="Arial" w:hAnsi="Arial"/>
-          <w:i/>
-          <w:sz w:val="19"/>
-        </w:rPr>
-        <w:t xml:space="preserve"> untuk kompatibilitas penuh dengan pengaya Google Docs </w:t>
-      </w:r>
-      <w:r>
-        <w:rPr>
-          <w:rFonts w:ascii="Arial" w:hAnsi="Arial"/>
-          <w:i/>
-          <w:sz w:val="19"/>
-        </w:rPr>
-        <w:t>Auto-LaTeX Equations</w:t>
-      </w:r>
-      <w:r>
-        <w:rPr>
-          <w:rFonts w:ascii="Arial" w:hAnsi="Arial"/>
-          <w:i/>
-          <w:sz w:val="19"/>
-        </w:rPr>
-        <w:t>.</w:t>
+        <w:t xml:space="preserve"> untuk kompatibilitas penuh dengan pengaya Google Docs Auto-LaTeX Equations.</w:t>
       </w:r>
     </w:p>
     <w:p>
@@ -286,22 +258,7 @@
           <w:rFonts w:ascii="Arial" w:hAnsi="Arial"/>
           <w:sz w:val="20"/>
         </w:rPr>
-        <w:t xml:space="preserve"> (6-DOF) </w:t>
-      </w:r>
-      <w:r>
-        <w:rPr>
-          <w:rFonts w:ascii="Arial" w:hAnsi="Arial"/>
-          <w:i/>
-          <w:sz w:val="20"/>
-        </w:rPr>
-        <w:t>over-actuated</w:t>
-      </w:r>
-      <w:r>
-        <w:rPr>
-          <w:rFonts w:ascii="Arial" w:hAnsi="Arial"/>
-          <w:sz w:val="20"/>
-        </w:rPr>
-        <w:t xml:space="preserve"> 8-pendorong ini dilaksanakan di:</w:t>
+        <w:t xml:space="preserve"> (6-DOF) over-actuated 8-pendorong ini dilaksanakan di:</w:t>
       </w:r>
     </w:p>
     <w:p>
@@ -318,7 +275,7 @@
       <w:r>
         <w:rPr>
           <w:rFonts w:ascii="Arial" w:hAnsi="Arial"/>
-          <w:b/>
+          <w:i/>
           <w:sz w:val="20"/>
         </w:rPr>
         <w:t>Laboratorium Mekatronika dan Robotika</w:t>
@@ -328,7 +285,7 @@
           <w:rFonts w:ascii="Arial" w:hAnsi="Arial"/>
           <w:sz w:val="20"/>
         </w:rPr>
-        <w:t>, Departemen Teknik Mesin, Fakultas Teknik, Universitas Hasanuddin, Kampus Terpadu Fakultas Teknik Unhas, Gowa, Sulawesi Selatan. Fasilitas laboratorium digunakan untuk pengembangan modul komputasi tepi (</w:t>
+        <w:t>, Departemen Teknik Mesin, Fakultas Teknik, Universitas Hasanuddin, Kampus Terpadu Fakultas Teknik Unhas, Gowa, Sulawesi Selatan. Fasilitas laboratorium digunakan untuk pengembangan modul komputasi tepi (companion computer</w:t>
       </w:r>
       <w:r>
         <w:rPr>
@@ -336,14 +293,14 @@
           <w:i/>
           <w:sz w:val="20"/>
         </w:rPr>
-        <w:t>companion computer</w:t>
-      </w:r>
-      <w:r>
-        <w:rPr>
-          <w:rFonts w:ascii="Arial" w:hAnsi="Arial"/>
-          <w:sz w:val="20"/>
-        </w:rPr>
-        <w:t xml:space="preserve"> Raspberry Pi 4B), integrasi sensor inersia dan sensor tekanan subsea pada </w:t>
+        <w:t>Raspberry Pi 4B), integrasi sensor inersia dan sensor tekanan subsea pada</w:t>
+      </w:r>
+      <w:r>
+        <w:rPr>
+          <w:rFonts w:ascii="Arial" w:hAnsi="Arial"/>
+          <w:sz w:val="20"/>
+        </w:rPr>
+        <w:t>flight controller</w:t>
       </w:r>
       <w:r>
         <w:rPr>
@@ -351,14 +308,14 @@
           <w:i/>
           <w:sz w:val="20"/>
         </w:rPr>
-        <w:t>flight controller</w:t>
-      </w:r>
-      <w:r>
-        <w:rPr>
-          <w:rFonts w:ascii="Arial" w:hAnsi="Arial"/>
-          <w:sz w:val="20"/>
-        </w:rPr>
-        <w:t xml:space="preserve"> Pixhawk 2.4.8, perakitan kabel komunikasi </w:t>
+        <w:t>Pixhawk 2.4.8, perakitan kabel komunikasi</w:t>
+      </w:r>
+      <w:r>
+        <w:rPr>
+          <w:rFonts w:ascii="Arial" w:hAnsi="Arial"/>
+          <w:sz w:val="20"/>
+        </w:rPr>
+        <w:t>tether</w:t>
       </w:r>
       <w:r>
         <w:rPr>
@@ -366,29 +323,14 @@
           <w:i/>
           <w:sz w:val="20"/>
         </w:rPr>
-        <w:t>tether</w:t>
-      </w:r>
-      <w:r>
-        <w:rPr>
-          <w:rFonts w:ascii="Arial" w:hAnsi="Arial"/>
-          <w:sz w:val="20"/>
-        </w:rPr>
-        <w:t xml:space="preserve"> Ethernet Fathom-X, serta pengujian </w:t>
-      </w:r>
-      <w:r>
-        <w:rPr>
-          <w:rFonts w:ascii="Arial" w:hAnsi="Arial"/>
-          <w:i/>
-          <w:sz w:val="20"/>
-        </w:rPr>
-        <w:t>Hardware-In-The-Loop</w:t>
-      </w:r>
-      <w:r>
-        <w:rPr>
-          <w:rFonts w:ascii="Arial" w:hAnsi="Arial"/>
-          <w:sz w:val="20"/>
-        </w:rPr>
-        <w:t xml:space="preserve"> (HITL).</w:t>
+        <w:t>Ethernet Fathom-X, serta pengujian</w:t>
+      </w:r>
+      <w:r>
+        <w:rPr>
+          <w:rFonts w:ascii="Arial" w:hAnsi="Arial"/>
+          <w:sz w:val="20"/>
+        </w:rPr>
+        <w:t>Hardware-In-The-Loop (HITL).</w:t>
       </w:r>
     </w:p>
     <w:p>
@@ -405,7 +347,7 @@
       <w:r>
         <w:rPr>
           <w:rFonts w:ascii="Arial" w:hAnsi="Arial"/>
-          <w:b/>
+          <w:i/>
           <w:sz w:val="20"/>
         </w:rPr>
         <w:t>Fasilitas Komputasi GPU dan Simulasi Topside</w:t>
@@ -415,7 +357,7 @@
           <w:rFonts w:ascii="Arial" w:hAnsi="Arial"/>
           <w:sz w:val="20"/>
         </w:rPr>
-        <w:t xml:space="preserve">, digunakan untuk eksekusi simulasi lingkungan hidrodinamika virtual </w:t>
+        <w:t>, digunakan untuk eksekusi simulasi lingkungan hidrodinamika virtual Software-In-The-Loop</w:t>
       </w:r>
       <w:r>
         <w:rPr>
@@ -423,14 +365,14 @@
           <w:i/>
           <w:sz w:val="20"/>
         </w:rPr>
-        <w:t>Software-In-The-Loop</w:t>
-      </w:r>
-      <w:r>
-        <w:rPr>
-          <w:rFonts w:ascii="Arial" w:hAnsi="Arial"/>
-          <w:sz w:val="20"/>
-        </w:rPr>
-        <w:t xml:space="preserve"> (SITL) berbasis robotik Gazebo Harmonic dan ROS 2 Jazzy Jalisco, akselerasi jaringan syaraf tiruan </w:t>
+        <w:t>(SITL) berbasis robotik Gazebo Harmonic dan ROS 2 Jazzy Jalisco, akselerasi jaringan syaraf tiruan</w:t>
+      </w:r>
+      <w:r>
+        <w:rPr>
+          <w:rFonts w:ascii="Arial" w:hAnsi="Arial"/>
+          <w:sz w:val="20"/>
+        </w:rPr>
+        <w:t>deep learning</w:t>
       </w:r>
       <w:r>
         <w:rPr>
@@ -438,29 +380,14 @@
           <w:i/>
           <w:sz w:val="20"/>
         </w:rPr>
-        <w:t>deep learning</w:t>
-      </w:r>
-      <w:r>
-        <w:rPr>
-          <w:rFonts w:ascii="Arial" w:hAnsi="Arial"/>
-          <w:sz w:val="20"/>
-        </w:rPr>
-        <w:t xml:space="preserve"> YOLO26 / YOLO-World, serta komputasi penapis </w:t>
-      </w:r>
-      <w:r>
-        <w:rPr>
-          <w:rFonts w:ascii="Arial" w:hAnsi="Arial"/>
-          <w:i/>
-          <w:sz w:val="20"/>
-        </w:rPr>
-        <w:t>8D Visual Target Kalman Filter</w:t>
-      </w:r>
-      <w:r>
-        <w:rPr>
-          <w:rFonts w:ascii="Arial" w:hAnsi="Arial"/>
-          <w:sz w:val="20"/>
-        </w:rPr>
-        <w:t>.</w:t>
+        <w:t>YOLO26 / YOLO-World, serta komputasi penapis</w:t>
+      </w:r>
+      <w:r>
+        <w:rPr>
+          <w:rFonts w:ascii="Arial" w:hAnsi="Arial"/>
+          <w:sz w:val="20"/>
+        </w:rPr>
+        <w:t>8D Visual Target Kalman Filter.</w:t>
       </w:r>
     </w:p>
     <w:p>
@@ -504,7 +431,7 @@
       <w:r>
         <w:rPr>
           <w:rFonts w:ascii="Arial" w:hAnsi="Arial"/>
-          <w:b/>
+          <w:i/>
           <w:sz w:val="20"/>
         </w:rPr>
         <w:t>Bulan 1</w:t>
@@ -514,22 +441,7 @@
           <w:rFonts w:ascii="Arial" w:hAnsi="Arial"/>
           <w:sz w:val="20"/>
         </w:rPr>
-        <w:t>: Studi literatur komprehensif, perumusan persamaan gerak 6-DOF (</w:t>
-      </w:r>
-      <w:r>
-        <w:rPr>
-          <w:rFonts w:ascii="Arial" w:hAnsi="Arial"/>
-          <w:i/>
-          <w:sz w:val="20"/>
-        </w:rPr>
-        <w:t>kinematics and dynamics</w:t>
-      </w:r>
-      <w:r>
-        <w:rPr>
-          <w:rFonts w:ascii="Arial" w:hAnsi="Arial"/>
-          <w:sz w:val="20"/>
-        </w:rPr>
-        <w:t>), dan identifikasi parameter fisik serta hidrodinamika BlueROV2 Heavy retrofit.</w:t>
+        <w:t>: Studi literatur komprehensif, perumusan persamaan gerak 6-DOF (kinematics and dynamics), dan identifikasi parameter fisik serta hidrodinamika BlueROV2 Heavy retrofit.</w:t>
       </w:r>
     </w:p>
     <w:p>
@@ -546,7 +458,7 @@
       <w:r>
         <w:rPr>
           <w:rFonts w:ascii="Arial" w:hAnsi="Arial"/>
-          <w:b/>
+          <w:i/>
           <w:sz w:val="20"/>
         </w:rPr>
         <w:t>Bulan 2</w:t>
@@ -554,24 +466,17 @@
       <w:r>
         <w:rPr>
           <w:rFonts w:ascii="Arial" w:hAnsi="Arial"/>
-          <w:sz w:val="20"/>
-        </w:rPr>
-        <w:t xml:space="preserve">: Perancangan algoritma stokastik </w:t>
-      </w:r>
-      <w:r>
-        <w:rPr>
-          <w:rFonts w:ascii="Arial" w:hAnsi="Arial"/>
           <w:i/>
           <w:sz w:val="20"/>
         </w:rPr>
-        <w:t>Dual Kalman Filter</w:t>
-      </w:r>
-      <w:r>
-        <w:rPr>
-          <w:rFonts w:ascii="Arial" w:hAnsi="Arial"/>
-          <w:sz w:val="20"/>
-        </w:rPr>
-        <w:t xml:space="preserve"> (penapis penjejak visual 8D berbasis CWNA dan penapis penaksir dinamika EKF 6-DOF).</w:t>
+        <w:t>: Perancangan algoritma stokastik</w:t>
+      </w:r>
+      <w:r>
+        <w:rPr>
+          <w:rFonts w:ascii="Arial" w:hAnsi="Arial"/>
+          <w:sz w:val="20"/>
+        </w:rPr>
+        <w:t>Dual Kalman Filter (penapis penjejak visual 8D berbasis CWNA dan penapis penaksir dinamika EKF 6-DOF).</w:t>
       </w:r>
     </w:p>
     <w:p>
@@ -588,7 +493,6 @@
       <w:r>
         <w:rPr>
           <w:rFonts w:ascii="Arial" w:hAnsi="Arial"/>
-          <w:b/>
           <w:sz w:val="20"/>
         </w:rPr>
         <w:t>Bulan 3</w:t>
@@ -596,39 +500,32 @@
       <w:r>
         <w:rPr>
           <w:rFonts w:ascii="Arial" w:hAnsi="Arial"/>
-          <w:sz w:val="20"/>
-        </w:rPr>
-        <w:t xml:space="preserve">: Pembangunan lingkungan simulasi </w:t>
-      </w:r>
-      <w:r>
-        <w:rPr>
-          <w:rFonts w:ascii="Arial" w:hAnsi="Arial"/>
           <w:i/>
           <w:sz w:val="20"/>
         </w:rPr>
+        <w:t>: Pembangunan lingkungan simulasi</w:t>
+      </w:r>
+      <w:r>
+        <w:rPr>
+          <w:rFonts w:ascii="Arial" w:hAnsi="Arial"/>
+          <w:sz w:val="20"/>
+        </w:rPr>
         <w:t>Software-In-The-Loop</w:t>
       </w:r>
       <w:r>
         <w:rPr>
           <w:rFonts w:ascii="Arial" w:hAnsi="Arial"/>
-          <w:sz w:val="20"/>
-        </w:rPr>
-        <w:t xml:space="preserve"> (SITL) mengintegrasikan Gazebo Harmonic, ArduSub </w:t>
-      </w:r>
-      <w:r>
-        <w:rPr>
-          <w:rFonts w:ascii="Arial" w:hAnsi="Arial"/>
           <w:i/>
           <w:sz w:val="20"/>
         </w:rPr>
-        <w:t>vectored_6dof</w:t>
-      </w:r>
-      <w:r>
-        <w:rPr>
-          <w:rFonts w:ascii="Arial" w:hAnsi="Arial"/>
-          <w:sz w:val="20"/>
-        </w:rPr>
-        <w:t>, dan jembatan data ROS 2.</w:t>
+        <w:t>(SITL) mengintegrasikan Gazebo Harmonic, ArduSub</w:t>
+      </w:r>
+      <w:r>
+        <w:rPr>
+          <w:rFonts w:ascii="Arial" w:hAnsi="Arial"/>
+          <w:sz w:val="20"/>
+        </w:rPr>
+        <w:t>vectored_6dof, dan jembatan data ROS 2.</w:t>
       </w:r>
     </w:p>
     <w:p>
@@ -645,7 +542,7 @@
       <w:r>
         <w:rPr>
           <w:rFonts w:ascii="Arial" w:hAnsi="Arial"/>
-          <w:b/>
+          <w:i/>
           <w:sz w:val="20"/>
         </w:rPr>
         <w:t>Bulan 4</w:t>
@@ -655,7 +552,7 @@
           <w:rFonts w:ascii="Arial" w:hAnsi="Arial"/>
           <w:sz w:val="20"/>
         </w:rPr>
-        <w:t xml:space="preserve">: Pengembangan integrasi </w:t>
+        <w:t>: Pengembangan integrasi Hardware-In-The-Loop</w:t>
       </w:r>
       <w:r>
         <w:rPr>
@@ -663,14 +560,14 @@
           <w:i/>
           <w:sz w:val="20"/>
         </w:rPr>
-        <w:t>Hardware-In-The-Loop</w:t>
-      </w:r>
-      <w:r>
-        <w:rPr>
-          <w:rFonts w:ascii="Arial" w:hAnsi="Arial"/>
-          <w:sz w:val="20"/>
-        </w:rPr>
-        <w:t xml:space="preserve"> (HITL) antara stasiun permukaan (</w:t>
+        <w:t>(HITL) antara stasiun permukaan (</w:t>
+      </w:r>
+      <w:r>
+        <w:rPr>
+          <w:rFonts w:ascii="Arial" w:hAnsi="Arial"/>
+          <w:sz w:val="20"/>
+        </w:rPr>
+        <w:t>topside workstation</w:t>
       </w:r>
       <w:r>
         <w:rPr>
@@ -678,14 +575,14 @@
           <w:i/>
           <w:sz w:val="20"/>
         </w:rPr>
-        <w:t>topside workstation</w:t>
-      </w:r>
-      <w:r>
-        <w:rPr>
-          <w:rFonts w:ascii="Arial" w:hAnsi="Arial"/>
-          <w:sz w:val="20"/>
-        </w:rPr>
-        <w:t xml:space="preserve"> RTX GPU), </w:t>
+        <w:t>RTX GPU),</w:t>
+      </w:r>
+      <w:r>
+        <w:rPr>
+          <w:rFonts w:ascii="Arial" w:hAnsi="Arial"/>
+          <w:sz w:val="20"/>
+        </w:rPr>
+        <w:t>companion computer</w:t>
       </w:r>
       <w:r>
         <w:rPr>
@@ -693,29 +590,14 @@
           <w:i/>
           <w:sz w:val="20"/>
         </w:rPr>
-        <w:t>companion computer</w:t>
-      </w:r>
-      <w:r>
-        <w:rPr>
-          <w:rFonts w:ascii="Arial" w:hAnsi="Arial"/>
-          <w:sz w:val="20"/>
-        </w:rPr>
-        <w:t xml:space="preserve"> Raspberry Pi 4B (BlueOS), dan </w:t>
-      </w:r>
-      <w:r>
-        <w:rPr>
-          <w:rFonts w:ascii="Arial" w:hAnsi="Arial"/>
-          <w:i/>
-          <w:sz w:val="20"/>
-        </w:rPr>
-        <w:t>flight controller</w:t>
-      </w:r>
-      <w:r>
-        <w:rPr>
-          <w:rFonts w:ascii="Arial" w:hAnsi="Arial"/>
-          <w:sz w:val="20"/>
-        </w:rPr>
-        <w:t xml:space="preserve"> Pixhawk 2.4.8 melalui protokol MAVLink dan REST API.</w:t>
+        <w:t>Raspberry Pi 4B (BlueOS), dan</w:t>
+      </w:r>
+      <w:r>
+        <w:rPr>
+          <w:rFonts w:ascii="Arial" w:hAnsi="Arial"/>
+          <w:sz w:val="20"/>
+        </w:rPr>
+        <w:t>flight controller Pixhawk 2.4.8 melalui protokol MAVLink dan REST API.</w:t>
       </w:r>
     </w:p>
     <w:p>
@@ -732,7 +614,7 @@
       <w:r>
         <w:rPr>
           <w:rFonts w:ascii="Arial" w:hAnsi="Arial"/>
-          <w:b/>
+          <w:i/>
           <w:sz w:val="20"/>
         </w:rPr>
         <w:t>Bulan 5</w:t>
@@ -759,7 +641,7 @@
       <w:r>
         <w:rPr>
           <w:rFonts w:ascii="Arial" w:hAnsi="Arial"/>
-          <w:b/>
+          <w:i/>
           <w:sz w:val="20"/>
         </w:rPr>
         <w:t>Bulan 6</w:t>
@@ -769,22 +651,7 @@
           <w:rFonts w:ascii="Arial" w:hAnsi="Arial"/>
           <w:sz w:val="20"/>
         </w:rPr>
-        <w:t>: Analisis data kuantitatif, komputasi metrik evaluasi galat (</w:t>
-      </w:r>
-      <w:r>
-        <w:rPr>
-          <w:rFonts w:ascii="Arial" w:hAnsi="Arial"/>
-          <w:i/>
-          <w:sz w:val="20"/>
-        </w:rPr>
-        <w:t>Root Mean Square Error</w:t>
-      </w:r>
-      <w:r>
-        <w:rPr>
-          <w:rFonts w:ascii="Arial" w:hAnsi="Arial"/>
-          <w:sz w:val="20"/>
-        </w:rPr>
-        <w:t xml:space="preserve"> / RMSE), penyusunan laporan naskah skripsi, dan penyiapan publikasi ilmiah.</w:t>
+        <w:t>: Analisis data kuantitatif, komputasi metrik evaluasi galat (Root Mean Square Error / RMSE), penyusunan laporan naskah skripsi, dan penyiapan publikasi ilmiah.</w:t>
       </w:r>
     </w:p>
     <w:p>
@@ -828,7 +695,7 @@
       <w:r>
         <w:rPr>
           <w:rFonts w:ascii="Arial" w:hAnsi="Arial"/>
-          <w:b/>
+          <w:i/>
           <w:sz w:val="20"/>
         </w:rPr>
         <w:t>Model Wahana</w:t>
@@ -838,7 +705,7 @@
           <w:rFonts w:ascii="Arial" w:hAnsi="Arial"/>
           <w:sz w:val="20"/>
         </w:rPr>
-        <w:t xml:space="preserve">: Wahana yang diteliti menggunakan geometri kerangka </w:t>
+        <w:t>: Wahana yang diteliti menggunakan geometri kerangka retrofit</w:t>
       </w:r>
       <w:r>
         <w:rPr>
@@ -846,29 +713,14 @@
           <w:i/>
           <w:sz w:val="20"/>
         </w:rPr>
-        <w:t>retrofit</w:t>
-      </w:r>
-      <w:r>
-        <w:rPr>
-          <w:rFonts w:ascii="Arial" w:hAnsi="Arial"/>
-          <w:sz w:val="20"/>
-        </w:rPr>
-        <w:t xml:space="preserve"> BlueROV2 Heavy [3], [21]. Sistem propulsi terdiri atas 8 unit pendorong elektro-mekanis tanpa sikat (</w:t>
-      </w:r>
-      <w:r>
-        <w:rPr>
-          <w:rFonts w:ascii="Arial" w:hAnsi="Arial"/>
-          <w:i/>
-          <w:sz w:val="20"/>
-        </w:rPr>
-        <w:t>brushless DC thrusters</w:t>
-      </w:r>
-      <w:r>
-        <w:rPr>
-          <w:rFonts w:ascii="Arial" w:hAnsi="Arial"/>
-          <w:sz w:val="20"/>
-        </w:rPr>
-        <w:t xml:space="preserve">) Blue Robotics T200, yang dikonfigurasikan menjadi 4 pendorong horizontal bersudut vektor </w:t>
+        <w:t>BlueROV2 Heavy [3], [21]. Sistem propulsi terdiri atas 8 unit pendorong elektro-mekanis tanpa sikat (</w:t>
+      </w:r>
+      <w:r>
+        <w:rPr>
+          <w:rFonts w:ascii="Arial" w:hAnsi="Arial"/>
+          <w:sz w:val="20"/>
+        </w:rPr>
+        <w:t xml:space="preserve">brushless DC thrusters) Blue Robotics T200, yang dikonfigurasikan menjadi 4 pendorong horizontal bersudut vektor </w:t>
       </w:r>
       <w:r>
         <w:rPr>
@@ -899,7 +751,7 @@
       <w:r>
         <w:rPr>
           <w:rFonts w:ascii="Arial" w:hAnsi="Arial"/>
-          <w:b/>
+          <w:i/>
           <w:sz w:val="20"/>
         </w:rPr>
         <w:t>Karakteristik Fluida Kerja</w:t>
@@ -909,22 +761,7 @@
           <w:rFonts w:ascii="Arial" w:hAnsi="Arial"/>
           <w:sz w:val="20"/>
         </w:rPr>
-        <w:t>: Media fluida diasumsikan sebagai fluida inkompresibel tak terbatas (</w:t>
-      </w:r>
-      <w:r>
-        <w:rPr>
-          <w:rFonts w:ascii="Arial" w:hAnsi="Arial"/>
-          <w:i/>
-          <w:sz w:val="20"/>
-        </w:rPr>
-        <w:t>unbounded incompressible fluid</w:t>
-      </w:r>
-      <w:r>
-        <w:rPr>
-          <w:rFonts w:ascii="Arial" w:hAnsi="Arial"/>
-          <w:sz w:val="20"/>
-        </w:rPr>
-        <w:t>) homogen dengan densitas air tawar nominal $$</w:t>
+        <w:t>: Media fluida diasumsikan sebagai fluida inkompresibel tak terbatas (unbounded incompressible fluid) homogen dengan densitas air tawar nominal $$</w:t>
       </w:r>
     </w:p>
     <w:p>
@@ -980,7 +817,7 @@
       <w:r>
         <w:rPr>
           <w:rFonts w:ascii="Arial" w:hAnsi="Arial"/>
-          <w:b/>
+          <w:i/>
           <w:sz w:val="20"/>
         </w:rPr>
         <w:t>Rezim Kecepatan Operasi</w:t>
@@ -1006,22 +843,7 @@
         </w:rPr>
         <w:t>u}| \le 1.5</w:t>
         <w:tab/>
-        <w:t>ext{ m/s}$$), di mana gelombang permukaan dan efek batas dinding dapat diabaikan (</w:t>
-      </w:r>
-      <w:r>
-        <w:rPr>
-          <w:rFonts w:ascii="Arial" w:hAnsi="Arial"/>
-          <w:i/>
-          <w:sz w:val="20"/>
-        </w:rPr>
-        <w:t>deep-water assumption</w:t>
-      </w:r>
-      <w:r>
-        <w:rPr>
-          <w:rFonts w:ascii="Arial" w:hAnsi="Arial"/>
-          <w:sz w:val="20"/>
-        </w:rPr>
-        <w:t>).</w:t>
+        <w:t>ext{ m/s}$$), di mana gelombang permukaan dan efek batas dinding dapat diabaikan (deep-water assumption).</w:t>
       </w:r>
     </w:p>
     <w:p>
@@ -1041,6 +863,14 @@
           <w:i/>
           <w:sz w:val="20"/>
         </w:rPr>
+        <w:t>Gangguan Arus Laut (</w:t>
+      </w:r>
+      <w:r>
+        <w:rPr>
+          <w:rFonts w:ascii="Arial" w:hAnsi="Arial"/>
+          <w:sz w:val="20"/>
+        </w:rPr>
+        <w:t>Ocean Currents)</w:t>
       </w:r>
       <w:r>
         <w:rPr>
@@ -1048,29 +878,6 @@
           <w:i/>
           <w:sz w:val="20"/>
         </w:rPr>
-        <w:t>Gangguan Arus Laut (</w:t>
-      </w:r>
-      <w:r>
-        <w:rPr>
-          <w:rFonts w:ascii="Arial" w:hAnsi="Arial"/>
-          <w:sz w:val="20"/>
-        </w:rPr>
-        <w:t>Ocean Currents</w:t>
-      </w:r>
-      <w:r>
-        <w:rPr>
-          <w:rFonts w:ascii="Arial" w:hAnsi="Arial"/>
-          <w:i/>
-          <w:sz w:val="20"/>
-        </w:rPr>
-        <w:t>)</w:t>
-      </w:r>
-      <w:r>
-        <w:rPr>
-          <w:rFonts w:ascii="Arial" w:hAnsi="Arial"/>
-          <w:i/>
-          <w:sz w:val="20"/>
-        </w:rPr>
         <w:t>: Arus laut dimodelkan sebagai aliran irasional dan konstan atau bervariasi lambat (</w:t>
       </w:r>
       <w:r>
@@ -1078,7 +885,7 @@
           <w:rFonts w:ascii="Arial" w:hAnsi="Arial"/>
           <w:sz w:val="20"/>
         </w:rPr>
-        <w:t>slowly-varying horizontal current*) relatif terhadap waktu dalam kerangka bumi:</w:t>
+        <w:t>slowly-varying horizontal current) relatif terhadap waktu dalam kerangka bumi:</w:t>
       </w:r>
     </w:p>
     <w:p>
@@ -1108,7 +915,7 @@
       <w:r>
         <w:rPr>
           <w:rFonts w:ascii="Arial" w:hAnsi="Arial"/>
-          <w:b/>
+          <w:i/>
           <w:sz w:val="20"/>
         </w:rPr>
         <w:t>Kondisi Optik Bawah Air</w:t>
@@ -1118,7 +925,7 @@
           <w:rFonts w:ascii="Arial" w:hAnsi="Arial"/>
           <w:sz w:val="20"/>
         </w:rPr>
-        <w:t>: Citra visual monokuler dari kamera diasumsikan mengalami degradasi kontras, penyerapan spektral, dan hamburan cahaya (</w:t>
+        <w:t>: Citra visual monokuler dari kamera diasumsikan mengalami degradasi kontras, penyerapan spektral, dan hamburan cahaya (scattering</w:t>
       </w:r>
       <w:r>
         <w:rPr>
@@ -1126,29 +933,14 @@
           <w:i/>
           <w:sz w:val="20"/>
         </w:rPr>
-        <w:t>scattering</w:t>
-      </w:r>
-      <w:r>
-        <w:rPr>
-          <w:rFonts w:ascii="Arial" w:hAnsi="Arial"/>
-          <w:sz w:val="20"/>
-        </w:rPr>
-        <w:t xml:space="preserve">) khas lingkungan perairan, yang dimitigasi secara komputasional melalui algoritma prapemrosesan </w:t>
-      </w:r>
-      <w:r>
-        <w:rPr>
-          <w:rFonts w:ascii="Arial" w:hAnsi="Arial"/>
-          <w:i/>
-          <w:sz w:val="20"/>
-        </w:rPr>
-        <w:t>Contrast Limited Adaptive Histogram Equalization</w:t>
-      </w:r>
-      <w:r>
-        <w:rPr>
-          <w:rFonts w:ascii="Arial" w:hAnsi="Arial"/>
-          <w:sz w:val="20"/>
-        </w:rPr>
-        <w:t xml:space="preserve"> (CLAHE) [2], [14].</w:t>
+        <w:t>) khas lingkungan perairan, yang dimitigasi secara komputasional melalui algoritma prapemrosesan</w:t>
+      </w:r>
+      <w:r>
+        <w:rPr>
+          <w:rFonts w:ascii="Arial" w:hAnsi="Arial"/>
+          <w:sz w:val="20"/>
+        </w:rPr>
+        <w:t>Contrast Limited Adaptive Histogram Equalization (CLAHE) [2], [14].</w:t>
       </w:r>
     </w:p>
     <w:p>
@@ -1175,22 +967,7 @@
           <w:rFonts w:ascii="Arial" w:hAnsi="Arial"/>
           <w:sz w:val="20"/>
         </w:rPr>
-        <w:t>Metodologi penelitian ini dirancang dengan pendekatan rekayasa sistem mekatronika tertutup (</w:t>
-      </w:r>
-      <w:r>
-        <w:rPr>
-          <w:rFonts w:ascii="Arial" w:hAnsi="Arial"/>
-          <w:i/>
-          <w:sz w:val="20"/>
-        </w:rPr>
-        <w:t>closed-loop mechatronic systems engineering</w:t>
-      </w:r>
-      <w:r>
-        <w:rPr>
-          <w:rFonts w:ascii="Arial" w:hAnsi="Arial"/>
-          <w:sz w:val="20"/>
-        </w:rPr>
-        <w:t>). Alur penelitian disusun ke dalam enam fase utama yang saling terhubung secara terstruktur, sebagaimana divisualisasikan pada diagram alir di bawah ini:</w:t>
+        <w:t>Metodologi penelitian ini dirancang dengan pendekatan rekayasa sistem mekatronika tertutup (closed-loop mechatronic systems engineering). Alur penelitian disusun ke dalam enam fase utama yang saling terhubung secara terstruktur, sebagaimana divisualisasikan pada diagram alir di bawah ini:</w:t>
       </w:r>
     </w:p>
     <w:p>
@@ -1346,7 +1123,7 @@
       <w:r>
         <w:rPr>
           <w:rFonts w:ascii="Arial" w:hAnsi="Arial"/>
-          <w:b/>
+          <w:i/>
           <w:sz w:val="20"/>
         </w:rPr>
         <w:t>Fase I (Studi Pendahuluan)</w:t>
@@ -1354,14 +1131,15 @@
       <w:r>
         <w:rPr>
           <w:rFonts w:ascii="Arial" w:hAnsi="Arial"/>
-          <w:sz w:val="20"/>
-        </w:rPr>
-        <w:t xml:space="preserve">: Mengidentifikasi keterbatasan mendasar pada wahana konvensional </w:t>
-      </w:r>
-      <w:r>
-        <w:rPr>
-          <w:rFonts w:ascii="Arial" w:hAnsi="Arial"/>
-          <w:b/>
+          <w:i/>
+          <w:sz w:val="20"/>
+        </w:rPr>
+        <w:t>: Mengidentifikasi keterbatasan mendasar pada wahana konvensional</w:t>
+      </w:r>
+      <w:r>
+        <w:rPr>
+          <w:rFonts w:ascii="Arial" w:hAnsi="Arial"/>
+          <w:i/>
           <w:sz w:val="20"/>
         </w:rPr>
         <w:t>underactuated</w:t>
@@ -1369,14 +1147,15 @@
       <w:r>
         <w:rPr>
           <w:rFonts w:ascii="Arial" w:hAnsi="Arial"/>
-          <w:sz w:val="20"/>
-        </w:rPr>
-        <w:t xml:space="preserve"> 6-pendorong, khususnya fenomena kopling silang momen Munk hidrodinamika yang mendestabilisasi gerak </w:t>
-      </w:r>
-      <w:r>
-        <w:rPr>
-          <w:rFonts w:ascii="Arial" w:hAnsi="Arial"/>
-          <w:b/>
+          <w:i/>
+          <w:sz w:val="20"/>
+        </w:rPr>
+        <w:t>6-pendorong, khususnya fenomena kopling silang momen Munk hidrodinamika yang mendestabilisasi gerak</w:t>
+      </w:r>
+      <w:r>
+        <w:rPr>
+          <w:rFonts w:ascii="Arial" w:hAnsi="Arial"/>
+          <w:i/>
           <w:sz w:val="20"/>
         </w:rPr>
         <w:t>yaw</w:t>
@@ -1384,14 +1163,15 @@
       <w:r>
         <w:rPr>
           <w:rFonts w:ascii="Arial" w:hAnsi="Arial"/>
-          <w:sz w:val="20"/>
-        </w:rPr>
-        <w:t xml:space="preserve"> dan ketidakmampuan manuver </w:t>
-      </w:r>
-      <w:r>
-        <w:rPr>
-          <w:rFonts w:ascii="Arial" w:hAnsi="Arial"/>
-          <w:b/>
+          <w:i/>
+          <w:sz w:val="20"/>
+        </w:rPr>
+        <w:t>dan ketidakmampuan manuver</w:t>
+      </w:r>
+      <w:r>
+        <w:rPr>
+          <w:rFonts w:ascii="Arial" w:hAnsi="Arial"/>
+          <w:i/>
           <w:sz w:val="20"/>
         </w:rPr>
         <w:t>pitch-hold</w:t>
@@ -1399,28 +1179,15 @@
       <w:r>
         <w:rPr>
           <w:rFonts w:ascii="Arial" w:hAnsi="Arial"/>
-          <w:sz w:val="20"/>
-        </w:rPr>
-        <w:t xml:space="preserve"> aktif [7], [6], [32], [40], [34]. Studi literatur dipusatkan pada publikasi mutakhir (</w:t>
-      </w:r>
-      <w:r>
-        <w:rPr>
-          <w:rFonts w:ascii="Arial" w:hAnsi="Arial"/>
-          <w:sz w:val="20"/>
-        </w:rPr>
-        <w:t>$$\ge 2021$$</w:t>
-      </w:r>
-      <w:r>
-        <w:rPr>
-          <w:rFonts w:ascii="Arial" w:hAnsi="Arial"/>
-          <w:sz w:val="20"/>
-        </w:rPr>
-        <w:t xml:space="preserve">) di bidang estimasi parameter hidrodinamika [1], penapis Bayesian [25], dan kendali wahana </w:t>
-      </w:r>
-      <w:r>
-        <w:rPr>
-          <w:rFonts w:ascii="Arial" w:hAnsi="Arial"/>
-          <w:b/>
+          <w:i/>
+          <w:sz w:val="20"/>
+        </w:rPr>
+        <w:t>aktif [7], [6], [32], [40], [34]. Studi literatur dipusatkan pada publikasi mutakhir ($$\ge 2021$$) di bidang estimasi parameter hidrodinamika [1], penapis Bayesian [25], dan kendali wahana</w:t>
+      </w:r>
+      <w:r>
+        <w:rPr>
+          <w:rFonts w:ascii="Arial" w:hAnsi="Arial"/>
+          <w:i/>
           <w:sz w:val="20"/>
         </w:rPr>
         <w:t>over-actuated</w:t>
@@ -1589,7 +1356,7 @@
       <w:r>
         <w:rPr>
           <w:rFonts w:ascii="Arial" w:hAnsi="Arial"/>
-          <w:b/>
+          <w:i/>
           <w:sz w:val="20"/>
         </w:rPr>
         <w:t>Fase III (Perancangan Arsitektur Dual Kalman Filter)</w:t>
@@ -1616,17 +1383,24 @@
       <w:r>
         <w:rPr>
           <w:rFonts w:ascii="Arial" w:hAnsi="Arial"/>
+          <w:sz w:val="20"/>
+        </w:rPr>
+        <w:t>Topside/Onboard Visual Target Kalman Filter</w:t>
+      </w:r>
+      <w:r>
+        <w:rPr>
+          <w:rFonts w:ascii="Arial" w:hAnsi="Arial"/>
           <w:i/>
           <w:sz w:val="20"/>
         </w:rPr>
-        <w:t xml:space="preserve">Topside/Onboard Visual Target </w:t>
-      </w:r>
-      <w:r>
-        <w:rPr>
-          <w:rFonts w:ascii="Arial" w:hAnsi="Arial"/>
-          <w:sz w:val="20"/>
-        </w:rPr>
-        <w:t>Kalman Filter</w:t>
+        <w:t>(`AUVVisualKalmanFilter`): Penapis linier diskrit 8-dimensi berbasis model percepatan derau putih kontinu (</w:t>
+      </w:r>
+      <w:r>
+        <w:rPr>
+          <w:rFonts w:ascii="Arial" w:hAnsi="Arial"/>
+          <w:sz w:val="20"/>
+        </w:rPr>
+        <w:t>Continuous White Noise Acceleration</w:t>
       </w:r>
       <w:r>
         <w:rPr>
@@ -1634,31 +1408,16 @@
           <w:b/>
           <w:sz w:val="20"/>
         </w:rPr>
-        <w:t xml:space="preserve"> (`AUVVisualKalmanFilter`): Penapis linier diskrit 8-dimensi berbasis model percepatan derau putih kontinu (</w:t>
-      </w:r>
-      <w:r>
-        <w:rPr>
-          <w:rFonts w:ascii="Arial" w:hAnsi="Arial"/>
-          <w:sz w:val="20"/>
-        </w:rPr>
-        <w:t>Continuous White Noise Acceleration</w:t>
-      </w:r>
-      <w:r>
-        <w:rPr>
-          <w:rFonts w:ascii="Arial" w:hAnsi="Arial"/>
-          <w:b/>
-          <w:sz w:val="20"/>
-        </w:rPr>
-        <w:t xml:space="preserve"> / CWNA) dengan kovariansi adaptif berbobot skor konfidensi YOLO $$\mathbf{R}_k(</w:t>
+        <w:t>/ CWNA) dengan kovariansi adaptif berbobot skor konfidensi YOLO $$\mathbf{R}_k(</w:t>
         <w:tab/>
-        <w:t xml:space="preserve">ext{conf})$$, validasi jarak inovasi Mahalanobis $$\chi^2(4)$$, dan mekanisme propagasi </w:t>
-      </w:r>
-      <w:r>
-        <w:rPr>
-          <w:rFonts w:ascii="Arial" w:hAnsi="Arial"/>
-          <w:sz w:val="20"/>
-        </w:rPr>
-        <w:t>dead-reckoning** saat terjadi oklusi visual [16], [17], [25].</w:t>
+        <w:t>ext{conf})$$, validasi jarak inovasi Mahalanobis $$\chi^2(4)$$, dan mekanisme propagasi</w:t>
+      </w:r>
+      <w:r>
+        <w:rPr>
+          <w:rFonts w:ascii="Arial" w:hAnsi="Arial"/>
+          <w:sz w:val="20"/>
+        </w:rPr>
+        <w:t>dead-reckoning saat terjadi oklusi visual [16], [17], [25].</w:t>
       </w:r>
     </w:p>
     <w:p>
@@ -1675,32 +1434,24 @@
       <w:r>
         <w:rPr>
           <w:rFonts w:ascii="Arial" w:hAnsi="Arial"/>
+          <w:sz w:val="20"/>
+        </w:rPr>
+        <w:t>Subsea Hydrodynamic Dynamics Extended Kalman Filter</w:t>
+      </w:r>
+      <w:r>
+        <w:rPr>
+          <w:rFonts w:ascii="Arial" w:hAnsi="Arial"/>
           <w:i/>
           <w:sz w:val="20"/>
         </w:rPr>
-        <w:t xml:space="preserve">Subsea Hydrodynamic Dynamics </w:t>
-      </w:r>
-      <w:r>
-        <w:rPr>
-          <w:rFonts w:ascii="Arial" w:hAnsi="Arial"/>
-          <w:sz w:val="20"/>
-        </w:rPr>
-        <w:t>Extended Kalman Filter*</w:t>
-      </w:r>
-      <w:r>
-        <w:rPr>
-          <w:rFonts w:ascii="Arial" w:hAnsi="Arial"/>
-          <w:i/>
-          <w:sz w:val="20"/>
-        </w:rPr>
-        <w:t xml:space="preserve"> (`AUVDynamicsKalmanFilter`): Penapis non-linier 6-DOF yang menggabungkan pembacaan sensor inersia Pixhawk dan sensor tekanan kedalaman dengan model kinetika Fossen, dilengkapi pengamat gangguan arus laut (</w:t>
-      </w:r>
-      <w:r>
-        <w:rPr>
-          <w:rFonts w:ascii="Arial" w:hAnsi="Arial"/>
-          <w:sz w:val="20"/>
-        </w:rPr>
-        <w:t>ocean current disturbance observer*) [7], [18], [29].</w:t>
+        <w:t>(`AUVDynamicsKalmanFilter`): Penapis non-linier 6-DOF yang menggabungkan pembacaan sensor inersia Pixhawk dan sensor tekanan kedalaman dengan model kinetika Fossen, dilengkapi pengamat gangguan arus laut (</w:t>
+      </w:r>
+      <w:r>
+        <w:rPr>
+          <w:rFonts w:ascii="Arial" w:hAnsi="Arial"/>
+          <w:sz w:val="20"/>
+        </w:rPr>
+        <w:t>ocean current disturbance observer) [7], [18], [29].</w:t>
       </w:r>
     </w:p>
     <w:p>
@@ -1717,7 +1468,7 @@
       <w:r>
         <w:rPr>
           <w:rFonts w:ascii="Arial" w:hAnsi="Arial"/>
-          <w:b/>
+          <w:i/>
           <w:sz w:val="20"/>
         </w:rPr>
         <w:t>Fase IV (Simulasi Software-In-The-Loop / SITL)</w:t>
@@ -1741,7 +1492,7 @@
           <w:rFonts w:ascii="Arial" w:hAnsi="Arial"/>
           <w:sz w:val="20"/>
         </w:rPr>
-        <w:t xml:space="preserve">) dan </w:t>
+        <w:t>) dan Robot Operating System</w:t>
       </w:r>
       <w:r>
         <w:rPr>
@@ -1749,14 +1500,14 @@
           <w:i/>
           <w:sz w:val="20"/>
         </w:rPr>
-        <w:t>Robot Operating System</w:t>
-      </w:r>
-      <w:r>
-        <w:rPr>
-          <w:rFonts w:ascii="Arial" w:hAnsi="Arial"/>
-          <w:sz w:val="20"/>
-        </w:rPr>
-        <w:t xml:space="preserve"> (ROS 2 Jazzy Jalisco) [14], [31]. Wahana BlueROV2 Heavy dimodelkan dalam format </w:t>
+        <w:t>(ROS 2 Jazzy Jalisco) [14], [31]. Wahana BlueROV2 Heavy dimodelkan dalam format</w:t>
+      </w:r>
+      <w:r>
+        <w:rPr>
+          <w:rFonts w:ascii="Arial" w:hAnsi="Arial"/>
+          <w:sz w:val="20"/>
+        </w:rPr>
+        <w:t>Simulation Description Format</w:t>
       </w:r>
       <w:r>
         <w:rPr>
@@ -1764,29 +1515,14 @@
           <w:i/>
           <w:sz w:val="20"/>
         </w:rPr>
-        <w:t>Simulation Description Format</w:t>
-      </w:r>
-      <w:r>
-        <w:rPr>
-          <w:rFonts w:ascii="Arial" w:hAnsi="Arial"/>
-          <w:sz w:val="20"/>
-        </w:rPr>
-        <w:t xml:space="preserve"> (SDF) lengkap dengan plugin hidrodinamika dan daya apung. Sistem kendali dieksekusi melalui ArduSub SITL dengan model </w:t>
-      </w:r>
-      <w:r>
-        <w:rPr>
-          <w:rFonts w:ascii="Arial" w:hAnsi="Arial"/>
-          <w:i/>
-          <w:sz w:val="20"/>
-        </w:rPr>
-        <w:t>frame</w:t>
-      </w:r>
-      <w:r>
-        <w:rPr>
-          <w:rFonts w:ascii="Arial" w:hAnsi="Arial"/>
-          <w:sz w:val="20"/>
-        </w:rPr>
-        <w:t xml:space="preserve"> </w:t>
+        <w:t>(SDF) lengkap dengan plugin hidrodinamika dan daya apung. Sistem kendali dieksekusi melalui ArduSub SITL dengan model</w:t>
+      </w:r>
+      <w:r>
+        <w:rPr>
+          <w:rFonts w:ascii="Arial" w:hAnsi="Arial"/>
+          <w:sz w:val="20"/>
+        </w:rPr>
+        <w:t xml:space="preserve">frame </w:t>
       </w:r>
       <w:r>
         <w:rPr>
@@ -1817,7 +1553,7 @@
       <w:r>
         <w:rPr>
           <w:rFonts w:ascii="Arial" w:hAnsi="Arial"/>
-          <w:b/>
+          <w:i/>
           <w:sz w:val="20"/>
         </w:rPr>
         <w:t>Fase V (Integrasi Hardware-In-The-Loop / HITL)</w:t>
@@ -1825,14 +1561,15 @@
       <w:r>
         <w:rPr>
           <w:rFonts w:ascii="Arial" w:hAnsi="Arial"/>
-          <w:sz w:val="20"/>
-        </w:rPr>
-        <w:t xml:space="preserve">: Mengintegrasikan perangkat keras fisik wahana ke dalam lingkungan komputasi permukaan melalui kabel tether Ethernet subsea [2], [14]. </w:t>
-      </w:r>
-      <w:r>
-        <w:rPr>
-          <w:rFonts w:ascii="Arial" w:hAnsi="Arial"/>
-          <w:b/>
+          <w:i/>
+          <w:sz w:val="20"/>
+        </w:rPr>
+        <w:t>: Mengintegrasikan perangkat keras fisik wahana ke dalam lingkungan komputasi permukaan melalui kabel tether Ethernet subsea [2], [14].</w:t>
+      </w:r>
+      <w:r>
+        <w:rPr>
+          <w:rFonts w:ascii="Arial" w:hAnsi="Arial"/>
+          <w:i/>
           <w:sz w:val="20"/>
         </w:rPr>
         <w:t>Companion computer</w:t>
@@ -1842,7 +1579,7 @@
           <w:rFonts w:ascii="Arial" w:hAnsi="Arial"/>
           <w:sz w:val="20"/>
         </w:rPr>
-        <w:t xml:space="preserve"> Raspberry Pi 4B menjalankan BlueOS untuk mengalirkan citra kamera terkompresi H.264 melalui protokol UDP dan mengekspos telemetri sensor internal Pixhawk 2.4.8 (IMU MPU6000/LSM303D) serta sensor tekanan subsea Bar30 MS5837 melalui BlueOS </w:t>
+        <w:t xml:space="preserve"> Raspberry Pi 4B menjalankan BlueOS untuk mengalirkan citra kamera terkompresi H.264 melalui protokol UDP dan mengekspos telemetri sensor internal Pixhawk 2.4.8 (IMU MPU6000/LSM303D) serta sensor tekanan subsea Bar30 MS5837 melalui BlueOS mavlink2rest</w:t>
       </w:r>
       <w:r>
         <w:rPr>
@@ -1850,46 +1587,18 @@
           <w:i/>
           <w:sz w:val="20"/>
         </w:rPr>
-        <w:t>mavlink2rest</w:t>
-      </w:r>
-      <w:r>
-        <w:rPr>
-          <w:rFonts w:ascii="Arial" w:hAnsi="Arial"/>
-          <w:sz w:val="20"/>
-        </w:rPr>
-        <w:t xml:space="preserve"> REST API pada frekuensi </w:t>
-      </w:r>
-      <w:r>
-        <w:rPr>
-          <w:rFonts w:ascii="Arial" w:hAnsi="Arial"/>
-          <w:sz w:val="20"/>
-        </w:rPr>
-        <w:t>$$50</w:t>
+        <w:t>REST API pada frekuensi $$50</w:t>
         <w:tab/>
-        <w:t>ext{ Hz}$$</w:t>
-      </w:r>
-      <w:r>
-        <w:rPr>
-          <w:rFonts w:ascii="Arial" w:hAnsi="Arial"/>
-          <w:sz w:val="20"/>
-        </w:rPr>
-        <w:t xml:space="preserve"> (</w:t>
-      </w:r>
-      <w:r>
-        <w:rPr>
-          <w:rFonts w:ascii="Arial" w:hAnsi="Arial"/>
-          <w:sz w:val="20"/>
-        </w:rPr>
-        <w:t>$$\Delta t = 20</w:t>
+        <w:t>ext{ Hz}$$ ($$\Delta t = 20</w:t>
         <w:tab/>
-        <w:t>ext{ ms}$$</w:t>
-      </w:r>
-      <w:r>
-        <w:rPr>
-          <w:rFonts w:ascii="Arial" w:hAnsi="Arial"/>
-          <w:sz w:val="20"/>
-        </w:rPr>
-        <w:t>). Komputer permukaan (</w:t>
+        <w:t>ext{ ms}$$). Komputer permukaan (</w:t>
+      </w:r>
+      <w:r>
+        <w:rPr>
+          <w:rFonts w:ascii="Arial" w:hAnsi="Arial"/>
+          <w:sz w:val="20"/>
+        </w:rPr>
+        <w:t>topside</w:t>
       </w:r>
       <w:r>
         <w:rPr>
@@ -1897,29 +1606,14 @@
           <w:i/>
           <w:sz w:val="20"/>
         </w:rPr>
-        <w:t>topside</w:t>
-      </w:r>
-      <w:r>
-        <w:rPr>
-          <w:rFonts w:ascii="Arial" w:hAnsi="Arial"/>
-          <w:sz w:val="20"/>
-        </w:rPr>
-        <w:t xml:space="preserve">) memproses deteksi objek YOLO26 World dan mengeksekusi penapis visual 8D, lalu mengirimkan setpoint kendali </w:t>
-      </w:r>
-      <w:r>
-        <w:rPr>
-          <w:rFonts w:ascii="Arial" w:hAnsi="Arial"/>
-          <w:i/>
-          <w:sz w:val="20"/>
-        </w:rPr>
-        <w:t>visual servoing</w:t>
-      </w:r>
-      <w:r>
-        <w:rPr>
-          <w:rFonts w:ascii="Arial" w:hAnsi="Arial"/>
-          <w:sz w:val="20"/>
-        </w:rPr>
-        <w:t xml:space="preserve"> kembali ke wahana melalui MAVLink.</w:t>
+        <w:t>) memproses deteksi objek YOLO26 World dan mengeksekusi penapis visual 8D, lalu mengirimkan setpoint kendali</w:t>
+      </w:r>
+      <w:r>
+        <w:rPr>
+          <w:rFonts w:ascii="Arial" w:hAnsi="Arial"/>
+          <w:sz w:val="20"/>
+        </w:rPr>
+        <w:t>visual servoing kembali ke wahana melalui MAVLink.</w:t>
       </w:r>
     </w:p>
     <w:p>
@@ -1936,7 +1630,7 @@
       <w:r>
         <w:rPr>
           <w:rFonts w:ascii="Arial" w:hAnsi="Arial"/>
-          <w:b/>
+          <w:i/>
           <w:sz w:val="20"/>
         </w:rPr>
         <w:t>Fase VI (Pengujian, Validasi, dan Evaluasi Kinerja)</w:t>
@@ -1946,22 +1640,7 @@
           <w:rFonts w:ascii="Arial" w:hAnsi="Arial"/>
           <w:sz w:val="20"/>
         </w:rPr>
-        <w:t>: Menjalankan serangkaian eksperimen terukur untuk mengevaluasi akurasi pelacakan visual target, kemampuan penapisan derau frekuensi tinggi, ketahanan terhadap oklusi target temporer, akurasi rekonstruksi kecepatan bodi 6-DOF, mitigasi momen Munk, serta latensi komputasi waktu nyata (*</w:t>
-      </w:r>
-      <w:r>
-        <w:rPr>
-          <w:rFonts w:ascii="Arial" w:hAnsi="Arial"/>
-          <w:i/>
-          <w:sz w:val="20"/>
-        </w:rPr>
-        <w:t>real-time</w:t>
-      </w:r>
-      <w:r>
-        <w:rPr>
-          <w:rFonts w:ascii="Arial" w:hAnsi="Arial"/>
-          <w:sz w:val="20"/>
-        </w:rPr>
-        <w:t xml:space="preserve"> execution profiling*).</w:t>
+        <w:t>: Menjalankan serangkaian eksperimen terukur untuk mengevaluasi akurasi pelacakan visual target, kemampuan penapisan derau frekuensi tinggi, ketahanan terhadap oklusi target temporer, akurasi rekonstruksi kecepatan bodi 6-DOF, mitigasi momen Munk, serta latensi komputasi waktu nyata (real-time execution profiling).</w:t>
       </w:r>
     </w:p>
     <w:p>
@@ -1996,19 +1675,11 @@
           <w:i/>
           <w:sz w:val="20"/>
         </w:rPr>
-        <w:t>AUVDynamicsKalmanFilter</w:t>
-      </w:r>
-      <w:r>
-        <w:rPr>
-          <w:rFonts w:ascii="Arial" w:hAnsi="Arial"/>
-          <w:sz w:val="20"/>
-        </w:rPr>
-        <w:t xml:space="preserve">) dan alokasi gaya dorong </w:t>
-      </w:r>
-      <w:r>
-        <w:rPr>
-          <w:rFonts w:ascii="Arial" w:hAnsi="Arial"/>
-          <w:b/>
+        <w:t>AUVDynamicsKalmanFilter) dan alokasi gaya dorong</w:t>
+      </w:r>
+      <w:r>
+        <w:rPr>
+          <w:rFonts w:ascii="Arial" w:hAnsi="Arial"/>
           <w:sz w:val="20"/>
         </w:rPr>
         <w:t>over-actuated</w:t>
@@ -2016,14 +1687,14 @@
       <w:r>
         <w:rPr>
           <w:rFonts w:ascii="Arial" w:hAnsi="Arial"/>
-          <w:sz w:val="20"/>
-        </w:rPr>
-        <w:t xml:space="preserve"> bergantung mutlak pada akurasi parameter fisik dan koefisien hidrodinamika wahana. Sub-bab ini merangkum identifikasi numerik dari parameter benda tegar (</w:t>
-      </w:r>
-      <w:r>
-        <w:rPr>
-          <w:rFonts w:ascii="Arial" w:hAnsi="Arial"/>
-          <w:b/>
+          <w:i/>
+          <w:sz w:val="20"/>
+        </w:rPr>
+        <w:t>bergantung mutlak pada akurasi parameter fisik dan koefisien hidrodinamika wahana. Sub-bab ini merangkum identifikasi numerik dari parameter benda tegar (</w:t>
+      </w:r>
+      <w:r>
+        <w:rPr>
+          <w:rFonts w:ascii="Arial" w:hAnsi="Arial"/>
           <w:sz w:val="20"/>
         </w:rPr>
         <w:t>rigid-body</w:t>
@@ -2031,6 +1702,7 @@
       <w:r>
         <w:rPr>
           <w:rFonts w:ascii="Arial" w:hAnsi="Arial"/>
+          <w:i/>
           <w:sz w:val="20"/>
         </w:rPr>
         <w:t>), massa tambah hidrodinamika (</w:t>
@@ -2038,7 +1710,6 @@
       <w:r>
         <w:rPr>
           <w:rFonts w:ascii="Arial" w:hAnsi="Arial"/>
-          <w:b/>
           <w:sz w:val="20"/>
         </w:rPr>
         <w:t>added mass</w:t>
@@ -2046,6 +1717,7 @@
       <w:r>
         <w:rPr>
           <w:rFonts w:ascii="Arial" w:hAnsi="Arial"/>
+          <w:i/>
           <w:sz w:val="20"/>
         </w:rPr>
         <w:t>), redaman fluida (</w:t>
@@ -2053,7 +1725,6 @@
       <w:r>
         <w:rPr>
           <w:rFonts w:ascii="Arial" w:hAnsi="Arial"/>
-          <w:b/>
           <w:sz w:val="20"/>
         </w:rPr>
         <w:t>hydrodynamic damping</w:t>
@@ -2061,6 +1732,7 @@
       <w:r>
         <w:rPr>
           <w:rFonts w:ascii="Arial" w:hAnsi="Arial"/>
+          <w:i/>
           <w:sz w:val="20"/>
         </w:rPr>
         <w:t>), gaya pemulih hidrostatis (</w:t>
@@ -2068,17 +1740,9 @@
       <w:r>
         <w:rPr>
           <w:rFonts w:ascii="Arial" w:hAnsi="Arial"/>
-          <w:b/>
-          <w:sz w:val="20"/>
-        </w:rPr>
-        <w:t>restoring forces</w:t>
-      </w:r>
-      <w:r>
-        <w:rPr>
-          <w:rFonts w:ascii="Arial" w:hAnsi="Arial"/>
-          <w:sz w:val="20"/>
-        </w:rPr>
-        <w:t>), serta geometri alokasi pendorong 8-motor BlueROV2 Heavy [1], [3], [7], [34].</w:t>
+          <w:sz w:val="20"/>
+        </w:rPr>
+        <w:t>restoring forces), serta geometri alokasi pendorong 8-motor BlueROV2 Heavy [1], [3], [7], [34].</w:t>
       </w:r>
     </w:p>
     <w:p>
@@ -2091,24 +1755,7 @@
           <w:b/>
           <w:sz w:val="20"/>
         </w:rPr>
-        <w:t>3.3.1 Parameter Fisik dan Properti Benda Tegar (*</w:t>
-      </w:r>
-      <w:r>
-        <w:rPr>
-          <w:rFonts w:ascii="Arial" w:hAnsi="Arial"/>
-          <w:b/>
-          <w:i/>
-          <w:sz w:val="20"/>
-        </w:rPr>
-        <w:t>Rigid-Body</w:t>
-      </w:r>
-      <w:r>
-        <w:rPr>
-          <w:rFonts w:ascii="Arial" w:hAnsi="Arial"/>
-          <w:b/>
-          <w:sz w:val="20"/>
-        </w:rPr>
-        <w:t xml:space="preserve"> Properties*)</w:t>
+        <w:t>3.3.1 Parameter Fisik dan Properti Benda Tegar (Rigid-Body Properties)</w:t>
       </w:r>
     </w:p>
     <w:p>
@@ -2137,41 +1784,27 @@
           <w:rFonts w:ascii="Arial" w:hAnsi="Arial"/>
           <w:sz w:val="20"/>
         </w:rPr>
-        <w:t xml:space="preserve"> BlueROV2 Heavy berbahan dasar tabung akrilik tahan tekanan tinggi dengan rangka struktural </w:t>
-      </w:r>
-      <w:r>
-        <w:rPr>
-          <w:rFonts w:ascii="Arial" w:hAnsi="Arial"/>
-          <w:i/>
-          <w:sz w:val="20"/>
-        </w:rPr>
-        <w:t>High-Density Polyethylene</w:t>
-      </w:r>
-      <w:r>
-        <w:rPr>
-          <w:rFonts w:ascii="Arial" w:hAnsi="Arial"/>
-          <w:sz w:val="20"/>
-        </w:rPr>
-        <w:t xml:space="preserve"> (HDPE) [3]. Parameter massa total, dimensi fisik, dan posisi pusat massa/apung ditabulasikan pada Tabel 3.1.</w:t>
+        <w:t xml:space="preserve"> BlueROV2 Heavy berbahan dasar tabung akrilik tahan tekanan tinggi dengan rangka struktural High-Density Polyethylene (HDPE) [3]. Parameter massa total, dimensi fisik, dan posisi pusat massa/apung ditabulasikan pada Tabel 3.1.</w:t>
       </w:r>
     </w:p>
     <w:p>
       <w:pPr>
-        <w:spacing w:before="160" w:after="60"/>
-      </w:pPr>
-      <w:r>
-        <w:rPr>
-          <w:rFonts w:ascii="Arial" w:hAnsi="Arial"/>
-          <w:b/>
-          <w:sz w:val="19"/>
+        <w:spacing w:after="80" w:line="276" w:lineRule="auto"/>
+        <w:ind w:firstLine="567"/>
+        <w:jc w:val="both"/>
+      </w:pPr>
+      <w:r>
+        <w:rPr>
+          <w:rFonts w:ascii="Arial" w:hAnsi="Arial"/>
+          <w:i/>
+          <w:sz w:val="20"/>
         </w:rPr>
         <w:t>Tabel 3.1</w:t>
       </w:r>
       <w:r>
         <w:rPr>
           <w:rFonts w:ascii="Arial" w:hAnsi="Arial"/>
-          <w:b/>
-          <w:sz w:val="19"/>
+          <w:sz w:val="20"/>
         </w:rPr>
         <w:t xml:space="preserve"> Parameter Fisik dan Properti Benda Tegar Wahana BlueROV2 Heavy</w:t>
       </w:r>
@@ -2521,22 +2154,7 @@
                 <w:rFonts w:ascii="Arial" w:hAnsi="Arial"/>
                 <w:sz w:val="17"/>
               </w:rPr>
-              <w:t>Panjang Total (</w:t>
-            </w:r>
-            <w:r>
-              <w:rPr>
-                <w:rFonts w:ascii="Arial" w:hAnsi="Arial"/>
-                <w:i/>
-                <w:sz w:val="17"/>
-              </w:rPr>
-              <w:t>Length</w:t>
-            </w:r>
-            <w:r>
-              <w:rPr>
-                <w:rFonts w:ascii="Arial" w:hAnsi="Arial"/>
-                <w:sz w:val="17"/>
-              </w:rPr>
-              <w:t>)</w:t>
+              <w:t>Panjang Total (Length)</w:t>
             </w:r>
           </w:p>
         </w:tc>
@@ -4184,7 +3802,7 @@
           <w:rFonts w:ascii="Arial" w:hAnsi="Arial"/>
           <w:sz w:val="20"/>
         </w:rPr>
-        <w:t>Gaya apung total (*</w:t>
+        <w:t>Gaya apung total (</w:t>
       </w:r>
       <w:r>
         <w:rPr>
@@ -4192,14 +3810,14 @@
           <w:i/>
           <w:sz w:val="20"/>
         </w:rPr>
-        <w:t>buoyancy</w:t>
-      </w:r>
-      <w:r>
-        <w:rPr>
-          <w:rFonts w:ascii="Arial" w:hAnsi="Arial"/>
-          <w:sz w:val="20"/>
-        </w:rPr>
-        <w:t xml:space="preserve"> force*) pada air tawar dan air laut adalah:</w:t>
+        <w:t>buoyancy force</w:t>
+      </w:r>
+      <w:r>
+        <w:rPr>
+          <w:rFonts w:ascii="Arial" w:hAnsi="Arial"/>
+          <w:sz w:val="20"/>
+        </w:rPr>
+        <w:t>) pada air tawar dan air laut adalah:</w:t>
       </w:r>
     </w:p>
     <w:p>
@@ -4339,14 +3957,46 @@
           <w:i/>
           <w:sz w:val="20"/>
         </w:rPr>
-        <w:t xml:space="preserve">positive </w:t>
-      </w:r>
-      <w:r>
-        <w:rPr>
-          <w:rFonts w:ascii="Arial" w:hAnsi="Arial"/>
-          <w:sz w:val="20"/>
-        </w:rPr>
-        <w:t>buoyancy*</w:t>
+        <w:t>positive buoyancy</w:t>
+      </w:r>
+      <w:r>
+        <w:rPr>
+          <w:rFonts w:ascii="Arial" w:hAnsi="Arial"/>
+          <w:sz w:val="20"/>
+        </w:rPr>
+        <w:t xml:space="preserve">) yang terukur sebesar </w:t>
+      </w:r>
+      <w:r>
+        <w:rPr>
+          <w:rFonts w:ascii="Arial" w:hAnsi="Arial"/>
+          <w:sz w:val="20"/>
+        </w:rPr>
+        <w:t>$$+1.962</w:t>
+        <w:tab/>
+        <w:t>ext{ N}$$</w:t>
+      </w:r>
+      <w:r>
+        <w:rPr>
+          <w:rFonts w:ascii="Arial" w:hAnsi="Arial"/>
+          <w:sz w:val="20"/>
+        </w:rPr>
+        <w:t xml:space="preserve"> (pada air tawar) dan </w:t>
+      </w:r>
+      <w:r>
+        <w:rPr>
+          <w:rFonts w:ascii="Arial" w:hAnsi="Arial"/>
+          <w:sz w:val="20"/>
+        </w:rPr>
+        <w:t>$$+5.198</w:t>
+        <w:tab/>
+        <w:t>ext{ N}$$</w:t>
+      </w:r>
+      <w:r>
+        <w:rPr>
+          <w:rFonts w:ascii="Arial" w:hAnsi="Arial"/>
+          <w:sz w:val="20"/>
+        </w:rPr>
+        <w:t xml:space="preserve"> (pada air laut). Karakteristik </w:t>
       </w:r>
       <w:r>
         <w:rPr>
@@ -4354,49 +4004,14 @@
           <w:i/>
           <w:sz w:val="20"/>
         </w:rPr>
-        <w:t>) yang terukur sebesar $$+1.962</w:t>
-        <w:tab/>
-        <w:t>ext{ N}$$ (pada air tawar) dan $$+5.198</w:t>
-        <w:tab/>
-        <w:t xml:space="preserve">ext{ N}$$ (pada air laut). Karakteristik </w:t>
-      </w:r>
-      <w:r>
-        <w:rPr>
-          <w:rFonts w:ascii="Arial" w:hAnsi="Arial"/>
-          <w:sz w:val="20"/>
-        </w:rPr>
-        <w:t xml:space="preserve">positive </w:t>
-      </w:r>
-      <w:r>
-        <w:rPr>
-          <w:rFonts w:ascii="Arial" w:hAnsi="Arial"/>
-          <w:i/>
-          <w:sz w:val="20"/>
-        </w:rPr>
-        <w:t>buoyancy</w:t>
-      </w:r>
-      <w:r>
-        <w:rPr>
-          <w:rFonts w:ascii="Arial" w:hAnsi="Arial"/>
-          <w:i/>
-          <w:sz w:val="20"/>
-        </w:rPr>
-        <w:t xml:space="preserve"> ini merupakan persyaratan keselamatan esensial pada robotika bawah air (</w:t>
-      </w:r>
-      <w:r>
-        <w:rPr>
-          <w:rFonts w:ascii="Arial" w:hAnsi="Arial"/>
-          <w:i/>
-          <w:sz w:val="20"/>
-        </w:rPr>
-        <w:t>fail-safe</w:t>
-      </w:r>
-      <w:r>
-        <w:rPr>
-          <w:rFonts w:ascii="Arial" w:hAnsi="Arial"/>
-          <w:sz w:val="20"/>
-        </w:rPr>
-        <w:t xml:space="preserve"> design*), sehingga wahana akan mengapung secara pasif ke permukaan apabila terjadi kegagalan daya baterai total [3], [7].</w:t>
+        <w:t>positive buoyancy</w:t>
+      </w:r>
+      <w:r>
+        <w:rPr>
+          <w:rFonts w:ascii="Arial" w:hAnsi="Arial"/>
+          <w:sz w:val="20"/>
+        </w:rPr>
+        <w:t xml:space="preserve"> ini merupakan persyaratan keselamatan esensial pada robotika bawah air (fail-safe design), sehingga wahana akan mengapung secara pasif ke permukaan apabila terjadi kegagalan daya baterai total [3], [7].</w:t>
       </w:r>
     </w:p>
     <w:p>
@@ -4463,7 +4078,7 @@
       <w:r>
         <w:rPr>
           <w:rFonts w:ascii="Arial" w:hAnsi="Arial"/>
-          <w:b/>
+          <w:i/>
           <w:sz w:val="20"/>
         </w:rPr>
         <w:t>Roll</w:t>
@@ -4471,28 +4086,15 @@
       <w:r>
         <w:rPr>
           <w:rFonts w:ascii="Arial" w:hAnsi="Arial"/>
-          <w:sz w:val="20"/>
-        </w:rPr>
-        <w:t xml:space="preserve"> (</w:t>
-      </w:r>
-      <w:r>
-        <w:rPr>
-          <w:rFonts w:ascii="Arial" w:hAnsi="Arial"/>
-          <w:sz w:val="20"/>
-        </w:rPr>
-        <w:t>$$\phi$$</w:t>
-      </w:r>
-      <w:r>
-        <w:rPr>
-          <w:rFonts w:ascii="Arial" w:hAnsi="Arial"/>
-          <w:sz w:val="20"/>
-        </w:rPr>
-        <w:t xml:space="preserve">) dan </w:t>
-      </w:r>
-      <w:r>
-        <w:rPr>
-          <w:rFonts w:ascii="Arial" w:hAnsi="Arial"/>
-          <w:b/>
+          <w:i/>
+          <w:sz w:val="20"/>
+        </w:rPr>
+        <w:t>($$\phi$$) dan</w:t>
+      </w:r>
+      <w:r>
+        <w:rPr>
+          <w:rFonts w:ascii="Arial" w:hAnsi="Arial"/>
+          <w:i/>
           <w:sz w:val="20"/>
         </w:rPr>
         <w:t>Pitch</w:t>
@@ -4717,24 +4319,7 @@
           <w:b/>
           <w:sz w:val="20"/>
         </w:rPr>
-        <w:t>3.3.2 Estimasi Derivatif Massa Tambah Hidrodinamika (</w:t>
-      </w:r>
-      <w:r>
-        <w:rPr>
-          <w:rFonts w:ascii="Arial" w:hAnsi="Arial"/>
-          <w:b/>
-          <w:i/>
-          <w:sz w:val="20"/>
-        </w:rPr>
-        <w:t xml:space="preserve">Hydrodynamic </w:t>
-      </w:r>
-      <w:r>
-        <w:rPr>
-          <w:rFonts w:ascii="Arial" w:hAnsi="Arial"/>
-          <w:b/>
-          <w:sz w:val="20"/>
-        </w:rPr>
-        <w:t>Added Mass**)</w:t>
+        <w:t>3.3.2 Estimasi Derivatif Massa Tambah Hidrodinamika (Hydrodynamic Added Mass)</w:t>
       </w:r>
     </w:p>
     <w:p>
@@ -4778,22 +4363,7 @@
           <w:rFonts w:ascii="Arial" w:hAnsi="Arial"/>
           <w:sz w:val="20"/>
         </w:rPr>
-        <w:t xml:space="preserve"> mendekati simetris), suku-suku kopling silang di luar diagonal bernilai sangat kecil dibandingkan suku diagonal utamanya [31], [34]. Derivatif massa tambah hidrodinamika ditentukan berdasarkan hasil identifikasi eksperimental PMM dan analisis komputasi fluida (CFD) yang telah divalidasi oleh pengujian eksperimental </w:t>
-      </w:r>
-      <w:r>
-        <w:rPr>
-          <w:rFonts w:ascii="Arial" w:hAnsi="Arial"/>
-          <w:i/>
-          <w:sz w:val="20"/>
-        </w:rPr>
-        <w:t>Planar Motion Mechanism</w:t>
-      </w:r>
-      <w:r>
-        <w:rPr>
-          <w:rFonts w:ascii="Arial" w:hAnsi="Arial"/>
-          <w:sz w:val="20"/>
-        </w:rPr>
-        <w:t xml:space="preserve"> (PMM) dan survei literatur wahana kelas BlueROV2 [1], [4], [7], [12], [26], [28], [31], [34], [37]:</w:t>
+        <w:t xml:space="preserve"> mendekati simetris), suku-suku kopling silang di luar diagonal bernilai sangat kecil dibandingkan suku diagonal utamanya [31], [34]. Derivatif massa tambah hidrodinamika ditentukan berdasarkan hasil identifikasi eksperimental PMM dan analisis komputasi fluida (CFD) yang telah divalidasi oleh pengujian eksperimental Planar Motion Mechanism (PMM) dan survei literatur wahana kelas BlueROV2 [1], [4], [7], [12], [26], [28], [31], [34], [37]:</w:t>
       </w:r>
     </w:p>
     <w:p>
@@ -4842,21 +4412,22 @@
     </w:p>
     <w:p>
       <w:pPr>
-        <w:spacing w:before="160" w:after="60"/>
-      </w:pPr>
-      <w:r>
-        <w:rPr>
-          <w:rFonts w:ascii="Arial" w:hAnsi="Arial"/>
-          <w:b/>
-          <w:sz w:val="19"/>
+        <w:spacing w:after="80" w:line="276" w:lineRule="auto"/>
+        <w:ind w:firstLine="567"/>
+        <w:jc w:val="both"/>
+      </w:pPr>
+      <w:r>
+        <w:rPr>
+          <w:rFonts w:ascii="Arial" w:hAnsi="Arial"/>
+          <w:i/>
+          <w:sz w:val="20"/>
         </w:rPr>
         <w:t>Tabel 3.2</w:t>
       </w:r>
       <w:r>
         <w:rPr>
           <w:rFonts w:ascii="Arial" w:hAnsi="Arial"/>
-          <w:b/>
-          <w:sz w:val="19"/>
+          <w:sz w:val="20"/>
         </w:rPr>
         <w:t xml:space="preserve"> Koefisien Derivatif Massa Tambah Hidrodinamika Wahana</w:t>
       </w:r>
@@ -6072,7 +5643,7 @@
       <w:r>
         <w:rPr>
           <w:rFonts w:ascii="Arial" w:hAnsi="Arial"/>
-          <w:b/>
+          <w:i/>
           <w:sz w:val="20"/>
         </w:rPr>
         <w:t>yaw</w:t>
@@ -6296,7 +5867,7 @@
           <w:rFonts w:ascii="Arial" w:hAnsi="Arial"/>
           <w:sz w:val="20"/>
         </w:rPr>
-        <w:t>) untuk aliran laminer kecepatan rendah dan redaman bentuk kuadratik non-linier (</w:t>
+        <w:t>) untuk aliran laminer kecepatan rendah dan redaman bentuk kuadratik non-linier (quadratic form drag</w:t>
       </w:r>
       <w:r>
         <w:rPr>
@@ -6304,43 +5875,14 @@
           <w:i/>
           <w:sz w:val="20"/>
         </w:rPr>
-        <w:t>quadratic form drag</w:t>
-      </w:r>
-      <w:r>
-        <w:rPr>
-          <w:rFonts w:ascii="Arial" w:hAnsi="Arial"/>
-          <w:sz w:val="20"/>
-        </w:rPr>
-        <w:t xml:space="preserve"> </w:t>
-      </w:r>
-      <w:r>
-        <w:rPr>
-          <w:rFonts w:ascii="Arial" w:hAnsi="Arial"/>
-          <w:sz w:val="20"/>
-        </w:rPr>
-        <w:t>$$\mathbf{D}_{NL}$$</w:t>
-      </w:r>
-      <w:r>
-        <w:rPr>
-          <w:rFonts w:ascii="Arial" w:hAnsi="Arial"/>
-          <w:sz w:val="20"/>
-        </w:rPr>
-        <w:t>) akibat pusaran turbulen (</w:t>
-      </w:r>
-      <w:r>
-        <w:rPr>
-          <w:rFonts w:ascii="Arial" w:hAnsi="Arial"/>
-          <w:i/>
-          <w:sz w:val="20"/>
-        </w:rPr>
-        <w:t>vortex shedding</w:t>
-      </w:r>
-      <w:r>
-        <w:rPr>
-          <w:rFonts w:ascii="Arial" w:hAnsi="Arial"/>
-          <w:sz w:val="20"/>
-        </w:rPr>
-        <w:t>) di sekitar struktur kerangka terbuka [7], [31], [34]:</w:t>
+        <w:t>$$\mathbf{D}_{NL}$$) akibat pusaran turbulen (</w:t>
+      </w:r>
+      <w:r>
+        <w:rPr>
+          <w:rFonts w:ascii="Arial" w:hAnsi="Arial"/>
+          <w:sz w:val="20"/>
+        </w:rPr>
+        <w:t>vortex shedding) di sekitar struktur kerangka terbuka [7], [31], [34]:</w:t>
       </w:r>
     </w:p>
     <w:p>
@@ -6489,21 +6031,22 @@
     </w:p>
     <w:p>
       <w:pPr>
-        <w:spacing w:before="160" w:after="60"/>
-      </w:pPr>
-      <w:r>
-        <w:rPr>
-          <w:rFonts w:ascii="Arial" w:hAnsi="Arial"/>
-          <w:b/>
-          <w:sz w:val="19"/>
+        <w:spacing w:after="80" w:line="276" w:lineRule="auto"/>
+        <w:ind w:firstLine="567"/>
+        <w:jc w:val="both"/>
+      </w:pPr>
+      <w:r>
+        <w:rPr>
+          <w:rFonts w:ascii="Arial" w:hAnsi="Arial"/>
+          <w:i/>
+          <w:sz w:val="20"/>
         </w:rPr>
         <w:t>Tabel 3.3</w:t>
       </w:r>
       <w:r>
         <w:rPr>
           <w:rFonts w:ascii="Arial" w:hAnsi="Arial"/>
-          <w:b/>
-          <w:sz w:val="19"/>
+          <w:sz w:val="20"/>
         </w:rPr>
         <w:t xml:space="preserve"> Koefisien Redaman Hidrodinamika Linier dan Kuadratik Wahana</w:t>
       </w:r>
@@ -10367,7 +9910,7 @@
       <w:r>
         <w:rPr>
           <w:rFonts w:ascii="Arial" w:hAnsi="Arial"/>
-          <w:b/>
+          <w:i/>
           <w:sz w:val="20"/>
         </w:rPr>
         <w:t>Yaw</w:t>
@@ -10484,7 +10027,7 @@
       <w:r>
         <w:rPr>
           <w:rFonts w:ascii="Arial" w:hAnsi="Arial"/>
-          <w:b/>
+          <w:i/>
           <w:sz w:val="20"/>
         </w:rPr>
         <w:t>real-time</w:t>
@@ -10582,22 +10125,7 @@
           <w:rFonts w:ascii="Arial" w:hAnsi="Arial"/>
           <w:sz w:val="20"/>
         </w:rPr>
-        <w:t>) dengan zona mati (</w:t>
-      </w:r>
-      <w:r>
-        <w:rPr>
-          <w:rFonts w:ascii="Arial" w:hAnsi="Arial"/>
-          <w:i/>
-          <w:sz w:val="20"/>
-        </w:rPr>
-        <w:t>deadband</w:t>
-      </w:r>
-      <w:r>
-        <w:rPr>
-          <w:rFonts w:ascii="Arial" w:hAnsi="Arial"/>
-          <w:sz w:val="20"/>
-        </w:rPr>
-        <w:t xml:space="preserve">) nominal </w:t>
+        <w:t xml:space="preserve">) dengan zona mati (deadband) nominal </w:t>
       </w:r>
       <w:r>
         <w:rPr>
@@ -10809,7 +10337,7 @@
       <w:r>
         <w:rPr>
           <w:rFonts w:ascii="Arial" w:hAnsi="Arial"/>
-          <w:b/>
+          <w:i/>
           <w:sz w:val="20"/>
         </w:rPr>
         <w:t>Software-In-The-Loop</w:t>
@@ -10817,24 +10345,17 @@
       <w:r>
         <w:rPr>
           <w:rFonts w:ascii="Arial" w:hAnsi="Arial"/>
-          <w:sz w:val="20"/>
-        </w:rPr>
-        <w:t xml:space="preserve"> (SITL) dibangun untuk memvalidasi algoritma estimasi </w:t>
-      </w:r>
-      <w:r>
-        <w:rPr>
-          <w:rFonts w:ascii="Arial" w:hAnsi="Arial"/>
           <w:i/>
           <w:sz w:val="20"/>
         </w:rPr>
-        <w:t xml:space="preserve">Dual </w:t>
-      </w:r>
-      <w:r>
-        <w:rPr>
-          <w:rFonts w:ascii="Arial" w:hAnsi="Arial"/>
-          <w:sz w:val="20"/>
-        </w:rPr>
-        <w:t>Kalman Filter*</w:t>
+        <w:t>(SITL) dibangun untuk memvalidasi algoritma estimasi</w:t>
+      </w:r>
+      <w:r>
+        <w:rPr>
+          <w:rFonts w:ascii="Arial" w:hAnsi="Arial"/>
+          <w:sz w:val="20"/>
+        </w:rPr>
+        <w:t xml:space="preserve">Dual Kalman Filter dan kinematika/dinamika 6-DOF secara komprehensif di lingkungan simulasi hidrodinamika virtual sebelum diimplementasikan pada perangkat keras fisik, sejalan dengan metodologi </w:t>
       </w:r>
       <w:r>
         <w:rPr>
@@ -10842,37 +10363,14 @@
           <w:i/>
           <w:sz w:val="20"/>
         </w:rPr>
-        <w:t xml:space="preserve"> dan kinematika/dinamika 6-DOF secara komprehensif di lingkungan simulasi hidrodinamika virtual sebelum diimplementasikan pada perangkat keras fisik, sejalan dengan metodologi </w:t>
-      </w:r>
-      <w:r>
-        <w:rPr>
-          <w:rFonts w:ascii="Arial" w:hAnsi="Arial"/>
-          <w:sz w:val="20"/>
-        </w:rPr>
-        <w:t>simulation-driven</w:t>
-      </w:r>
-      <w:r>
-        <w:rPr>
-          <w:rFonts w:ascii="Arial" w:hAnsi="Arial"/>
-          <w:i/>
-          <w:sz w:val="20"/>
-        </w:rPr>
-        <w:t xml:space="preserve"> dan validasi </w:t>
-      </w:r>
-      <w:r>
-        <w:rPr>
-          <w:rFonts w:ascii="Arial" w:hAnsi="Arial"/>
-          <w:i/>
-          <w:sz w:val="20"/>
-        </w:rPr>
-        <w:t>digital twin</w:t>
-      </w:r>
-      <w:r>
-        <w:rPr>
-          <w:rFonts w:ascii="Arial" w:hAnsi="Arial"/>
-          <w:sz w:val="20"/>
-        </w:rPr>
-        <w:t>* yang dirumuskan oleh Karras dkk. (2024) serta Mari dkk. (2026) [14], [15], [19], [21], [31].</w:t>
+        <w:t>simulation-driven dan validasi</w:t>
+      </w:r>
+      <w:r>
+        <w:rPr>
+          <w:rFonts w:ascii="Arial" w:hAnsi="Arial"/>
+          <w:sz w:val="20"/>
+        </w:rPr>
+        <w:t>digital twin yang dirumuskan oleh Karras dkk. (2024) serta Mari dkk. (2026) [14], [15], [19], [21], [31].</w:t>
       </w:r>
     </w:p>
     <w:p>
@@ -11002,7 +10500,7 @@
           <w:rFonts w:ascii="Arial" w:hAnsi="Arial"/>
           <w:sz w:val="20"/>
         </w:rPr>
-        <w:t xml:space="preserve"> versi 8.14) di bawah sistem operasi Ubuntu 24.04.4 LTS (Noble Numbat) [31]. Wahana BlueROV2 Heavy direpresentasikan dalam berkas deskripsi robotik </w:t>
+        <w:t xml:space="preserve"> versi 8.14) di bawah sistem operasi Ubuntu 24.04.4 LTS (Noble Numbat) [31]. Wahana BlueROV2 Heavy direpresentasikan dalam berkas deskripsi robotik Simulation Description Format</w:t>
       </w:r>
       <w:r>
         <w:rPr>
@@ -11010,29 +10508,14 @@
           <w:i/>
           <w:sz w:val="20"/>
         </w:rPr>
-        <w:t>Simulation Description Format</w:t>
-      </w:r>
-      <w:r>
-        <w:rPr>
-          <w:rFonts w:ascii="Arial" w:hAnsi="Arial"/>
-          <w:sz w:val="20"/>
-        </w:rPr>
-        <w:t xml:space="preserve"> (SDF) yang mendefinisikan geometri visual, geometri tumbukan (</w:t>
-      </w:r>
-      <w:r>
-        <w:rPr>
-          <w:rFonts w:ascii="Arial" w:hAnsi="Arial"/>
-          <w:i/>
-          <w:sz w:val="20"/>
-        </w:rPr>
-        <w:t>collision mesh</w:t>
-      </w:r>
-      <w:r>
-        <w:rPr>
-          <w:rFonts w:ascii="Arial" w:hAnsi="Arial"/>
-          <w:sz w:val="20"/>
-        </w:rPr>
-        <w:t>), properti inersia, serta plugin fisika fluida:</w:t>
+        <w:t>(SDF) yang mendefinisikan geometri visual, geometri tumbukan (</w:t>
+      </w:r>
+      <w:r>
+        <w:rPr>
+          <w:rFonts w:ascii="Arial" w:hAnsi="Arial"/>
+          <w:sz w:val="20"/>
+        </w:rPr>
+        <w:t>collision mesh), properti inersia, serta plugin fisika fluida:</w:t>
       </w:r>
     </w:p>
     <w:p>
@@ -11049,7 +10532,7 @@
       <w:r>
         <w:rPr>
           <w:rFonts w:ascii="Arial" w:hAnsi="Arial"/>
-          <w:b/>
+          <w:i/>
           <w:sz w:val="20"/>
         </w:rPr>
         <w:t>Plugin Daya Apung (`gz-sim-buoyancy-system`)</w:t>
@@ -11076,7 +10559,7 @@
       <w:r>
         <w:rPr>
           <w:rFonts w:ascii="Arial" w:hAnsi="Arial"/>
-          <w:b/>
+          <w:i/>
           <w:sz w:val="20"/>
         </w:rPr>
         <w:t>Plugin Hidrodinamika (`gz-sim-hydrodynamics-system`)</w:t>
@@ -11086,22 +10569,7 @@
           <w:rFonts w:ascii="Arial" w:hAnsi="Arial"/>
           <w:sz w:val="20"/>
         </w:rPr>
-        <w:t>: Mengimplementasikan model persamaan gerak Fossen (2021) secara langsung di dalam inti mesin fisika (</w:t>
-      </w:r>
-      <w:r>
-        <w:rPr>
-          <w:rFonts w:ascii="Arial" w:hAnsi="Arial"/>
-          <w:i/>
-          <w:sz w:val="20"/>
-        </w:rPr>
-        <w:t>physics engine</w:t>
-      </w:r>
-      <w:r>
-        <w:rPr>
-          <w:rFonts w:ascii="Arial" w:hAnsi="Arial"/>
-          <w:sz w:val="20"/>
-        </w:rPr>
-        <w:t>) Gazebo [7]. Parameter massa tambah (</w:t>
+        <w:t>: Mengimplementasikan model persamaan gerak Fossen (2021) secara langsung di dalam inti mesin fisika (physics engine) Gazebo [7]. Parameter massa tambah (</w:t>
       </w:r>
       <w:r>
         <w:rPr>
@@ -11146,7 +10614,7 @@
       <w:r>
         <w:rPr>
           <w:rFonts w:ascii="Arial" w:hAnsi="Arial"/>
-          <w:b/>
+          <w:i/>
           <w:sz w:val="20"/>
         </w:rPr>
         <w:t>Plugin `ardupilot_gazebo`</w:t>
@@ -11156,22 +10624,7 @@
           <w:rFonts w:ascii="Arial" w:hAnsi="Arial"/>
           <w:sz w:val="20"/>
         </w:rPr>
-        <w:t>: Bertindak sebagai jembatan komunikasi antara model fisik Gazebo dan perangkat lunak autopilot ArduSub [21]. Plugin ini membaca kecepatan putar motor pendorong dari paket JSON ArduSub, menerapkannya sebagai vektor gaya dorong pada model wahana di Gazebo, membaca kembali data sensor virtual (IMU, barometer tekanan kedalaman), dan mengirimkannya kembali ke ArduSub dengan sinkronisasi waktu langkah (</w:t>
-      </w:r>
-      <w:r>
-        <w:rPr>
-          <w:rFonts w:ascii="Arial" w:hAnsi="Arial"/>
-          <w:i/>
-          <w:sz w:val="20"/>
-        </w:rPr>
-        <w:t>lockstep simulation</w:t>
-      </w:r>
-      <w:r>
-        <w:rPr>
-          <w:rFonts w:ascii="Arial" w:hAnsi="Arial"/>
-          <w:sz w:val="20"/>
-        </w:rPr>
-        <w:t xml:space="preserve">) pada frekuensi </w:t>
+        <w:t xml:space="preserve">: Bertindak sebagai jembatan komunikasi antara model fisik Gazebo dan perangkat lunak autopilot ArduSub [21]. Plugin ini membaca kecepatan putar motor pendorong dari paket JSON ArduSub, menerapkannya sebagai vektor gaya dorong pada model wahana di Gazebo, membaca kembali data sensor virtual (IMU, barometer tekanan kedalaman), dan mengirimkannya kembali ke ArduSub dengan sinkronisasi waktu langkah (lockstep simulation) pada frekuensi </w:t>
       </w:r>
       <w:r>
         <w:rPr>
@@ -11332,7 +10785,7 @@
           <w:rFonts w:ascii="Arial" w:hAnsi="Arial"/>
           <w:sz w:val="20"/>
         </w:rPr>
-        <w:t xml:space="preserve"> secara khusus mengonfigurasi ArduSub untuk menggunakan kerangka alokasi 8-pendorong dengan kendali aktif 6 derajat kebebasan penuh [21]. ArduSub SITL menjalankan estimator navigasi internal EKF3, loop kendali PID untuk penstabilan sudut orientasi (*</w:t>
+        <w:t xml:space="preserve"> secara khusus mengonfigurasi ArduSub untuk menggunakan kerangka alokasi 8-pendorong dengan kendali aktif 6 derajat kebebasan penuh [21]. ArduSub SITL menjalankan estimator navigasi internal EKF3, loop kendali PID untuk penstabilan sudut orientasi (</w:t>
       </w:r>
       <w:r>
         <w:rPr>
@@ -11340,14 +10793,14 @@
           <w:i/>
           <w:sz w:val="20"/>
         </w:rPr>
-        <w:t>attitude</w:t>
-      </w:r>
-      <w:r>
-        <w:rPr>
-          <w:rFonts w:ascii="Arial" w:hAnsi="Arial"/>
-          <w:sz w:val="20"/>
-        </w:rPr>
-        <w:t xml:space="preserve"> controller*), dan matriks alokasi pendorong untuk menghasilkan sinyal kendali motor pendorong.</w:t>
+        <w:t>attitude controller</w:t>
+      </w:r>
+      <w:r>
+        <w:rPr>
+          <w:rFonts w:ascii="Arial" w:hAnsi="Arial"/>
+          <w:sz w:val="20"/>
+        </w:rPr>
+        <w:t>), dan matriks alokasi pendorong untuk menghasilkan sinyal kendali motor pendorong.</w:t>
       </w:r>
     </w:p>
     <w:p>
@@ -11390,22 +10843,7 @@
           <w:rFonts w:ascii="Arial" w:hAnsi="Arial"/>
           <w:sz w:val="20"/>
         </w:rPr>
-        <w:t xml:space="preserve">Untuk memfasilitasi pertukaran data antara simulator Gazebo Harmonic dan ekosistem komputasi robotika, diimplementasikan jembatan komunikasi </w:t>
-      </w:r>
-      <w:r>
-        <w:rPr>
-          <w:rFonts w:ascii="Arial" w:hAnsi="Arial"/>
-          <w:i/>
-          <w:sz w:val="20"/>
-        </w:rPr>
-        <w:t>ros_gz_bridge</w:t>
-      </w:r>
-      <w:r>
-        <w:rPr>
-          <w:rFonts w:ascii="Arial" w:hAnsi="Arial"/>
-          <w:sz w:val="20"/>
-        </w:rPr>
-        <w:t xml:space="preserve"> pada distribusi ROS 2 Jazzy Jalisco [14]:</w:t>
+        <w:t>Untuk memfasilitasi pertukaran data antara simulator Gazebo Harmonic dan ekosistem komputasi robotika, diimplementasikan jembatan komunikasi ros_gz_bridge pada distribusi ROS 2 Jazzy Jalisco [14]:</w:t>
       </w:r>
     </w:p>
     <w:p>
@@ -11471,7 +10909,7 @@
       <w:r>
         <w:rPr>
           <w:rFonts w:ascii="Arial" w:hAnsi="Arial"/>
-          <w:b/>
+          <w:i/>
           <w:sz w:val="20"/>
         </w:rPr>
         <w:t>ground truth</w:t>
@@ -11655,7 +11093,7 @@
       <w:r>
         <w:rPr>
           <w:rFonts w:ascii="Arial" w:hAnsi="Arial"/>
-          <w:b/>
+          <w:i/>
           <w:sz w:val="20"/>
         </w:rPr>
         <w:t>flight controller</w:t>
@@ -11663,14 +11101,15 @@
       <w:r>
         <w:rPr>
           <w:rFonts w:ascii="Arial" w:hAnsi="Arial"/>
-          <w:sz w:val="20"/>
-        </w:rPr>
-        <w:t xml:space="preserve"> Pixhawk 2.4.8, </w:t>
-      </w:r>
-      <w:r>
-        <w:rPr>
-          <w:rFonts w:ascii="Arial" w:hAnsi="Arial"/>
-          <w:b/>
+          <w:i/>
+          <w:sz w:val="20"/>
+        </w:rPr>
+        <w:t>Pixhawk 2.4.8,</w:t>
+      </w:r>
+      <w:r>
+        <w:rPr>
+          <w:rFonts w:ascii="Arial" w:hAnsi="Arial"/>
+          <w:i/>
           <w:sz w:val="20"/>
         </w:rPr>
         <w:t>companion computer</w:t>
@@ -12140,7 +11579,7 @@
             <w:r>
               <w:rPr>
                 <w:rFonts w:ascii="Arial" w:hAnsi="Arial"/>
-                <w:b/>
+                <w:i/>
                 <w:sz w:val="17"/>
               </w:rPr>
               <w:t>Companion Computer</w:t>
@@ -12623,15 +12062,7 @@
                 <w:rFonts w:ascii="Arial" w:hAnsi="Arial"/>
                 <w:sz w:val="17"/>
               </w:rPr>
-              <w:t xml:space="preserve">Kamera uji alternatif resolusi tinggi dengan lensa </w:t>
-            </w:r>
-            <w:r>
-              <w:rPr>
-                <w:rFonts w:ascii="Arial" w:hAnsi="Arial"/>
-                <w:i/>
-                <w:sz w:val="17"/>
-              </w:rPr>
-              <w:t>wide-angle</w:t>
+              <w:t>Kamera uji alternatif resolusi tinggi dengan lensa wide-angle</w:t>
             </w:r>
           </w:p>
         </w:tc>
@@ -12890,7 +12321,7 @@
             <w:r>
               <w:rPr>
                 <w:rFonts w:ascii="Arial" w:hAnsi="Arial"/>
-                <w:b/>
+                <w:i/>
                 <w:sz w:val="17"/>
               </w:rPr>
               <w:t>over-actuated</w:t>
@@ -13067,18 +12498,18 @@
       <w:r>
         <w:rPr>
           <w:rFonts w:ascii="Arial" w:hAnsi="Arial"/>
+        </w:rPr>
+        <w:t>[</w:t>
+      </w:r>
+      <w:r>
+        <w:rPr>
+          <w:rFonts w:ascii="Arial" w:hAnsi="Arial"/>
           <w:b/>
           <w:i/>
           <w:sz w:val="19"/>
         </w:rPr>
-        <w:t>[Gambar 3.2. Rangka (*Frame*) dan Lambung Tekanan (*Pressure Hull*) Tipe BlueROV2 Heavy]</w:t>
-      </w:r>
-    </w:p>
-    <w:p>
-      <w:pPr>
-        <w:spacing w:before="160" w:after="120"/>
-        <w:jc w:val="center"/>
-      </w:pPr>
+        <w:t>Gambar 3.2. Rangka (Frame</w:t>
+      </w:r>
       <w:r>
         <w:rPr>
           <w:rFonts w:ascii="Arial" w:hAnsi="Arial"/>
@@ -13086,14 +12517,8 @@
           <w:i/>
           <w:sz w:val="19"/>
         </w:rPr>
-        <w:t>[Gambar 3.3. Papan Pengendali Penerbangan (*Flight Controller*) Pixhawk 2.4.8]</w:t>
-      </w:r>
-    </w:p>
-    <w:p>
-      <w:pPr>
-        <w:spacing w:before="160" w:after="120"/>
-        <w:jc w:val="center"/>
-      </w:pPr>
+        <w:t>) dan Lambung Tekanan (</w:t>
+      </w:r>
       <w:r>
         <w:rPr>
           <w:rFonts w:ascii="Arial" w:hAnsi="Arial"/>
@@ -13101,7 +12526,13 @@
           <w:i/>
           <w:sz w:val="19"/>
         </w:rPr>
-        <w:t>[Gambar 3.4. Komputer Pendamping (*Companion Computer*) Raspberry Pi 4B]</w:t>
+        <w:t>Pressure Hull) Tipe BlueROV2 Heavy</w:t>
+      </w:r>
+      <w:r>
+        <w:rPr>
+          <w:rFonts w:ascii="Arial" w:hAnsi="Arial"/>
+        </w:rPr>
+        <w:t>]</w:t>
       </w:r>
     </w:p>
     <w:p>
@@ -13109,6 +12540,12 @@
         <w:spacing w:before="160" w:after="120"/>
         <w:jc w:val="center"/>
       </w:pPr>
+      <w:r>
+        <w:rPr>
+          <w:rFonts w:ascii="Arial" w:hAnsi="Arial"/>
+        </w:rPr>
+        <w:t>[</w:t>
+      </w:r>
       <w:r>
         <w:rPr>
           <w:rFonts w:ascii="Arial" w:hAnsi="Arial"/>
@@ -13116,14 +12553,8 @@
           <w:i/>
           <w:sz w:val="19"/>
         </w:rPr>
-        <w:t>[Gambar 3.5. Modul Pengendali Kecepatan Elektronik (*Basic Electronic Speed Controller* / ESC)]</w:t>
-      </w:r>
-    </w:p>
-    <w:p>
-      <w:pPr>
-        <w:spacing w:before="160" w:after="120"/>
-        <w:jc w:val="center"/>
-      </w:pPr>
+        <w:t>Gambar 3.3. Papan Pengendali Penerbangan (</w:t>
+      </w:r>
       <w:r>
         <w:rPr>
           <w:rFonts w:ascii="Arial" w:hAnsi="Arial"/>
@@ -13131,14 +12562,8 @@
           <w:i/>
           <w:sz w:val="19"/>
         </w:rPr>
-        <w:t>[Gambar 3.6. Motor Pendorong (*Thruster*) T200]</w:t>
-      </w:r>
-    </w:p>
-    <w:p>
-      <w:pPr>
-        <w:spacing w:before="160" w:after="120"/>
-        <w:jc w:val="center"/>
-      </w:pPr>
+        <w:t>Flight Controller</w:t>
+      </w:r>
       <w:r>
         <w:rPr>
           <w:rFonts w:ascii="Arial" w:hAnsi="Arial"/>
@@ -13146,37 +12571,188 @@
           <w:i/>
           <w:sz w:val="19"/>
         </w:rPr>
-        <w:t>[Gambar 3.7. Sumber Daya Utama Baterai Li-Po 4S 14.8V]</w:t>
+        <w:t>) Pixhawk 2.4.8</w:t>
+      </w:r>
+      <w:r>
+        <w:rPr>
+          <w:rFonts w:ascii="Arial" w:hAnsi="Arial"/>
+        </w:rPr>
+        <w:t>]</w:t>
       </w:r>
     </w:p>
     <w:p>
       <w:pPr>
-        <w:spacing w:before="160" w:after="40"/>
-      </w:pPr>
-      <w:r>
-        <w:rPr>
-          <w:rFonts w:ascii="Arial" w:hAnsi="Arial"/>
-          <w:b/>
-          <w:sz w:val="20"/>
-        </w:rPr>
-        <w:t>3.5.2 Aliran Data Telemetri Cepat (*</w:t>
+        <w:spacing w:before="160" w:after="120"/>
+        <w:jc w:val="center"/>
+      </w:pPr>
+      <w:r>
+        <w:rPr>
+          <w:rFonts w:ascii="Arial" w:hAnsi="Arial"/>
+        </w:rPr>
+        <w:t>[</w:t>
       </w:r>
       <w:r>
         <w:rPr>
           <w:rFonts w:ascii="Arial" w:hAnsi="Arial"/>
           <w:b/>
           <w:i/>
-          <w:sz w:val="20"/>
-        </w:rPr>
-        <w:t>Low-Latency</w:t>
+          <w:sz w:val="19"/>
+        </w:rPr>
+        <w:t>Gambar 3.4. Komputer Pendamping (</w:t>
       </w:r>
       <w:r>
         <w:rPr>
           <w:rFonts w:ascii="Arial" w:hAnsi="Arial"/>
           <w:b/>
-          <w:sz w:val="20"/>
-        </w:rPr>
-        <w:t xml:space="preserve"> Telemetry Bridge*)</w:t>
+          <w:i/>
+          <w:sz w:val="19"/>
+        </w:rPr>
+        <w:t>Companion Computer</w:t>
+      </w:r>
+      <w:r>
+        <w:rPr>
+          <w:rFonts w:ascii="Arial" w:hAnsi="Arial"/>
+          <w:b/>
+          <w:i/>
+          <w:sz w:val="19"/>
+        </w:rPr>
+        <w:t>) Raspberry Pi 4B</w:t>
+      </w:r>
+      <w:r>
+        <w:rPr>
+          <w:rFonts w:ascii="Arial" w:hAnsi="Arial"/>
+        </w:rPr>
+        <w:t>]</w:t>
+      </w:r>
+    </w:p>
+    <w:p>
+      <w:pPr>
+        <w:spacing w:before="160" w:after="120"/>
+        <w:jc w:val="center"/>
+      </w:pPr>
+      <w:r>
+        <w:rPr>
+          <w:rFonts w:ascii="Arial" w:hAnsi="Arial"/>
+        </w:rPr>
+        <w:t>[</w:t>
+      </w:r>
+      <w:r>
+        <w:rPr>
+          <w:rFonts w:ascii="Arial" w:hAnsi="Arial"/>
+          <w:b/>
+          <w:i/>
+          <w:sz w:val="19"/>
+        </w:rPr>
+        <w:t>Gambar 3.5. Modul Pengendali Kecepatan Elektronik (</w:t>
+      </w:r>
+      <w:r>
+        <w:rPr>
+          <w:rFonts w:ascii="Arial" w:hAnsi="Arial"/>
+          <w:b/>
+          <w:i/>
+          <w:sz w:val="19"/>
+        </w:rPr>
+        <w:t>Basic Electronic Speed Controller</w:t>
+      </w:r>
+      <w:r>
+        <w:rPr>
+          <w:rFonts w:ascii="Arial" w:hAnsi="Arial"/>
+          <w:b/>
+          <w:i/>
+          <w:sz w:val="19"/>
+        </w:rPr>
+        <w:t xml:space="preserve"> / ESC)</w:t>
+      </w:r>
+      <w:r>
+        <w:rPr>
+          <w:rFonts w:ascii="Arial" w:hAnsi="Arial"/>
+        </w:rPr>
+        <w:t>]</w:t>
+      </w:r>
+    </w:p>
+    <w:p>
+      <w:pPr>
+        <w:spacing w:before="160" w:after="120"/>
+        <w:jc w:val="center"/>
+      </w:pPr>
+      <w:r>
+        <w:rPr>
+          <w:rFonts w:ascii="Arial" w:hAnsi="Arial"/>
+        </w:rPr>
+        <w:t>[</w:t>
+      </w:r>
+      <w:r>
+        <w:rPr>
+          <w:rFonts w:ascii="Arial" w:hAnsi="Arial"/>
+          <w:b/>
+          <w:i/>
+          <w:sz w:val="19"/>
+        </w:rPr>
+        <w:t>Gambar 3.6. Motor Pendorong (</w:t>
+      </w:r>
+      <w:r>
+        <w:rPr>
+          <w:rFonts w:ascii="Arial" w:hAnsi="Arial"/>
+          <w:b/>
+          <w:i/>
+          <w:sz w:val="19"/>
+        </w:rPr>
+        <w:t>Thruster</w:t>
+      </w:r>
+      <w:r>
+        <w:rPr>
+          <w:rFonts w:ascii="Arial" w:hAnsi="Arial"/>
+          <w:b/>
+          <w:i/>
+          <w:sz w:val="19"/>
+        </w:rPr>
+        <w:t>) T200</w:t>
+      </w:r>
+      <w:r>
+        <w:rPr>
+          <w:rFonts w:ascii="Arial" w:hAnsi="Arial"/>
+        </w:rPr>
+        <w:t>]</w:t>
+      </w:r>
+    </w:p>
+    <w:p>
+      <w:pPr>
+        <w:spacing w:before="160" w:after="120"/>
+        <w:jc w:val="center"/>
+      </w:pPr>
+      <w:r>
+        <w:rPr>
+          <w:rFonts w:ascii="Arial" w:hAnsi="Arial"/>
+        </w:rPr>
+        <w:t>[</w:t>
+      </w:r>
+      <w:r>
+        <w:rPr>
+          <w:rFonts w:ascii="Arial" w:hAnsi="Arial"/>
+          <w:b/>
+          <w:i/>
+          <w:sz w:val="19"/>
+        </w:rPr>
+        <w:t>Gambar 3.7. Sumber Daya Utama Baterai Li-Po 4S 14.8V</w:t>
+      </w:r>
+      <w:r>
+        <w:rPr>
+          <w:rFonts w:ascii="Arial" w:hAnsi="Arial"/>
+        </w:rPr>
+        <w:t>]</w:t>
+      </w:r>
+    </w:p>
+    <w:p>
+      <w:pPr>
+        <w:spacing w:before="160" w:after="40"/>
+      </w:pPr>
+      <w:r>
+        <w:rPr>
+          <w:rFonts w:ascii="Arial" w:hAnsi="Arial"/>
+          <w:b/>
+          <w:sz w:val="20"/>
+        </w:rPr>
+        <w:t>3.5.2 Aliran Data Telemetri Cepat (Low-Latency Telemetry Bridge)</w:t>
       </w:r>
     </w:p>
     <w:p>
@@ -13237,7 +12813,7 @@
       <w:r>
         <w:rPr>
           <w:rFonts w:ascii="Arial" w:hAnsi="Arial"/>
-          <w:b/>
+          <w:i/>
           <w:sz w:val="20"/>
         </w:rPr>
         <w:t>Akuisisi Data IMU dan Tekanan</w:t>
@@ -13275,7 +12851,7 @@
           <w:rFonts w:ascii="Arial" w:hAnsi="Arial"/>
           <w:sz w:val="20"/>
         </w:rPr>
-        <w:t xml:space="preserve">](file:///home/radhi/Documents/AUV_GitHub_Upload/auv_dynamics_hil_node.py) melakukan </w:t>
+        <w:t>](file:///home/radhi/Documents/AUV_GitHub_Upload/auv_dynamics_hil_node.py) melakukan polling</w:t>
       </w:r>
       <w:r>
         <w:rPr>
@@ -13283,43 +12859,14 @@
           <w:i/>
           <w:sz w:val="20"/>
         </w:rPr>
-        <w:t>polling</w:t>
-      </w:r>
-      <w:r>
-        <w:rPr>
-          <w:rFonts w:ascii="Arial" w:hAnsi="Arial"/>
-          <w:sz w:val="20"/>
-        </w:rPr>
-        <w:t xml:space="preserve"> data JSON pada endpoint </w:t>
-      </w:r>
-      <w:r>
-        <w:rPr>
-          <w:rFonts w:ascii="Consolas" w:hAnsi="Consolas"/>
-          <w:sz w:val="19"/>
-        </w:rPr>
-        <w:t>http://192.168.2.2:6040/mavlink/vehicles/1/components/1/messages</w:t>
-      </w:r>
-      <w:r>
-        <w:rPr>
-          <w:rFonts w:ascii="Arial" w:hAnsi="Arial"/>
-          <w:sz w:val="20"/>
-        </w:rPr>
-        <w:t xml:space="preserve"> dengan batas waktu (</w:t>
-      </w:r>
-      <w:r>
-        <w:rPr>
-          <w:rFonts w:ascii="Arial" w:hAnsi="Arial"/>
-          <w:i/>
-          <w:sz w:val="20"/>
-        </w:rPr>
-        <w:t>timeout</w:t>
-      </w:r>
-      <w:r>
-        <w:rPr>
-          <w:rFonts w:ascii="Arial" w:hAnsi="Arial"/>
-          <w:sz w:val="20"/>
-        </w:rPr>
-        <w:t xml:space="preserve">) </w:t>
+        <w:t>data JSON pada endpoint `http://192.168.2.2:6040/mavlink/vehicles/1/components/1/messages` dengan batas waktu (</w:t>
+      </w:r>
+      <w:r>
+        <w:rPr>
+          <w:rFonts w:ascii="Arial" w:hAnsi="Arial"/>
+          <w:sz w:val="20"/>
+        </w:rPr>
+        <w:t xml:space="preserve">timeout) </w:t>
       </w:r>
       <w:r>
         <w:rPr>
@@ -13352,7 +12899,7 @@
       <w:r>
         <w:rPr>
           <w:rFonts w:ascii="Arial" w:hAnsi="Arial"/>
-          <w:b/>
+          <w:i/>
           <w:sz w:val="20"/>
         </w:rPr>
         <w:t>Pengekstrakkan Pesan MAVLink</w:t>
@@ -13675,7 +13222,7 @@
       <w:r>
         <w:rPr>
           <w:rFonts w:ascii="Arial" w:hAnsi="Arial"/>
-          <w:b/>
+          <w:i/>
           <w:sz w:val="20"/>
         </w:rPr>
         <w:t>Prapemrosesan Peningkatan Kontras Adaptif (CLAHE)</w:t>
@@ -13685,7 +13232,7 @@
           <w:rFonts w:ascii="Arial" w:hAnsi="Arial"/>
           <w:sz w:val="20"/>
         </w:rPr>
-        <w:t>: Citra RGB yang diterima didegradasi oleh partikel air dikonversi ke ruang warna CIE LAB. Saluran kecerahan (</w:t>
+        <w:t>: Citra RGB yang diterima didegradasi oleh partikel air dikonversi ke ruang warna CIE LAB. Saluran kecerahan (Luminance channel</w:t>
       </w:r>
       <w:r>
         <w:rPr>
@@ -13693,28 +13240,14 @@
           <w:i/>
           <w:sz w:val="20"/>
         </w:rPr>
-        <w:t>Luminance channel</w:t>
-      </w:r>
-      <w:r>
-        <w:rPr>
-          <w:rFonts w:ascii="Arial" w:hAnsi="Arial"/>
-          <w:sz w:val="20"/>
-        </w:rPr>
-        <w:t xml:space="preserve"> </w:t>
-      </w:r>
-      <w:r>
-        <w:rPr>
-          <w:rFonts w:ascii="Arial" w:hAnsi="Arial"/>
-          <w:sz w:val="20"/>
-        </w:rPr>
-        <w:t>$$L$$</w:t>
-      </w:r>
-      <w:r>
-        <w:rPr>
-          <w:rFonts w:ascii="Arial" w:hAnsi="Arial"/>
-          <w:sz w:val="20"/>
-        </w:rPr>
-        <w:t>) ditingkatkan menggunakan operator CLAHE (</w:t>
+        <w:t>$$L$$) ditingkatkan menggunakan operator CLAHE (</w:t>
+      </w:r>
+      <w:r>
+        <w:rPr>
+          <w:rFonts w:ascii="Arial" w:hAnsi="Arial"/>
+          <w:sz w:val="20"/>
+        </w:rPr>
+        <w:t>Contrast Limited Adaptive Histogram Equalization</w:t>
       </w:r>
       <w:r>
         <w:rPr>
@@ -13722,58 +13255,29 @@
           <w:i/>
           <w:sz w:val="20"/>
         </w:rPr>
-        <w:t>Contrast Limited Adaptive Histogram Equalization</w:t>
-      </w:r>
-      <w:r>
-        <w:rPr>
-          <w:rFonts w:ascii="Arial" w:hAnsi="Arial"/>
-          <w:sz w:val="20"/>
-        </w:rPr>
         <w:t>) dengan parameter ambang klip (</w:t>
       </w:r>
       <w:r>
         <w:rPr>
           <w:rFonts w:ascii="Arial" w:hAnsi="Arial"/>
+          <w:sz w:val="20"/>
+        </w:rPr>
+        <w:t>clip limit</w:t>
+      </w:r>
+      <w:r>
+        <w:rPr>
+          <w:rFonts w:ascii="Arial" w:hAnsi="Arial"/>
           <w:i/>
           <w:sz w:val="20"/>
         </w:rPr>
-        <w:t>clip limit</w:t>
-      </w:r>
-      <w:r>
-        <w:rPr>
-          <w:rFonts w:ascii="Arial" w:hAnsi="Arial"/>
-          <w:sz w:val="20"/>
-        </w:rPr>
-        <w:t xml:space="preserve">) </w:t>
-      </w:r>
-      <w:r>
-        <w:rPr>
-          <w:rFonts w:ascii="Arial" w:hAnsi="Arial"/>
-          <w:sz w:val="20"/>
-        </w:rPr>
-        <w:t>$$2.5$$</w:t>
-      </w:r>
-      <w:r>
-        <w:rPr>
-          <w:rFonts w:ascii="Arial" w:hAnsi="Arial"/>
-          <w:sz w:val="20"/>
-        </w:rPr>
-        <w:t xml:space="preserve"> dan ukuran kisi ubin (</w:t>
-      </w:r>
-      <w:r>
-        <w:rPr>
-          <w:rFonts w:ascii="Arial" w:hAnsi="Arial"/>
-          <w:i/>
-          <w:sz w:val="20"/>
-        </w:rPr>
-        <w:t>tile grid size</w:t>
-      </w:r>
-      <w:r>
-        <w:rPr>
-          <w:rFonts w:ascii="Arial" w:hAnsi="Arial"/>
-          <w:sz w:val="20"/>
-        </w:rPr>
-        <w:t xml:space="preserve">) </w:t>
+        <w:t>) $$2.5$$ dan ukuran kisi ubin (</w:t>
+      </w:r>
+      <w:r>
+        <w:rPr>
+          <w:rFonts w:ascii="Arial" w:hAnsi="Arial"/>
+          <w:sz w:val="20"/>
+        </w:rPr>
+        <w:t xml:space="preserve">tile grid size) </w:t>
       </w:r>
       <w:r>
         <w:rPr>
@@ -13868,22 +13372,7 @@
           <w:rFonts w:ascii="Arial" w:hAnsi="Arial"/>
           <w:sz w:val="20"/>
         </w:rPr>
-        <w:t>, lalu dikonversi kembali ke ruang warna BGR. Algoritma ini secara drastis meningkatkan ketajaman tepi (</w:t>
-      </w:r>
-      <w:r>
-        <w:rPr>
-          <w:rFonts w:ascii="Arial" w:hAnsi="Arial"/>
-          <w:i/>
-          <w:sz w:val="20"/>
-        </w:rPr>
-        <w:t>edge sharpness</w:t>
-      </w:r>
-      <w:r>
-        <w:rPr>
-          <w:rFonts w:ascii="Arial" w:hAnsi="Arial"/>
-          <w:sz w:val="20"/>
-        </w:rPr>
-        <w:t>) target bawah air dan menetralkan kabut warna hijau/biru tanpa memperkuat derau latar belakang [2].</w:t>
+        <w:t>, lalu dikonversi kembali ke ruang warna BGR. Algoritma ini secara drastis meningkatkan ketajaman tepi (edge sharpness) target bawah air dan menetralkan kabut warna hijau/biru tanpa memperkuat derau latar belakang [2].</w:t>
       </w:r>
     </w:p>
     <w:p>
@@ -13900,7 +13389,7 @@
       <w:r>
         <w:rPr>
           <w:rFonts w:ascii="Arial" w:hAnsi="Arial"/>
-          <w:b/>
+          <w:i/>
           <w:sz w:val="20"/>
         </w:rPr>
         <w:t>Inferensi Deteksi Objek YOLO26 World</w:t>
@@ -13910,7 +13399,7 @@
           <w:rFonts w:ascii="Arial" w:hAnsi="Arial"/>
           <w:sz w:val="20"/>
         </w:rPr>
-        <w:t xml:space="preserve">: Citra yang telah ditingkatkan diumpankan ke arsitektur jaringan syaraf tiruan </w:t>
+        <w:t>: Citra yang telah ditingkatkan diumpankan ke arsitektur jaringan syaraf tiruan YOLO26 World</w:t>
       </w:r>
       <w:r>
         <w:rPr>
@@ -13918,29 +13407,14 @@
           <w:i/>
           <w:sz w:val="20"/>
         </w:rPr>
-        <w:t>YOLO26 World</w:t>
-      </w:r>
-      <w:r>
-        <w:rPr>
-          <w:rFonts w:ascii="Arial" w:hAnsi="Arial"/>
-          <w:sz w:val="20"/>
-        </w:rPr>
-        <w:t xml:space="preserve"> (atau model kustom </w:t>
-      </w:r>
-      <w:r>
-        <w:rPr>
-          <w:rFonts w:ascii="Arial" w:hAnsi="Arial"/>
-          <w:i/>
-          <w:sz w:val="20"/>
-        </w:rPr>
-        <w:t>fine-tuned</w:t>
-      </w:r>
-      <w:r>
-        <w:rPr>
-          <w:rFonts w:ascii="Arial" w:hAnsi="Arial"/>
-          <w:sz w:val="20"/>
-        </w:rPr>
-        <w:t xml:space="preserve"> 11 kelas bawah air) pada resolusi spasial </w:t>
+        <w:t>(atau model kustom</w:t>
+      </w:r>
+      <w:r>
+        <w:rPr>
+          <w:rFonts w:ascii="Arial" w:hAnsi="Arial"/>
+          <w:sz w:val="20"/>
+        </w:rPr>
+        <w:t xml:space="preserve">fine-tuned 11 kelas bawah air) pada resolusi spasial </w:t>
       </w:r>
       <w:r>
         <w:rPr>
@@ -13961,7 +13435,7 @@
       <w:r>
         <w:rPr>
           <w:rFonts w:ascii="Arial" w:hAnsi="Arial"/>
-          <w:b/>
+          <w:i/>
           <w:sz w:val="20"/>
         </w:rPr>
         <w:t>bounding box</w:t>
@@ -13998,22 +13472,7 @@
           <w:rFonts w:ascii="Arial" w:hAnsi="Arial"/>
           <w:sz w:val="20"/>
         </w:rPr>
-        <w:t>beserta skor keyakinan deteksi (</w:t>
-      </w:r>
-      <w:r>
-        <w:rPr>
-          <w:rFonts w:ascii="Arial" w:hAnsi="Arial"/>
-          <w:i/>
-          <w:sz w:val="20"/>
-        </w:rPr>
-        <w:t xml:space="preserve">detection </w:t>
-      </w:r>
-      <w:r>
-        <w:rPr>
-          <w:rFonts w:ascii="Arial" w:hAnsi="Arial"/>
-          <w:sz w:val="20"/>
-        </w:rPr>
-        <w:t xml:space="preserve">confidence score**) </w:t>
+        <w:t xml:space="preserve">beserta skor keyakinan deteksi (detection confidence score) </w:t>
       </w:r>
       <w:r>
         <w:rPr>
@@ -14119,7 +13578,7 @@
       <w:r>
         <w:rPr>
           <w:rFonts w:ascii="Arial" w:hAnsi="Arial"/>
-          <w:b/>
+          <w:i/>
           <w:sz w:val="20"/>
         </w:rPr>
         <w:t>jitter</w:t>
@@ -14304,7 +13763,7 @@
       <w:r>
         <w:rPr>
           <w:rFonts w:ascii="Arial" w:hAnsi="Arial"/>
-          <w:b/>
+          <w:i/>
           <w:sz w:val="20"/>
         </w:rPr>
         <w:t>Continuous White Noise Acceleration</w:t>
@@ -14547,7 +14006,7 @@
       <w:r>
         <w:rPr>
           <w:rFonts w:ascii="Arial" w:hAnsi="Arial"/>
-          <w:b/>
+          <w:i/>
           <w:sz w:val="20"/>
         </w:rPr>
         <w:t>Validasi Inovasi Jarak Mahalanobis (</w:t>
@@ -14562,7 +14021,7 @@
       <w:r>
         <w:rPr>
           <w:rFonts w:ascii="Arial" w:hAnsi="Arial"/>
-          <w:b/>
+          <w:i/>
           <w:sz w:val="20"/>
         </w:rPr>
         <w:t>)</w:t>
@@ -14672,22 +14131,7 @@
           <w:rFonts w:ascii="Arial" w:hAnsi="Arial"/>
           <w:sz w:val="20"/>
         </w:rPr>
-        <w:t>Deteksi palsu yang melompat melebihi ambang batas ini secara otomatis ditolak (</w:t>
-      </w:r>
-      <w:r>
-        <w:rPr>
-          <w:rFonts w:ascii="Arial" w:hAnsi="Arial"/>
-          <w:i/>
-          <w:sz w:val="20"/>
-        </w:rPr>
-        <w:t>rejected</w:t>
-      </w:r>
-      <w:r>
-        <w:rPr>
-          <w:rFonts w:ascii="Arial" w:hAnsi="Arial"/>
-          <w:sz w:val="20"/>
-        </w:rPr>
-        <w:t>) untuk mencegah deviasi lintasan.</w:t>
+        <w:t>Deteksi palsu yang melompat melebihi ambang batas ini secara otomatis ditolak (rejected) untuk mencegah deviasi lintasan.</w:t>
       </w:r>
     </w:p>
     <w:p>
@@ -14707,13 +14151,6 @@
           <w:i/>
           <w:sz w:val="20"/>
         </w:rPr>
-      </w:r>
-      <w:r>
-        <w:rPr>
-          <w:rFonts w:ascii="Arial" w:hAnsi="Arial"/>
-          <w:i/>
-          <w:sz w:val="20"/>
-        </w:rPr>
         <w:t>Mekanisme Penjembatan Oklusi (</w:t>
       </w:r>
       <w:r>
@@ -14721,22 +14158,7 @@
           <w:rFonts w:ascii="Arial" w:hAnsi="Arial"/>
           <w:sz w:val="20"/>
         </w:rPr>
-        <w:t>Occlusion Bridging</w:t>
-      </w:r>
-      <w:r>
-        <w:rPr>
-          <w:rFonts w:ascii="Arial" w:hAnsi="Arial"/>
-          <w:i/>
-          <w:sz w:val="20"/>
-        </w:rPr>
-        <w:t>)</w:t>
-      </w:r>
-      <w:r>
-        <w:rPr>
-          <w:rFonts w:ascii="Arial" w:hAnsi="Arial"/>
-          <w:sz w:val="20"/>
-        </w:rPr>
-        <w:t>*:</w:t>
+        <w:t>Occlusion Bridging):</w:t>
       </w:r>
     </w:p>
     <w:p>
@@ -15161,7 +14583,7 @@
           <w:rFonts w:ascii="Arial" w:hAnsi="Arial"/>
           <w:sz w:val="20"/>
         </w:rPr>
-        <w:t>-\mathbf{M}^{-1}\left( \mathbf{C}^*(\hat{\boldsymbol{</w:t>
+        <w:t>-\mathbf{M}^{-1}\left( \mathbf{C}^(\hat{\boldsymbol{</w:t>
       </w:r>
     </w:p>
     <w:p>
@@ -15175,7 +14597,7 @@
           <w:rFonts w:ascii="Arial" w:hAnsi="Arial"/>
           <w:sz w:val="20"/>
         </w:rPr>
-        <w:t>u}}_r) + \mathbf{D}^*(\hat{\boldsymbol{</w:t>
+        <w:t>u}}_r) + \mathbf{D}^(\hat{\boldsymbol{</w:t>
       </w:r>
     </w:p>
     <w:p>
@@ -15265,7 +14687,7 @@
           <w:rFonts w:ascii="Arial" w:hAnsi="Arial"/>
           <w:sz w:val="20"/>
         </w:rPr>
-        <w:t>$$\mathbf{D}^*(\hat{\boldsymbol{</w:t>
+        <w:t>$$\mathbf{D}^(\hat{\boldsymbol{</w:t>
       </w:r>
     </w:p>
     <w:p>
@@ -15309,7 +14731,7 @@
           <w:rFonts w:ascii="Arial" w:hAnsi="Arial"/>
           <w:sz w:val="20"/>
         </w:rPr>
-        <w:t>dan suku kopling silang momen Munk terefleksikan pada baris ke-6 matriks $$\mathbf{C}^*(\hat{\boldsymbol{</w:t>
+        <w:t>dan suku kopling silang momen Munk terefleksikan pada baris ke-6 matriks $$\mathbf{C}^(\hat{\boldsymbol{</w:t>
       </w:r>
     </w:p>
     <w:p>
@@ -15340,7 +14762,7 @@
       <w:r>
         <w:rPr>
           <w:rFonts w:ascii="Arial" w:hAnsi="Arial"/>
-          <w:b/>
+          <w:i/>
           <w:sz w:val="20"/>
         </w:rPr>
         <w:t>Diskritisasi Matriks Fundamental Transisi</w:t>
@@ -15449,22 +14871,7 @@
           <w:rFonts w:ascii="Arial" w:hAnsi="Arial"/>
           <w:sz w:val="20"/>
         </w:rPr>
-        <w:t xml:space="preserve">Skenario ini bertujuan menguji akurasi pelacakan visual penapis </w:t>
-      </w:r>
-      <w:r>
-        <w:rPr>
-          <w:rFonts w:ascii="Arial" w:hAnsi="Arial"/>
-          <w:i/>
-          <w:sz w:val="20"/>
-        </w:rPr>
-        <w:t>AUVVisualKalmanFilter</w:t>
-      </w:r>
-      <w:r>
-        <w:rPr>
-          <w:rFonts w:ascii="Arial" w:hAnsi="Arial"/>
-          <w:sz w:val="20"/>
-        </w:rPr>
-        <w:t xml:space="preserve"> dalam meredam derau deteksi YOLO dan mempertahankan penjejakan target saat terjadi kehilangan deteksi visual sementara [2], [14], [25].</w:t>
+        <w:t>Skenario ini bertujuan menguji akurasi pelacakan visual penapis AUVVisualKalmanFilter dalam meredam derau deteksi YOLO dan mempertahankan penjejakan target saat terjadi kehilangan deteksi visual sementara [2], [14], [25].</w:t>
       </w:r>
     </w:p>
     <w:p>
@@ -15481,7 +14888,7 @@
       <w:r>
         <w:rPr>
           <w:rFonts w:ascii="Arial" w:hAnsi="Arial"/>
-          <w:b/>
+          <w:i/>
           <w:sz w:val="20"/>
         </w:rPr>
         <w:t>Prosedur Pengujian</w:t>
@@ -15510,22 +14917,7 @@
           <w:rFonts w:ascii="Arial" w:hAnsi="Arial"/>
           <w:sz w:val="20"/>
         </w:rPr>
-        <w:t xml:space="preserve">Wahana AUV diposisikan mengapung di depan target visual referensi (misalnya pelampung bawah air </w:t>
-      </w:r>
-      <w:r>
-        <w:rPr>
-          <w:rFonts w:ascii="Arial" w:hAnsi="Arial"/>
-          <w:i/>
-          <w:sz w:val="20"/>
-        </w:rPr>
-        <w:t>underwater buoy</w:t>
-      </w:r>
-      <w:r>
-        <w:rPr>
-          <w:rFonts w:ascii="Arial" w:hAnsi="Arial"/>
-          <w:sz w:val="20"/>
-        </w:rPr>
-        <w:t xml:space="preserve"> atau penanda berstruktur) pada jarak observasi nominal </w:t>
+        <w:t xml:space="preserve">Wahana AUV diposisikan mengapung di depan target visual referensi (misalnya pelampung bawah air underwater buoy atau penanda berstruktur) pada jarak observasi nominal </w:t>
       </w:r>
       <w:r>
         <w:rPr>
@@ -15605,7 +14997,7 @@
       <w:r>
         <w:rPr>
           <w:rFonts w:ascii="Arial" w:hAnsi="Arial"/>
-          <w:b/>
+          <w:i/>
           <w:sz w:val="20"/>
         </w:rPr>
         <w:t>Injeksi Derau Pengukuran Sintetis</w:t>
@@ -15681,7 +15073,7 @@
       <w:r>
         <w:rPr>
           <w:rFonts w:ascii="Arial" w:hAnsi="Arial"/>
-          <w:b/>
+          <w:i/>
           <w:sz w:val="20"/>
         </w:rPr>
         <w:t>Simulasi Oklusi Visual Temporer</w:t>
@@ -15768,27 +15160,12 @@
           <w:rFonts w:ascii="Arial" w:hAnsi="Arial"/>
           <w:sz w:val="20"/>
         </w:rPr>
-        <w:t>Sinyal trajektori hasil penapisan Kalman dibandingkan secara kuantitatif terhadap sinyal koordinat deteksi mentah (</w:t>
+        <w:t>Sinyal trajektori hasil penapisan Kalman dibandingkan secara kuantitatif terhadap sinyal koordinat deteksi mentah (raw YOLO detection) dan posisi kebenaran dasar (</w:t>
       </w:r>
       <w:r>
         <w:rPr>
           <w:rFonts w:ascii="Arial" w:hAnsi="Arial"/>
           <w:i/>
-          <w:sz w:val="20"/>
-        </w:rPr>
-        <w:t>raw YOLO detection</w:t>
-      </w:r>
-      <w:r>
-        <w:rPr>
-          <w:rFonts w:ascii="Arial" w:hAnsi="Arial"/>
-          <w:sz w:val="20"/>
-        </w:rPr>
-        <w:t>) dan posisi kebenaran dasar (</w:t>
-      </w:r>
-      <w:r>
-        <w:rPr>
-          <w:rFonts w:ascii="Arial" w:hAnsi="Arial"/>
-          <w:b/>
           <w:sz w:val="20"/>
         </w:rPr>
         <w:t>ground truth</w:t>
@@ -15825,22 +15202,7 @@
           <w:rFonts w:ascii="Arial" w:hAnsi="Arial"/>
           <w:sz w:val="20"/>
         </w:rPr>
-        <w:t xml:space="preserve">Skenario ini dirancang untuk memvalidasi performa penapis non-linier </w:t>
-      </w:r>
-      <w:r>
-        <w:rPr>
-          <w:rFonts w:ascii="Arial" w:hAnsi="Arial"/>
-          <w:i/>
-          <w:sz w:val="20"/>
-        </w:rPr>
-        <w:t>AUVDynamicsKalmanFilter</w:t>
-      </w:r>
-      <w:r>
-        <w:rPr>
-          <w:rFonts w:ascii="Arial" w:hAnsi="Arial"/>
-          <w:sz w:val="20"/>
-        </w:rPr>
-        <w:t xml:space="preserve"> dalam mengestimasi kecepatan relatif wahana terhadap fluida, mengamati kecepatan arus laut, serta mengevaluasi kompensasi aktif momen Munk hidrodinamika oleh sistem alokasi 8-pendorong [7], [21], [32], [34].</w:t>
+        <w:t>Skenario ini dirancang untuk memvalidasi performa penapis non-linier AUVDynamicsKalmanFilter dalam mengestimasi kecepatan relatif wahana terhadap fluida, mengamati kecepatan arus laut, serta mengevaluasi kompensasi aktif momen Munk hidrodinamika oleh sistem alokasi 8-pendorong [7], [21], [32], [34].</w:t>
       </w:r>
     </w:p>
     <w:p>
@@ -15857,7 +15219,7 @@
       <w:r>
         <w:rPr>
           <w:rFonts w:ascii="Arial" w:hAnsi="Arial"/>
-          <w:b/>
+          <w:i/>
           <w:sz w:val="20"/>
         </w:rPr>
         <w:t>Prosedur Pengujian</w:t>
@@ -15903,32 +15265,17 @@
       <w:r>
         <w:rPr>
           <w:rFonts w:ascii="Arial" w:hAnsi="Arial"/>
-          <w:b/>
-          <w:sz w:val="20"/>
-        </w:rPr>
-        <w:t>Uji Akselerasi Lurus (</w:t>
-      </w:r>
-      <w:r>
-        <w:rPr>
-          <w:rFonts w:ascii="Arial" w:hAnsi="Arial"/>
-          <w:sz w:val="20"/>
-        </w:rPr>
-        <w:t>Surge</w:t>
-      </w:r>
-      <w:r>
-        <w:rPr>
-          <w:rFonts w:ascii="Arial" w:hAnsi="Arial"/>
           <w:i/>
           <w:sz w:val="20"/>
         </w:rPr>
-        <w:t xml:space="preserve"> Acceleration</w:t>
-      </w:r>
-      <w:r>
-        <w:rPr>
-          <w:rFonts w:ascii="Arial" w:hAnsi="Arial"/>
-          <w:sz w:val="20"/>
-        </w:rPr>
-        <w:t xml:space="preserve">)**: Wahana dipercepat dari diam hingga mencapai kecepatan jelajah </w:t>
+        <w:t>Uji Akselerasi Lurus (Surge Acceleration)</w:t>
+      </w:r>
+      <w:r>
+        <w:rPr>
+          <w:rFonts w:ascii="Arial" w:hAnsi="Arial"/>
+          <w:sz w:val="20"/>
+        </w:rPr>
+        <w:t xml:space="preserve">: Wahana dipercepat dari diam hingga mencapai kecepatan jelajah </w:t>
       </w:r>
       <w:r>
         <w:rPr>
@@ -15964,36 +15311,14 @@
           <w:i/>
           <w:sz w:val="20"/>
         </w:rPr>
-      </w:r>
-      <w:r>
-        <w:rPr>
-          <w:rFonts w:ascii="Arial" w:hAnsi="Arial"/>
-          <w:i/>
-          <w:sz w:val="20"/>
-        </w:rPr>
-        <w:t>Uji Belok Terkopling (</w:t>
-      </w:r>
-      <w:r>
-        <w:rPr>
-          <w:rFonts w:ascii="Arial" w:hAnsi="Arial"/>
-          <w:sz w:val="20"/>
-        </w:rPr>
-        <w:t>Coupled Turning Circle</w:t>
-      </w:r>
-      <w:r>
-        <w:rPr>
-          <w:rFonts w:ascii="Arial" w:hAnsi="Arial"/>
-          <w:i/>
-          <w:sz w:val="20"/>
-        </w:rPr>
-        <w:t>)</w:t>
-      </w:r>
-      <w:r>
-        <w:rPr>
-          <w:rFonts w:ascii="Arial" w:hAnsi="Arial"/>
-          <w:sz w:val="20"/>
-        </w:rPr>
-        <w:t xml:space="preserve">*: Wahana diberi perintah kecepatan sudut yaw </w:t>
+        <w:t>Uji Belok Terkopling (Coupled Turning Circle)</w:t>
+      </w:r>
+      <w:r>
+        <w:rPr>
+          <w:rFonts w:ascii="Arial" w:hAnsi="Arial"/>
+          <w:sz w:val="20"/>
+        </w:rPr>
+        <w:t xml:space="preserve">: Wahana diberi perintah kecepatan sudut yaw </w:t>
       </w:r>
       <w:r>
         <w:rPr>
@@ -16045,61 +15370,30 @@
           <w:i/>
           <w:sz w:val="20"/>
         </w:rPr>
-      </w:r>
-      <w:r>
-        <w:rPr>
-          <w:rFonts w:ascii="Arial" w:hAnsi="Arial"/>
-          <w:i/>
-          <w:sz w:val="20"/>
-        </w:rPr>
-        <w:t>Uji Stabilitas Pitch Aktif (</w:t>
-      </w:r>
-      <w:r>
-        <w:rPr>
-          <w:rFonts w:ascii="Arial" w:hAnsi="Arial"/>
-          <w:sz w:val="20"/>
-        </w:rPr>
-        <w:t xml:space="preserve">Active </w:t>
-      </w:r>
-      <w:r>
-        <w:rPr>
-          <w:rFonts w:ascii="Arial" w:hAnsi="Arial"/>
-          <w:i/>
-          <w:sz w:val="20"/>
-        </w:rPr>
-        <w:t>Pitch-Hold</w:t>
-      </w:r>
-      <w:r>
-        <w:rPr>
-          <w:rFonts w:ascii="Arial" w:hAnsi="Arial"/>
-          <w:sz w:val="20"/>
-        </w:rPr>
-        <w:t xml:space="preserve"> Tracking</w:t>
-      </w:r>
-      <w:r>
-        <w:rPr>
-          <w:rFonts w:ascii="Arial" w:hAnsi="Arial"/>
-          <w:i/>
-          <w:sz w:val="20"/>
-        </w:rPr>
-        <w:t>)</w:t>
-      </w:r>
-      <w:r>
-        <w:rPr>
-          <w:rFonts w:ascii="Arial" w:hAnsi="Arial"/>
-          <w:i/>
-          <w:sz w:val="20"/>
-        </w:rPr>
-        <w:t>: Wahana diarahkan mempertahankan sudut tukik tertentu ($$</w:t>
+        <w:t>Uji Stabilitas Pitch Aktif (Active Pitch-Hold Tracking)</w:t>
+      </w:r>
+      <w:r>
+        <w:rPr>
+          <w:rFonts w:ascii="Arial" w:hAnsi="Arial"/>
+          <w:sz w:val="20"/>
+        </w:rPr>
+        <w:t>: Wahana diarahkan mempertahankan sudut tukik tertentu (</w:t>
+      </w:r>
+      <w:r>
+        <w:rPr>
+          <w:rFonts w:ascii="Arial" w:hAnsi="Arial"/>
+          <w:sz w:val="20"/>
+        </w:rPr>
+        <w:t>$$</w:t>
         <w:tab/>
-        <w:t>heta = -15^\circ$$) untuk inspeksi dasar perairan sembari bermanuver melintang (</w:t>
-      </w:r>
-      <w:r>
-        <w:rPr>
-          <w:rFonts w:ascii="Arial" w:hAnsi="Arial"/>
-          <w:sz w:val="20"/>
-        </w:rPr>
-        <w:t>swaying*).</w:t>
+        <w:t>heta = -15^\circ$$</w:t>
+      </w:r>
+      <w:r>
+        <w:rPr>
+          <w:rFonts w:ascii="Arial" w:hAnsi="Arial"/>
+          <w:sz w:val="20"/>
+        </w:rPr>
+        <w:t>) untuk inspeksi dasar perairan sembari bermanuver melintang (swaying).</w:t>
       </w:r>
     </w:p>
     <w:p>
@@ -16119,13 +15413,6 @@
           <w:i/>
           <w:sz w:val="20"/>
         </w:rPr>
-      </w:r>
-      <w:r>
-        <w:rPr>
-          <w:rFonts w:ascii="Arial" w:hAnsi="Arial"/>
-          <w:i/>
-          <w:sz w:val="20"/>
-        </w:rPr>
         <w:t>Injeksi Gangguan Arus Laut (</w:t>
       </w:r>
       <w:r>
@@ -16133,22 +15420,7 @@
           <w:rFonts w:ascii="Arial" w:hAnsi="Arial"/>
           <w:sz w:val="20"/>
         </w:rPr>
-        <w:t>Ocean Current Disturbance</w:t>
-      </w:r>
-      <w:r>
-        <w:rPr>
-          <w:rFonts w:ascii="Arial" w:hAnsi="Arial"/>
-          <w:i/>
-          <w:sz w:val="20"/>
-        </w:rPr>
-        <w:t>)</w:t>
-      </w:r>
-      <w:r>
-        <w:rPr>
-          <w:rFonts w:ascii="Arial" w:hAnsi="Arial"/>
-          <w:sz w:val="20"/>
-        </w:rPr>
-        <w:t>*: Pada detik ke-</w:t>
+        <w:t>Ocean Current Disturbance): Pada detik ke-</w:t>
       </w:r>
       <w:r>
         <w:rPr>
@@ -16306,7 +15578,7 @@
       <w:r>
         <w:rPr>
           <w:rFonts w:ascii="Arial" w:hAnsi="Arial"/>
-          <w:b/>
+          <w:i/>
           <w:sz w:val="20"/>
         </w:rPr>
         <w:t>underactuated</w:t>
@@ -16329,24 +15601,7 @@
           <w:b/>
           <w:sz w:val="20"/>
         </w:rPr>
-        <w:t>3.6.3 Skenario 3: Analisis Waktu Komputasi dan Latensi Waktu Nyata (*</w:t>
-      </w:r>
-      <w:r>
-        <w:rPr>
-          <w:rFonts w:ascii="Arial" w:hAnsi="Arial"/>
-          <w:b/>
-          <w:i/>
-          <w:sz w:val="20"/>
-        </w:rPr>
-        <w:t>Real-Time</w:t>
-      </w:r>
-      <w:r>
-        <w:rPr>
-          <w:rFonts w:ascii="Arial" w:hAnsi="Arial"/>
-          <w:b/>
-          <w:sz w:val="20"/>
-        </w:rPr>
-        <w:t xml:space="preserve"> Profiling*)</w:t>
+        <w:t>3.6.3 Skenario 3: Analisis Waktu Komputasi dan Latensi Waktu Nyata (Real-Time Profiling)</w:t>
       </w:r>
     </w:p>
     <w:p>
@@ -16368,14 +15623,14 @@
           <w:i/>
           <w:sz w:val="20"/>
         </w:rPr>
-        <w:t>topside GPU</w:t>
-      </w:r>
-      <w:r>
-        <w:rPr>
-          <w:rFonts w:ascii="Arial" w:hAnsi="Arial"/>
-          <w:sz w:val="20"/>
-        </w:rPr>
-        <w:t xml:space="preserve"> dan *</w:t>
+        <w:t>topside GPU dan</w:t>
+      </w:r>
+      <w:r>
+        <w:rPr>
+          <w:rFonts w:ascii="Arial" w:hAnsi="Arial"/>
+          <w:sz w:val="20"/>
+        </w:rPr>
+        <w:t>companion computer</w:t>
       </w:r>
       <w:r>
         <w:rPr>
@@ -16383,14 +15638,14 @@
           <w:i/>
           <w:sz w:val="20"/>
         </w:rPr>
-        <w:t>companion computer</w:t>
-      </w:r>
-      <w:r>
-        <w:rPr>
-          <w:rFonts w:ascii="Arial" w:hAnsi="Arial"/>
-          <w:sz w:val="20"/>
-        </w:rPr>
-        <w:t xml:space="preserve"> ARM</w:t>
+        <w:t>ARM</w:t>
+      </w:r>
+      <w:r>
+        <w:rPr>
+          <w:rFonts w:ascii="Arial" w:hAnsi="Arial"/>
+          <w:sz w:val="20"/>
+        </w:rPr>
+        <w:t>) agar memenuhi standar operasi deterministik tanpa keterlambatan (</w:t>
       </w:r>
       <w:r>
         <w:rPr>
@@ -16398,29 +15653,14 @@
           <w:i/>
           <w:sz w:val="20"/>
         </w:rPr>
-        <w:t>) agar memenuhi standar operasi deterministik tanpa keterlambatan (</w:t>
-      </w:r>
-      <w:r>
-        <w:rPr>
-          <w:rFonts w:ascii="Arial" w:hAnsi="Arial"/>
-          <w:sz w:val="20"/>
-        </w:rPr>
-        <w:t xml:space="preserve">zero-lag </w:t>
-      </w:r>
-      <w:r>
-        <w:rPr>
-          <w:rFonts w:ascii="Arial" w:hAnsi="Arial"/>
-          <w:i/>
-          <w:sz w:val="20"/>
-        </w:rPr>
-        <w:t>real-time</w:t>
-      </w:r>
-      <w:r>
-        <w:rPr>
-          <w:rFonts w:ascii="Arial" w:hAnsi="Arial"/>
-          <w:sz w:val="20"/>
-        </w:rPr>
-        <w:t xml:space="preserve"> constraint*) pada laju penyegaran </w:t>
+        <w:t>zero-lag</w:t>
+      </w:r>
+      <w:r>
+        <w:rPr>
+          <w:rFonts w:ascii="Arial" w:hAnsi="Arial"/>
+          <w:sz w:val="20"/>
+        </w:rPr>
+        <w:t xml:space="preserve">real-time constraint) pada laju penyegaran </w:t>
       </w:r>
       <w:r>
         <w:rPr>
@@ -16469,7 +15709,7 @@
       <w:r>
         <w:rPr>
           <w:rFonts w:ascii="Arial" w:hAnsi="Arial"/>
-          <w:b/>
+          <w:i/>
           <w:sz w:val="20"/>
         </w:rPr>
         <w:t>Prosedur Pengujian</w:t>
@@ -16498,22 +15738,7 @@
           <w:rFonts w:ascii="Arial" w:hAnsi="Arial"/>
           <w:sz w:val="20"/>
         </w:rPr>
-        <w:t xml:space="preserve">Menggunakan modul pewaktu presisi tinggi </w:t>
-      </w:r>
-      <w:r>
-        <w:rPr>
-          <w:rFonts w:ascii="Arial" w:hAnsi="Arial"/>
-          <w:i/>
-          <w:sz w:val="20"/>
-        </w:rPr>
-        <w:t>hardware timer</w:t>
-      </w:r>
-      <w:r>
-        <w:rPr>
-          <w:rFonts w:ascii="Arial" w:hAnsi="Arial"/>
-          <w:sz w:val="20"/>
-        </w:rPr>
-        <w:t xml:space="preserve"> Python (</w:t>
+        <w:t>Menggunakan modul pewaktu presisi tinggi hardware timer Python (</w:t>
       </w:r>
       <w:r>
         <w:rPr>
@@ -16736,19 +15961,11 @@
           <w:i/>
           <w:sz w:val="20"/>
         </w:rPr>
-        <w:t>mean execution time</w:t>
-      </w:r>
-      <w:r>
-        <w:rPr>
-          <w:rFonts w:ascii="Arial" w:hAnsi="Arial"/>
-          <w:sz w:val="20"/>
-        </w:rPr>
-        <w:t>), deviasi standar (</w:t>
-      </w:r>
-      <w:r>
-        <w:rPr>
-          <w:rFonts w:ascii="Arial" w:hAnsi="Arial"/>
-          <w:b/>
+        <w:t>mean execution time), deviasi standar (</w:t>
+      </w:r>
+      <w:r>
+        <w:rPr>
+          <w:rFonts w:ascii="Arial" w:hAnsi="Arial"/>
           <w:sz w:val="20"/>
         </w:rPr>
         <w:t>jitter</w:t>
@@ -16756,6 +15973,7 @@
       <w:r>
         <w:rPr>
           <w:rFonts w:ascii="Arial" w:hAnsi="Arial"/>
+          <w:i/>
           <w:sz w:val="20"/>
         </w:rPr>
         <w:t>), dan waktu eksekusi terburuk (</w:t>
@@ -16763,17 +15981,9 @@
       <w:r>
         <w:rPr>
           <w:rFonts w:ascii="Arial" w:hAnsi="Arial"/>
-          <w:b/>
-          <w:sz w:val="20"/>
-        </w:rPr>
-        <w:t>worst-case execution time</w:t>
-      </w:r>
-      <w:r>
-        <w:rPr>
-          <w:rFonts w:ascii="Arial" w:hAnsi="Arial"/>
-          <w:sz w:val="20"/>
-        </w:rPr>
-        <w:t xml:space="preserve"> / WCET).</w:t>
+          <w:sz w:val="20"/>
+        </w:rPr>
+        <w:t>worst-case execution time / WCET).</w:t>
       </w:r>
     </w:p>
     <w:p>
@@ -16813,24 +16023,7 @@
           <w:b/>
           <w:sz w:val="20"/>
         </w:rPr>
-        <w:t xml:space="preserve">1. </w:t>
-      </w:r>
-      <w:r>
-        <w:rPr>
-          <w:rFonts w:ascii="Arial" w:hAnsi="Arial"/>
-          <w:b/>
-          <w:i/>
-          <w:sz w:val="20"/>
-        </w:rPr>
-        <w:t>Root Mean Square Error</w:t>
-      </w:r>
-      <w:r>
-        <w:rPr>
-          <w:rFonts w:ascii="Arial" w:hAnsi="Arial"/>
-          <w:b/>
-          <w:sz w:val="20"/>
-        </w:rPr>
-        <w:t xml:space="preserve"> (RMSE)</w:t>
+        <w:t>1. Root Mean Square Error (RMSE)</w:t>
       </w:r>
     </w:p>
     <w:p>
@@ -16849,7 +16042,7 @@
       <w:r>
         <w:rPr>
           <w:rFonts w:ascii="Arial" w:hAnsi="Arial"/>
-          <w:b/>
+          <w:i/>
           <w:sz w:val="20"/>
         </w:rPr>
         <w:t>ground truth</w:t>
@@ -16904,24 +16097,7 @@
           <w:b/>
           <w:sz w:val="20"/>
         </w:rPr>
-        <w:t xml:space="preserve">2. </w:t>
-      </w:r>
-      <w:r>
-        <w:rPr>
-          <w:rFonts w:ascii="Arial" w:hAnsi="Arial"/>
-          <w:b/>
-          <w:i/>
-          <w:sz w:val="20"/>
-        </w:rPr>
-        <w:t>Mean Absolute Error</w:t>
-      </w:r>
-      <w:r>
-        <w:rPr>
-          <w:rFonts w:ascii="Arial" w:hAnsi="Arial"/>
-          <w:b/>
-          <w:sz w:val="20"/>
-        </w:rPr>
-        <w:t xml:space="preserve"> (MAE)</w:t>
+        <w:t>2. Mean Absolute Error (MAE)</w:t>
       </w:r>
     </w:p>
     <w:p>
@@ -16940,7 +16116,7 @@
       <w:r>
         <w:rPr>
           <w:rFonts w:ascii="Arial" w:hAnsi="Arial"/>
-          <w:b/>
+          <w:i/>
           <w:sz w:val="20"/>
         </w:rPr>
         <w:t>outliers</w:t>
@@ -16995,24 +16171,7 @@
           <w:b/>
           <w:sz w:val="20"/>
         </w:rPr>
-        <w:t xml:space="preserve">3. </w:t>
-      </w:r>
-      <w:r>
-        <w:rPr>
-          <w:rFonts w:ascii="Arial" w:hAnsi="Arial"/>
-          <w:b/>
-          <w:i/>
-          <w:sz w:val="20"/>
-        </w:rPr>
-        <w:t>Tracking Success Rate</w:t>
-      </w:r>
-      <w:r>
-        <w:rPr>
-          <w:rFonts w:ascii="Arial" w:hAnsi="Arial"/>
-          <w:b/>
-          <w:sz w:val="20"/>
-        </w:rPr>
-        <w:t xml:space="preserve"> (TSR)</w:t>
+        <w:t>3. Tracking Success Rate (TSR)</w:t>
       </w:r>
     </w:p>
     <w:p>
@@ -17109,24 +16268,7 @@
           <w:b/>
           <w:sz w:val="20"/>
         </w:rPr>
-        <w:t>4. Waktu Pemulihan Oklusi (</w:t>
-      </w:r>
-      <w:r>
-        <w:rPr>
-          <w:rFonts w:ascii="Arial" w:hAnsi="Arial"/>
-          <w:b/>
-          <w:i/>
-          <w:sz w:val="20"/>
-        </w:rPr>
-        <w:t>Occlusion Recovery Time</w:t>
-      </w:r>
-      <w:r>
-        <w:rPr>
-          <w:rFonts w:ascii="Arial" w:hAnsi="Arial"/>
-          <w:b/>
-          <w:sz w:val="20"/>
-        </w:rPr>
-        <w:t xml:space="preserve"> / </w:t>
+        <w:t xml:space="preserve">4. Waktu Pemulihan Oklusi (Occlusion Recovery Time / </w:t>
       </w:r>
       <w:r>
         <w:rPr>
@@ -17206,7 +16348,7 @@
       <w:r>
         <w:rPr>
           <w:rFonts w:ascii="Arial" w:hAnsi="Arial"/>
-          <w:b/>
+          <w:i/>
           <w:sz w:val="20"/>
         </w:rPr>
         <w:t>[1]</w:t>
@@ -17216,22 +16358,7 @@
           <w:rFonts w:ascii="Arial" w:hAnsi="Arial"/>
           <w:sz w:val="20"/>
         </w:rPr>
-        <w:t xml:space="preserve"> Ahmed, F., Xiang, X., Jiang, C., &amp; Wang, Y. (2023). </w:t>
-      </w:r>
-      <w:r>
-        <w:rPr>
-          <w:rFonts w:ascii="Arial" w:hAnsi="Arial"/>
-          <w:i/>
-          <w:sz w:val="20"/>
-        </w:rPr>
-        <w:t>Survey on Traditional and AI-Based Estimation Techniques for Hydrodynamic Coefficients of Autonomous Underwater Vehicle</w:t>
-      </w:r>
-      <w:r>
-        <w:rPr>
-          <w:rFonts w:ascii="Arial" w:hAnsi="Arial"/>
-          <w:sz w:val="20"/>
-        </w:rPr>
-        <w:t>. Ocean Engineering, 268, 113300. https://doi.org/10.1016/j.oceaneng.2023.113300</w:t>
+        <w:t xml:space="preserve"> Ahmed, F., Xiang, X., Jiang, C., &amp; Wang, Y. (2023). Survey on Traditional and AI-Based Estimation Techniques for Hydrodynamic Coefficients of Autonomous Underwater Vehicle. Ocean Engineering, 268, 113300. https://doi.org/10.1016/j.oceaneng.2023.113300</w:t>
       </w:r>
     </w:p>
     <w:p>
@@ -17248,7 +16375,7 @@
       <w:r>
         <w:rPr>
           <w:rFonts w:ascii="Arial" w:hAnsi="Arial"/>
-          <w:b/>
+          <w:i/>
           <w:sz w:val="20"/>
         </w:rPr>
         <w:t>[2]</w:t>
@@ -17258,22 +16385,7 @@
           <w:rFonts w:ascii="Arial" w:hAnsi="Arial"/>
           <w:sz w:val="20"/>
         </w:rPr>
-        <w:t xml:space="preserve"> Alinei-Poiană, T., Rețe, D., Martinovici, D., Maer, V. M., &amp; Bușoniu, L. (2024). </w:t>
-      </w:r>
-      <w:r>
-        <w:rPr>
-          <w:rFonts w:ascii="Arial" w:hAnsi="Arial"/>
-          <w:i/>
-          <w:sz w:val="20"/>
-        </w:rPr>
-        <w:t>A BlueROV2-Based Platform for Underwater Mapping Experiments</w:t>
-      </w:r>
-      <w:r>
-        <w:rPr>
-          <w:rFonts w:ascii="Arial" w:hAnsi="Arial"/>
-          <w:sz w:val="20"/>
-        </w:rPr>
-        <w:t>. IFAC-PapersOnLine, 58(20), 470–475. https://doi.org/10.1016/j.ifacol.2024.10.098</w:t>
+        <w:t xml:space="preserve"> Alinei-Poiană, T., Rețe, D., Martinovici, D., Maer, V. M., &amp; Bușoniu, L. (2024). A BlueROV2-Based Platform for Underwater Mapping Experiments. IFAC-PapersOnLine, 58(20), 470–475. https://doi.org/10.1016/j.ifacol.2024.10.098</w:t>
       </w:r>
     </w:p>
     <w:p>
@@ -17290,7 +16402,7 @@
       <w:r>
         <w:rPr>
           <w:rFonts w:ascii="Arial" w:hAnsi="Arial"/>
-          <w:b/>
+          <w:i/>
           <w:sz w:val="20"/>
         </w:rPr>
         <w:t>[3]</w:t>
@@ -17300,22 +16412,7 @@
           <w:rFonts w:ascii="Arial" w:hAnsi="Arial"/>
           <w:sz w:val="20"/>
         </w:rPr>
-        <w:t xml:space="preserve"> Blue Robotics (2024). </w:t>
-      </w:r>
-      <w:r>
-        <w:rPr>
-          <w:rFonts w:ascii="Arial" w:hAnsi="Arial"/>
-          <w:i/>
-          <w:sz w:val="20"/>
-        </w:rPr>
-        <w:t>BlueROV2 Heavy Configuration Retrofit Operating Guide and Technical Specifications</w:t>
-      </w:r>
-      <w:r>
-        <w:rPr>
-          <w:rFonts w:ascii="Arial" w:hAnsi="Arial"/>
-          <w:sz w:val="20"/>
-        </w:rPr>
-        <w:t>. Blue Robotics Inc., Torrance, CA, USA.</w:t>
+        <w:t xml:space="preserve"> Blue Robotics (2024). BlueROV2 Heavy Configuration Retrofit Operating Guide and Technical Specifications. Blue Robotics Inc., Torrance, CA, USA.</w:t>
       </w:r>
     </w:p>
     <w:p>
@@ -17332,7 +16429,7 @@
       <w:r>
         <w:rPr>
           <w:rFonts w:ascii="Arial" w:hAnsi="Arial"/>
-          <w:b/>
+          <w:i/>
           <w:sz w:val="20"/>
         </w:rPr>
         <w:t>[4]</w:t>
@@ -17342,22 +16439,7 @@
           <w:rFonts w:ascii="Arial" w:hAnsi="Arial"/>
           <w:sz w:val="20"/>
         </w:rPr>
-        <w:t xml:space="preserve"> de Moraes, C. C., Faltinsen, O. M., Esperança, P. T. T., Sphaier, S. H., &amp; Lugni, C. (2025). </w:t>
-      </w:r>
-      <w:r>
-        <w:rPr>
-          <w:rFonts w:ascii="Arial" w:hAnsi="Arial"/>
-          <w:i/>
-          <w:sz w:val="20"/>
-        </w:rPr>
-        <w:t>Free-Surface Interaction of a Fully Appendaged AUV: An Experimental Study Using the Planar Motion Mechanism Method for Calculating Hydrodynamic Coefficients</w:t>
-      </w:r>
-      <w:r>
-        <w:rPr>
-          <w:rFonts w:ascii="Arial" w:hAnsi="Arial"/>
-          <w:sz w:val="20"/>
-        </w:rPr>
-        <w:t>. Ocean Engineering, 324, 120562. https://doi.org/10.1016/j.oceaneng.2025.120562</w:t>
+        <w:t xml:space="preserve"> de Moraes, C. C., Faltinsen, O. M., Esperança, P. T. T., Sphaier, S. H., &amp; Lugni, C. (2025). Free-Surface Interaction of a Fully Appendaged AUV: An Experimental Study Using the Planar Motion Mechanism Method for Calculating Hydrodynamic Coefficients. Ocean Engineering, 324, 120562. https://doi.org/10.1016/j.oceaneng.2025.120562</w:t>
       </w:r>
     </w:p>
     <w:p>
@@ -17374,7 +16456,7 @@
       <w:r>
         <w:rPr>
           <w:rFonts w:ascii="Arial" w:hAnsi="Arial"/>
-          <w:b/>
+          <w:i/>
           <w:sz w:val="20"/>
         </w:rPr>
         <w:t>[5]</w:t>
@@ -17384,22 +16466,7 @@
           <w:rFonts w:ascii="Arial" w:hAnsi="Arial"/>
           <w:sz w:val="20"/>
         </w:rPr>
-        <w:t xml:space="preserve"> Det Norske Veritas (DNV) (2021). </w:t>
-      </w:r>
-      <w:r>
-        <w:rPr>
-          <w:rFonts w:ascii="Arial" w:hAnsi="Arial"/>
-          <w:i/>
-          <w:sz w:val="20"/>
-        </w:rPr>
-        <w:t>Environmental Conditions and Environmental Loads / Modelling and Analysis of Marine Operations</w:t>
-      </w:r>
-      <w:r>
-        <w:rPr>
-          <w:rFonts w:ascii="Arial" w:hAnsi="Arial"/>
-          <w:sz w:val="20"/>
-        </w:rPr>
-        <w:t>. Recommended Practice DNVGL-RP-N103, Oslo, Norway.</w:t>
+        <w:t xml:space="preserve"> Det Norske Veritas (DNV) (2021). Environmental Conditions and Environmental Loads / Modelling and Analysis of Marine Operations. Recommended Practice DNVGL-RP-N103, Oslo, Norway.</w:t>
       </w:r>
     </w:p>
     <w:p>
@@ -17416,7 +16483,7 @@
       <w:r>
         <w:rPr>
           <w:rFonts w:ascii="Arial" w:hAnsi="Arial"/>
-          <w:b/>
+          <w:i/>
           <w:sz w:val="20"/>
         </w:rPr>
         <w:t>[6]</w:t>
@@ -17426,22 +16493,7 @@
           <w:rFonts w:ascii="Arial" w:hAnsi="Arial"/>
           <w:sz w:val="20"/>
         </w:rPr>
-        <w:t xml:space="preserve"> Fan, Y., Dong, H., Zhao, X., &amp; Denissenko, P. (2024). </w:t>
-      </w:r>
-      <w:r>
-        <w:rPr>
-          <w:rFonts w:ascii="Arial" w:hAnsi="Arial"/>
-          <w:i/>
-          <w:sz w:val="20"/>
-        </w:rPr>
-        <w:t>Path-Following Control of Unmanned Underwater Vehicle Based on an Improved TD3 Deep Reinforcement Learning</w:t>
-      </w:r>
-      <w:r>
-        <w:rPr>
-          <w:rFonts w:ascii="Arial" w:hAnsi="Arial"/>
-          <w:sz w:val="20"/>
-        </w:rPr>
-        <w:t>. IEEE Transactions on Control Systems Technology, 32(5), 1904–1919. https://doi.org/10.1109/TCST.2024.3382741</w:t>
+        <w:t xml:space="preserve"> Fan, Y., Dong, H., Zhao, X., &amp; Denissenko, P. (2024). Path-Following Control of Unmanned Underwater Vehicle Based on an Improved TD3 Deep Reinforcement Learning. IEEE Transactions on Control Systems Technology, 32(5), 1904–1919. https://doi.org/10.1109/TCST.2024.3382741</w:t>
       </w:r>
     </w:p>
     <w:p>
@@ -17458,7 +16510,7 @@
       <w:r>
         <w:rPr>
           <w:rFonts w:ascii="Arial" w:hAnsi="Arial"/>
-          <w:b/>
+          <w:i/>
           <w:sz w:val="20"/>
         </w:rPr>
         <w:t>[7]</w:t>
@@ -17468,22 +16520,7 @@
           <w:rFonts w:ascii="Arial" w:hAnsi="Arial"/>
           <w:sz w:val="20"/>
         </w:rPr>
-        <w:t xml:space="preserve"> Fossen, T. I. (2021). </w:t>
-      </w:r>
-      <w:r>
-        <w:rPr>
-          <w:rFonts w:ascii="Arial" w:hAnsi="Arial"/>
-          <w:i/>
-          <w:sz w:val="20"/>
-        </w:rPr>
-        <w:t>Handbook of Marine Craft Hydrodynamics and Motion Control</w:t>
-      </w:r>
-      <w:r>
-        <w:rPr>
-          <w:rFonts w:ascii="Arial" w:hAnsi="Arial"/>
-          <w:sz w:val="20"/>
-        </w:rPr>
-        <w:t>. John Wiley &amp; Sons, 2nd Edition, Hoboken, NJ, USA.</w:t>
+        <w:t xml:space="preserve"> Fossen, T. I. (2021). Handbook of Marine Craft Hydrodynamics and Motion Control. John Wiley &amp; Sons, 2nd Edition, Hoboken, NJ, USA.</w:t>
       </w:r>
     </w:p>
     <w:p>
@@ -17500,7 +16537,7 @@
       <w:r>
         <w:rPr>
           <w:rFonts w:ascii="Arial" w:hAnsi="Arial"/>
-          <w:b/>
+          <w:i/>
           <w:sz w:val="20"/>
         </w:rPr>
         <w:t>[8]</w:t>
@@ -17510,22 +16547,7 @@
           <w:rFonts w:ascii="Arial" w:hAnsi="Arial"/>
           <w:sz w:val="20"/>
         </w:rPr>
-        <w:t xml:space="preserve"> Franchi, M., Ridolfi, A., &amp; Allotta, B. (2022). </w:t>
-      </w:r>
-      <w:r>
-        <w:rPr>
-          <w:rFonts w:ascii="Arial" w:hAnsi="Arial"/>
-          <w:i/>
-          <w:sz w:val="20"/>
-        </w:rPr>
-        <w:t>Tethered Multi-Robot Systems in Marine Environments: A Review</w:t>
-      </w:r>
-      <w:r>
-        <w:rPr>
-          <w:rFonts w:ascii="Arial" w:hAnsi="Arial"/>
-          <w:sz w:val="20"/>
-        </w:rPr>
-        <w:t>. Current Robotics Reports, 3(4), 229–239. https://doi.org/10.1007/s43154-022-00091-x</w:t>
+        <w:t xml:space="preserve"> Franchi, M., Ridolfi, A., &amp; Allotta, B. (2022). Tethered Multi-Robot Systems in Marine Environments: A Review. Current Robotics Reports, 3(4), 229–239. https://doi.org/10.1007/s43154-022-00091-x</w:t>
       </w:r>
     </w:p>
     <w:p>
@@ -17542,7 +16564,7 @@
       <w:r>
         <w:rPr>
           <w:rFonts w:ascii="Arial" w:hAnsi="Arial"/>
-          <w:b/>
+          <w:i/>
           <w:sz w:val="20"/>
         </w:rPr>
         <w:t>[9]</w:t>
@@ -17552,22 +16574,7 @@
           <w:rFonts w:ascii="Arial" w:hAnsi="Arial"/>
           <w:sz w:val="20"/>
         </w:rPr>
-        <w:t xml:space="preserve"> Gaggero, P., Corradini, F., &amp; Fossen, T. I. (2024). </w:t>
-      </w:r>
-      <w:r>
-        <w:rPr>
-          <w:rFonts w:ascii="Arial" w:hAnsi="Arial"/>
-          <w:i/>
-          <w:sz w:val="20"/>
-        </w:rPr>
-        <w:t>Tracking Data of a Remotely Operated Vehicle and Its Tether Using a Motion Capture System and a Tension Sensor</w:t>
-      </w:r>
-      <w:r>
-        <w:rPr>
-          <w:rFonts w:ascii="Arial" w:hAnsi="Arial"/>
-          <w:sz w:val="20"/>
-        </w:rPr>
-        <w:t>. Scientific Data, 11, 482. https://doi.org/10.1038/s41597-024-03297-7</w:t>
+        <w:t xml:space="preserve"> Gaggero, P., Corradini, F., &amp; Fossen, T. I. (2024). Tracking Data of a Remotely Operated Vehicle and Its Tether Using a Motion Capture System and a Tension Sensor. Scientific Data, 11, 482. https://doi.org/10.1038/s41597-024-03297-7</w:t>
       </w:r>
     </w:p>
     <w:p>
@@ -17584,7 +16591,7 @@
       <w:r>
         <w:rPr>
           <w:rFonts w:ascii="Arial" w:hAnsi="Arial"/>
-          <w:b/>
+          <w:i/>
           <w:sz w:val="20"/>
         </w:rPr>
         <w:t>[11]</w:t>
@@ -17594,22 +16601,7 @@
           <w:rFonts w:ascii="Arial" w:hAnsi="Arial"/>
           <w:sz w:val="20"/>
         </w:rPr>
-        <w:t xml:space="preserve"> Gieraths, M., Kuchelmeister, F., &amp; Albiez, J. (2023). </w:t>
-      </w:r>
-      <w:r>
-        <w:rPr>
-          <w:rFonts w:ascii="Arial" w:hAnsi="Arial"/>
-          <w:i/>
-          <w:sz w:val="20"/>
-        </w:rPr>
-        <w:t>Modular Hardware Architecture for the Development of Underwater Vehicles Based on Systems Engineering</w:t>
-      </w:r>
-      <w:r>
-        <w:rPr>
-          <w:rFonts w:ascii="Arial" w:hAnsi="Arial"/>
-          <w:sz w:val="20"/>
-        </w:rPr>
-        <w:t>. Sensors, 23(17), 7481. https://doi.org/10.3390/s23177481</w:t>
+        <w:t xml:space="preserve"> Gieraths, M., Kuchelmeister, F., &amp; Albiez, J. (2023). Modular Hardware Architecture for the Development of Underwater Vehicles Based on Systems Engineering. Sensors, 23(17), 7481. https://doi.org/10.3390/s23177481</w:t>
       </w:r>
     </w:p>
     <w:p>
@@ -17626,7 +16618,7 @@
       <w:r>
         <w:rPr>
           <w:rFonts w:ascii="Arial" w:hAnsi="Arial"/>
-          <w:b/>
+          <w:i/>
           <w:sz w:val="20"/>
         </w:rPr>
         <w:t>[12]</w:t>
@@ -17636,22 +16628,7 @@
           <w:rFonts w:ascii="Arial" w:hAnsi="Arial"/>
           <w:sz w:val="20"/>
         </w:rPr>
-        <w:t xml:space="preserve"> Hong, L., Wang, X., &amp; Zhang, D. (2024). </w:t>
-      </w:r>
-      <w:r>
-        <w:rPr>
-          <w:rFonts w:ascii="Arial" w:hAnsi="Arial"/>
-          <w:i/>
-          <w:sz w:val="20"/>
-        </w:rPr>
-        <w:t>CFD-Based Hydrodynamic Performance Investigation of Autonomous Underwater Vehicles: A Survey</w:t>
-      </w:r>
-      <w:r>
-        <w:rPr>
-          <w:rFonts w:ascii="Arial" w:hAnsi="Arial"/>
-          <w:sz w:val="20"/>
-        </w:rPr>
-        <w:t>. Ocean Engineering, 305, 117911. https://doi.org/10.1016/j.oceaneng.2024.117911</w:t>
+        <w:t xml:space="preserve"> Hong, L., Wang, X., &amp; Zhang, D. (2024). CFD-Based Hydrodynamic Performance Investigation of Autonomous Underwater Vehicles: A Survey. Ocean Engineering, 305, 117911. https://doi.org/10.1016/j.oceaneng.2024.117911</w:t>
       </w:r>
     </w:p>
     <w:p>
@@ -17668,7 +16645,7 @@
       <w:r>
         <w:rPr>
           <w:rFonts w:ascii="Arial" w:hAnsi="Arial"/>
-          <w:b/>
+          <w:i/>
           <w:sz w:val="20"/>
         </w:rPr>
         <w:t>[14]</w:t>
@@ -17678,22 +16655,7 @@
           <w:rFonts w:ascii="Arial" w:hAnsi="Arial"/>
           <w:sz w:val="20"/>
         </w:rPr>
-        <w:t xml:space="preserve"> Ismail, W. M., Hassan, A. E., Abdelhady, N. M., Hassan, N. A., Maged, S. A., &amp; Abdulhasieb, H. M. (2021). </w:t>
-      </w:r>
-      <w:r>
-        <w:rPr>
-          <w:rFonts w:ascii="Arial" w:hAnsi="Arial"/>
-          <w:i/>
-          <w:sz w:val="20"/>
-        </w:rPr>
-        <w:t>Design of Affordable Hybrid Underwater Vehicle Platform Using ArduSub &amp; Robot Operating System (ROS) for Marine Robotics Research</w:t>
-      </w:r>
-      <w:r>
-        <w:rPr>
-          <w:rFonts w:ascii="Arial" w:hAnsi="Arial"/>
-          <w:sz w:val="20"/>
-        </w:rPr>
-        <w:t>. In Proceedings of the 5th IUGRC International Undergraduate Research Conference, Cairo, Egypt, pp. 96–102.</w:t>
+        <w:t xml:space="preserve"> Ismail, W. M., Hassan, A. E., Abdelhady, N. M., Hassan, N. A., Maged, S. A., &amp; Abdulhasieb, H. M. (2021). Design of Affordable Hybrid Underwater Vehicle Platform Using ArduSub &amp; Robot Operating System (ROS) for Marine Robotics Research. In Proceedings of the 5th IUGRC International Undergraduate Research Conference, Cairo, Egypt, pp. 96–102.</w:t>
       </w:r>
     </w:p>
     <w:p>
@@ -17710,7 +16672,7 @@
       <w:r>
         <w:rPr>
           <w:rFonts w:ascii="Arial" w:hAnsi="Arial"/>
-          <w:b/>
+          <w:i/>
           <w:sz w:val="20"/>
         </w:rPr>
         <w:t>[15]</w:t>
@@ -17720,22 +16682,7 @@
           <w:rFonts w:ascii="Arial" w:hAnsi="Arial"/>
           <w:sz w:val="20"/>
         </w:rPr>
-        <w:t xml:space="preserve"> Karras, A. A., Charalampous, K., &amp; Kyriakopoulos, K. J. (2024). </w:t>
-      </w:r>
-      <w:r>
-        <w:rPr>
-          <w:rFonts w:ascii="Arial" w:hAnsi="Arial"/>
-          <w:i/>
-          <w:sz w:val="20"/>
-        </w:rPr>
-        <w:t>From Virtual Waters to Real Oceans: A Simulation-Driven Approach to ROV Control System Design</w:t>
-      </w:r>
-      <w:r>
-        <w:rPr>
-          <w:rFonts w:ascii="Arial" w:hAnsi="Arial"/>
-          <w:sz w:val="20"/>
-        </w:rPr>
-        <w:t>. Journal of Marine Science and Engineering, 12(11), 1957. https://doi.org/10.3390/jmse12111957</w:t>
+        <w:t xml:space="preserve"> Karras, A. A., Charalampous, K., &amp; Kyriakopoulos, K. J. (2024). From Virtual Waters to Real Oceans: A Simulation-Driven Approach to ROV Control System Design. Journal of Marine Science and Engineering, 12(11), 1957. https://doi.org/10.3390/jmse12111957</w:t>
       </w:r>
     </w:p>
     <w:p>
@@ -17752,7 +16699,7 @@
       <w:r>
         <w:rPr>
           <w:rFonts w:ascii="Arial" w:hAnsi="Arial"/>
-          <w:b/>
+          <w:i/>
           <w:sz w:val="20"/>
         </w:rPr>
         <w:t>[16]</w:t>
@@ -17762,22 +16709,7 @@
           <w:rFonts w:ascii="Arial" w:hAnsi="Arial"/>
           <w:sz w:val="20"/>
         </w:rPr>
-        <w:t xml:space="preserve"> Khalid, A., Sarwat, A., &amp; Riggs, H. (Eds.). (2024). </w:t>
-      </w:r>
-      <w:r>
-        <w:rPr>
-          <w:rFonts w:ascii="Arial" w:hAnsi="Arial"/>
-          <w:i/>
-          <w:sz w:val="20"/>
-        </w:rPr>
-        <w:t>Applications and Optimizations of Kalman Filter and Their Variants</w:t>
-      </w:r>
-      <w:r>
-        <w:rPr>
-          <w:rFonts w:ascii="Arial" w:hAnsi="Arial"/>
-          <w:sz w:val="20"/>
-        </w:rPr>
-        <w:t>. IntechOpen, London, UK. https://doi.org/10.5772/intechopen.109154</w:t>
+        <w:t xml:space="preserve"> Khalid, A., Sarwat, A., &amp; Riggs, H. (Eds.). (2024). Applications and Optimizations of Kalman Filter and Their Variants. IntechOpen, London, UK. https://doi.org/10.5772/intechopen.109154</w:t>
       </w:r>
     </w:p>
     <w:p>
@@ -17794,7 +16726,7 @@
       <w:r>
         <w:rPr>
           <w:rFonts w:ascii="Arial" w:hAnsi="Arial"/>
-          <w:b/>
+          <w:i/>
           <w:sz w:val="20"/>
         </w:rPr>
         <w:t>[17]</w:t>
@@ -17804,22 +16736,7 @@
           <w:rFonts w:ascii="Arial" w:hAnsi="Arial"/>
           <w:sz w:val="20"/>
         </w:rPr>
-        <w:t xml:space="preserve"> Kim, Y. V. (Ed.). (2023). </w:t>
-      </w:r>
-      <w:r>
-        <w:rPr>
-          <w:rFonts w:ascii="Arial" w:hAnsi="Arial"/>
-          <w:i/>
-          <w:sz w:val="20"/>
-        </w:rPr>
-        <w:t>Kalman Filter - Engineering Applications</w:t>
-      </w:r>
-      <w:r>
-        <w:rPr>
-          <w:rFonts w:ascii="Arial" w:hAnsi="Arial"/>
-          <w:sz w:val="20"/>
-        </w:rPr>
-        <w:t>. IntechOpen, London, UK. https://doi.org/10.5772/intechopen.100722</w:t>
+        <w:t xml:space="preserve"> Kim, Y. V. (Ed.). (2023). Kalman Filter - Engineering Applications. IntechOpen, London, UK. https://doi.org/10.5772/intechopen.100722</w:t>
       </w:r>
     </w:p>
     <w:p>
@@ -17836,7 +16753,7 @@
       <w:r>
         <w:rPr>
           <w:rFonts w:ascii="Arial" w:hAnsi="Arial"/>
-          <w:b/>
+          <w:i/>
           <w:sz w:val="20"/>
         </w:rPr>
         <w:t>[18]</w:t>
@@ -17846,22 +16763,7 @@
           <w:rFonts w:ascii="Arial" w:hAnsi="Arial"/>
           <w:sz w:val="20"/>
         </w:rPr>
-        <w:t xml:space="preserve"> Llorente-Vidrio, D., Chavez-Galaviz, J., Fuentes-Aguilar, R. Q., Chairez, I., &amp; Mahmoudian, N. (2025). </w:t>
-      </w:r>
-      <w:r>
-        <w:rPr>
-          <w:rFonts w:ascii="Arial" w:hAnsi="Arial"/>
-          <w:i/>
-          <w:sz w:val="20"/>
-        </w:rPr>
-        <w:t>Robust Sliding-Mode Control of an Underwater ROV via Neural Differential Identification of Model Uncertainties</w:t>
-      </w:r>
-      <w:r>
-        <w:rPr>
-          <w:rFonts w:ascii="Arial" w:hAnsi="Arial"/>
-          <w:sz w:val="20"/>
-        </w:rPr>
-        <w:t>. Ocean Engineering, 341, 122728. https://doi.org/10.1016/j.oceaneng.2025.122728</w:t>
+        <w:t xml:space="preserve"> Llorente-Vidrio, D., Chavez-Galaviz, J., Fuentes-Aguilar, R. Q., Chairez, I., &amp; Mahmoudian, N. (2025). Robust Sliding-Mode Control of an Underwater ROV via Neural Differential Identification of Model Uncertainties. Ocean Engineering, 341, 122728. https://doi.org/10.1016/j.oceaneng.2025.122728</w:t>
       </w:r>
     </w:p>
     <w:p>
@@ -17878,7 +16780,7 @@
       <w:r>
         <w:rPr>
           <w:rFonts w:ascii="Arial" w:hAnsi="Arial"/>
-          <w:b/>
+          <w:i/>
           <w:sz w:val="20"/>
         </w:rPr>
         <w:t>[19]</w:t>
@@ -17888,22 +16790,7 @@
           <w:rFonts w:ascii="Arial" w:hAnsi="Arial"/>
           <w:sz w:val="20"/>
         </w:rPr>
-        <w:t xml:space="preserve"> Mari, Z., Nawaf, M. M., &amp; Drap, P. (2026). </w:t>
-      </w:r>
-      <w:r>
-        <w:rPr>
-          <w:rFonts w:ascii="Arial" w:hAnsi="Arial"/>
-          <w:i/>
-          <w:sz w:val="20"/>
-        </w:rPr>
-        <w:t>Deep Reinforcement Learning for Autonomous Underwater Navigation: A Comparative Study with DWA and Digital Twin Validation</w:t>
-      </w:r>
-      <w:r>
-        <w:rPr>
-          <w:rFonts w:ascii="Arial" w:hAnsi="Arial"/>
-          <w:sz w:val="20"/>
-        </w:rPr>
-        <w:t>. Sensors, 26(2), 512. https://doi.org/10.3390/s26020512</w:t>
+        <w:t xml:space="preserve"> Mari, Z., Nawaf, M. M., &amp; Drap, P. (2026). Deep Reinforcement Learning for Autonomous Underwater Navigation: A Comparative Study with DWA and Digital Twin Validation. Sensors, 26(2), 512. https://doi.org/10.3390/s26020512</w:t>
       </w:r>
     </w:p>
     <w:p>
@@ -17920,7 +16807,7 @@
       <w:r>
         <w:rPr>
           <w:rFonts w:ascii="Arial" w:hAnsi="Arial"/>
-          <w:b/>
+          <w:i/>
           <w:sz w:val="20"/>
         </w:rPr>
         <w:t>[20]</w:t>
@@ -17930,22 +16817,7 @@
           <w:rFonts w:ascii="Arial" w:hAnsi="Arial"/>
           <w:sz w:val="20"/>
         </w:rPr>
-        <w:t xml:space="preserve"> McIvor, E., Sklivanitis, G., &amp; Pados, D. A. (2024). </w:t>
-      </w:r>
-      <w:r>
-        <w:rPr>
-          <w:rFonts w:ascii="Arial" w:hAnsi="Arial"/>
-          <w:i/>
-          <w:sz w:val="20"/>
-        </w:rPr>
-        <w:t>A Generalizable Entity-Component-System Architecture for Underwater ROV Control</w:t>
-      </w:r>
-      <w:r>
-        <w:rPr>
-          <w:rFonts w:ascii="Arial" w:hAnsi="Arial"/>
-          <w:sz w:val="20"/>
-        </w:rPr>
-        <w:t>. In IEEE/OES OCEANS 2024 - Singapore, pp. 1–7. https://doi.org/10.1109/OCEANS51537.2024.10682121</w:t>
+        <w:t xml:space="preserve"> McIvor, E., Sklivanitis, G., &amp; Pados, D. A. (2024). A Generalizable Entity-Component-System Architecture for Underwater ROV Control. In IEEE/OES OCEANS 2024 - Singapore, pp. 1–7. https://doi.org/10.1109/OCEANS51537.2024.10682121</w:t>
       </w:r>
     </w:p>
     <w:p>
@@ -17962,7 +16834,7 @@
       <w:r>
         <w:rPr>
           <w:rFonts w:ascii="Arial" w:hAnsi="Arial"/>
-          <w:b/>
+          <w:i/>
           <w:sz w:val="20"/>
         </w:rPr>
         <w:t>[21]</w:t>
@@ -17972,22 +16844,7 @@
           <w:rFonts w:ascii="Arial" w:hAnsi="Arial"/>
           <w:sz w:val="20"/>
         </w:rPr>
-        <w:t xml:space="preserve"> Ng, P., &amp; Krieg, M. (2024). </w:t>
-      </w:r>
-      <w:r>
-        <w:rPr>
-          <w:rFonts w:ascii="Arial" w:hAnsi="Arial"/>
-          <w:i/>
-          <w:sz w:val="20"/>
-        </w:rPr>
-        <w:t>Modifications to ArduSub That Improve BlueROV SITL Accuracy and Design of Hybrid Autopilot</w:t>
-      </w:r>
-      <w:r>
-        <w:rPr>
-          <w:rFonts w:ascii="Arial" w:hAnsi="Arial"/>
-          <w:sz w:val="20"/>
-        </w:rPr>
-        <w:t>. Applied Sciences, 14(17), 7453. https://doi.org/10.3390/app14177453</w:t>
+        <w:t xml:space="preserve"> Ng, P., &amp; Krieg, M. (2024). Modifications to ArduSub That Improve BlueROV SITL Accuracy and Design of Hybrid Autopilot. Applied Sciences, 14(17), 7453. https://doi.org/10.3390/app14177453</w:t>
       </w:r>
     </w:p>
     <w:p>
@@ -18004,7 +16861,7 @@
       <w:r>
         <w:rPr>
           <w:rFonts w:ascii="Arial" w:hAnsi="Arial"/>
-          <w:b/>
+          <w:i/>
           <w:sz w:val="20"/>
         </w:rPr>
         <w:t>[25]</w:t>
@@ -18014,22 +16871,7 @@
           <w:rFonts w:ascii="Arial" w:hAnsi="Arial"/>
           <w:sz w:val="20"/>
         </w:rPr>
-        <w:t xml:space="preserve"> Särkkä, S., &amp; Svensson, L. (2023). </w:t>
-      </w:r>
-      <w:r>
-        <w:rPr>
-          <w:rFonts w:ascii="Arial" w:hAnsi="Arial"/>
-          <w:i/>
-          <w:sz w:val="20"/>
-        </w:rPr>
-        <w:t>Bayesian Filtering and Smoothing</w:t>
-      </w:r>
-      <w:r>
-        <w:rPr>
-          <w:rFonts w:ascii="Arial" w:hAnsi="Arial"/>
-          <w:sz w:val="20"/>
-        </w:rPr>
-        <w:t>. Cambridge University Press, 2nd Edition, Cambridge, UK. https://doi.org/10.1017/9781108910002</w:t>
+        <w:t xml:space="preserve"> Särkkä, S., &amp; Svensson, L. (2023). Bayesian Filtering and Smoothing. Cambridge University Press, 2nd Edition, Cambridge, UK. https://doi.org/10.1017/9781108910002</w:t>
       </w:r>
     </w:p>
     <w:p>
@@ -18046,7 +16888,7 @@
       <w:r>
         <w:rPr>
           <w:rFonts w:ascii="Arial" w:hAnsi="Arial"/>
-          <w:b/>
+          <w:i/>
           <w:sz w:val="20"/>
         </w:rPr>
         <w:t>[26]</w:t>
@@ -18056,22 +16898,7 @@
           <w:rFonts w:ascii="Arial" w:hAnsi="Arial"/>
           <w:sz w:val="20"/>
         </w:rPr>
-        <w:t xml:space="preserve"> Song, P., Wei, Z., Zhang, J., &amp; Wang, X. (2023). </w:t>
-      </w:r>
-      <w:r>
-        <w:rPr>
-          <w:rFonts w:ascii="Arial" w:hAnsi="Arial"/>
-          <w:i/>
-          <w:sz w:val="20"/>
-        </w:rPr>
-        <w:t>Multi-Objective Shape Optimization of Autonomous Underwater Vehicle by Coupling CFD Simulation with Genetic Algorithm</w:t>
-      </w:r>
-      <w:r>
-        <w:rPr>
-          <w:rFonts w:ascii="Arial" w:hAnsi="Arial"/>
-          <w:sz w:val="20"/>
-        </w:rPr>
-        <w:t>. Ocean Engineering, 280, 114686. https://doi.org/10.1016/j.oceaneng.2023.114686</w:t>
+        <w:t xml:space="preserve"> Song, P., Wei, Z., Zhang, J., &amp; Wang, X. (2023). Multi-Objective Shape Optimization of Autonomous Underwater Vehicle by Coupling CFD Simulation with Genetic Algorithm. Ocean Engineering, 280, 114686. https://doi.org/10.1016/j.oceaneng.2023.114686</w:t>
       </w:r>
     </w:p>
     <w:p>
@@ -18088,7 +16915,7 @@
       <w:r>
         <w:rPr>
           <w:rFonts w:ascii="Arial" w:hAnsi="Arial"/>
-          <w:b/>
+          <w:i/>
           <w:sz w:val="20"/>
         </w:rPr>
         <w:t>[28]</w:t>
@@ -18098,22 +16925,7 @@
           <w:rFonts w:ascii="Arial" w:hAnsi="Arial"/>
           <w:sz w:val="20"/>
         </w:rPr>
-        <w:t xml:space="preserve"> Sun, Y., Wang, X., Zhang, Y., &amp; Chen, G. (2022). </w:t>
-      </w:r>
-      <w:r>
-        <w:rPr>
-          <w:rFonts w:ascii="Arial" w:hAnsi="Arial"/>
-          <w:i/>
-          <w:sz w:val="20"/>
-        </w:rPr>
-        <w:t>Nonlinear Dynamics of Novel Flight-Style Autonomous Underwater Vehicle with Bow Wings, Part I: ASE and CFD Based Estimations of Hydrodynamic Coefficients; Part II: Nonlinear Dynamic Modeling and Experimental Validations</w:t>
-      </w:r>
-      <w:r>
-        <w:rPr>
-          <w:rFonts w:ascii="Arial" w:hAnsi="Arial"/>
-          <w:sz w:val="20"/>
-        </w:rPr>
-        <w:t>. Ocean Engineering, 266, 112836. https://doi.org/10.1016/j.oceaneng.2022.112836</w:t>
+        <w:t xml:space="preserve"> Sun, Y., Wang, X., Zhang, Y., &amp; Chen, G. (2022). Nonlinear Dynamics of Novel Flight-Style Autonomous Underwater Vehicle with Bow Wings, Part I: ASE and CFD Based Estimations of Hydrodynamic Coefficients; Part II: Nonlinear Dynamic Modeling and Experimental Validations. Ocean Engineering, 266, 112836. https://doi.org/10.1016/j.oceaneng.2022.112836</w:t>
       </w:r>
     </w:p>
     <w:p>
@@ -18130,7 +16942,7 @@
       <w:r>
         <w:rPr>
           <w:rFonts w:ascii="Arial" w:hAnsi="Arial"/>
-          <w:b/>
+          <w:i/>
           <w:sz w:val="20"/>
         </w:rPr>
         <w:t>[29]</w:t>
@@ -18140,7 +16952,7 @@
           <w:rFonts w:ascii="Arial" w:hAnsi="Arial"/>
           <w:sz w:val="20"/>
         </w:rPr>
-        <w:t xml:space="preserve"> Ulin-Avila, E., &amp; Ponce-Hernandez, J. (2021). </w:t>
+        <w:t xml:space="preserve"> Ulin-Avila, E., &amp; Ponce-Hernandez, J. (2021). Kalman Filter Estimation and Its Implementation</w:t>
       </w:r>
       <w:r>
         <w:rPr>
@@ -18148,29 +16960,14 @@
           <w:i/>
           <w:sz w:val="20"/>
         </w:rPr>
-        <w:t>Kalman Filter Estimation and Its Implementation</w:t>
-      </w:r>
-      <w:r>
-        <w:rPr>
-          <w:rFonts w:ascii="Arial" w:hAnsi="Arial"/>
-          <w:sz w:val="20"/>
-        </w:rPr>
-        <w:t xml:space="preserve">. In </w:t>
-      </w:r>
-      <w:r>
-        <w:rPr>
-          <w:rFonts w:ascii="Arial" w:hAnsi="Arial"/>
-          <w:i/>
-          <w:sz w:val="20"/>
-        </w:rPr>
-        <w:t>Adaptive Filtering - Recent Advances and Practical Implementation</w:t>
-      </w:r>
-      <w:r>
-        <w:rPr>
-          <w:rFonts w:ascii="Arial" w:hAnsi="Arial"/>
-          <w:sz w:val="20"/>
-        </w:rPr>
-        <w:t>, IntechOpen, London, UK. https://doi.org/10.5772/intechopen.97406</w:t>
+        <w:t>. In</w:t>
+      </w:r>
+      <w:r>
+        <w:rPr>
+          <w:rFonts w:ascii="Arial" w:hAnsi="Arial"/>
+          <w:sz w:val="20"/>
+        </w:rPr>
+        <w:t>Adaptive Filtering - Recent Advances and Practical Implementation, IntechOpen, London, UK. https://doi.org/10.5772/intechopen.97406</w:t>
       </w:r>
     </w:p>
     <w:p>
@@ -18187,7 +16984,7 @@
       <w:r>
         <w:rPr>
           <w:rFonts w:ascii="Arial" w:hAnsi="Arial"/>
-          <w:b/>
+          <w:i/>
           <w:sz w:val="20"/>
         </w:rPr>
         <w:t>[30]</w:t>
@@ -18197,22 +16994,7 @@
           <w:rFonts w:ascii="Arial" w:hAnsi="Arial"/>
           <w:sz w:val="20"/>
         </w:rPr>
-        <w:t xml:space="preserve"> Vögele, C., Schilling, M., &amp; Hildebrandt, M. (2022). </w:t>
-      </w:r>
-      <w:r>
-        <w:rPr>
-          <w:rFonts w:ascii="Arial" w:hAnsi="Arial"/>
-          <w:i/>
-          <w:sz w:val="20"/>
-        </w:rPr>
-        <w:t>Modularis: Modular Underwater Robot for Rapid Development and Validation of Autonomous Systems</w:t>
-      </w:r>
-      <w:r>
-        <w:rPr>
-          <w:rFonts w:ascii="Arial" w:hAnsi="Arial"/>
-          <w:sz w:val="20"/>
-        </w:rPr>
-        <w:t>. In 2022 IEEE International Conference on Robotics and Biomimetics (ROBIO), pp. 2004–2010. https://doi.org/10.1109/ROBIO54168.2022.10011985</w:t>
+        <w:t xml:space="preserve"> Vögele, C., Schilling, M., &amp; Hildebrandt, M. (2022). Modularis: Modular Underwater Robot for Rapid Development and Validation of Autonomous Systems. In 2022 IEEE International Conference on Robotics and Biomimetics (ROBIO), pp. 2004–2010. https://doi.org/10.1109/ROBIO54168.2022.10011985</w:t>
       </w:r>
     </w:p>
     <w:p>
@@ -18229,7 +17011,7 @@
       <w:r>
         <w:rPr>
           <w:rFonts w:ascii="Arial" w:hAnsi="Arial"/>
-          <w:b/>
+          <w:i/>
           <w:sz w:val="20"/>
         </w:rPr>
         <w:t>[31]</w:t>
@@ -18239,22 +17021,7 @@
           <w:rFonts w:ascii="Arial" w:hAnsi="Arial"/>
           <w:sz w:val="20"/>
         </w:rPr>
-        <w:t xml:space="preserve"> von Benzon, M., Sørensen, F. F., Uth, E., Jouffroy, J., Liniger, J., &amp; Pedersen, S. (2022). </w:t>
-      </w:r>
-      <w:r>
-        <w:rPr>
-          <w:rFonts w:ascii="Arial" w:hAnsi="Arial"/>
-          <w:i/>
-          <w:sz w:val="20"/>
-        </w:rPr>
-        <w:t>An Open-Source Benchmark Simulator: Control of a BlueROV2 Underwater Robot</w:t>
-      </w:r>
-      <w:r>
-        <w:rPr>
-          <w:rFonts w:ascii="Arial" w:hAnsi="Arial"/>
-          <w:sz w:val="20"/>
-        </w:rPr>
-        <w:t>. Journal of Marine Science and Engineering, 10(12), 1898. https://doi.org/10.3390/jmse10121898</w:t>
+        <w:t xml:space="preserve"> von Benzon, M., Sørensen, F. F., Uth, E., Jouffroy, J., Liniger, J., &amp; Pedersen, S. (2022). An Open-Source Benchmark Simulator: Control of a BlueROV2 Underwater Robot. Journal of Marine Science and Engineering, 10(12), 1898. https://doi.org/10.3390/jmse10121898</w:t>
       </w:r>
     </w:p>
     <w:p>
@@ -18271,7 +17038,7 @@
       <w:r>
         <w:rPr>
           <w:rFonts w:ascii="Arial" w:hAnsi="Arial"/>
-          <w:b/>
+          <w:i/>
           <w:sz w:val="20"/>
         </w:rPr>
         <w:t>[32]</w:t>
@@ -18281,22 +17048,7 @@
           <w:rFonts w:ascii="Arial" w:hAnsi="Arial"/>
           <w:sz w:val="20"/>
         </w:rPr>
-        <w:t xml:space="preserve"> Vu, M. T., Le, T. H., Thanh, H. L. N. N., Huynh, T. T., Van, M., Hoang, Q. D., &amp; Do, T. D. (2021). </w:t>
-      </w:r>
-      <w:r>
-        <w:rPr>
-          <w:rFonts w:ascii="Arial" w:hAnsi="Arial"/>
-          <w:i/>
-          <w:sz w:val="20"/>
-        </w:rPr>
-        <w:t>Robust Position Control of an Over-Actuated Underwater Vehicle Under Model Uncertainties and Ocean Current Effects Using Dynamic Sliding Mode Surface and Optimal Allocation Control</w:t>
-      </w:r>
-      <w:r>
-        <w:rPr>
-          <w:rFonts w:ascii="Arial" w:hAnsi="Arial"/>
-          <w:sz w:val="20"/>
-        </w:rPr>
-        <w:t>. Sensors, 21(3), 747. https://doi.org/10.3390/s21030747</w:t>
+        <w:t xml:space="preserve"> Vu, M. T., Le, T. H., Thanh, H. L. N. N., Huynh, T. T., Van, M., Hoang, Q. D., &amp; Do, T. D. (2021). Robust Position Control of an Over-Actuated Underwater Vehicle Under Model Uncertainties and Ocean Current Effects Using Dynamic Sliding Mode Surface and Optimal Allocation Control. Sensors, 21(3), 747. https://doi.org/10.3390/s21030747</w:t>
       </w:r>
     </w:p>
     <w:p>
@@ -18313,7 +17065,7 @@
       <w:r>
         <w:rPr>
           <w:rFonts w:ascii="Arial" w:hAnsi="Arial"/>
-          <w:b/>
+          <w:i/>
           <w:sz w:val="20"/>
         </w:rPr>
         <w:t>[34]</w:t>
@@ -18323,22 +17075,7 @@
           <w:rFonts w:ascii="Arial" w:hAnsi="Arial"/>
           <w:sz w:val="20"/>
         </w:rPr>
-        <w:t xml:space="preserve"> Wei, X., Du, H., Yan, T., &amp; He, B. (2025). </w:t>
-      </w:r>
-      <w:r>
-        <w:rPr>
-          <w:rFonts w:ascii="Arial" w:hAnsi="Arial"/>
-          <w:i/>
-          <w:sz w:val="20"/>
-        </w:rPr>
-        <w:t>A Solution Method for Hydrodynamic Coefficients of Autonomous Underwater Vehicle Using Multi-Degree-of-Freedom Coupled Motion Data</w:t>
-      </w:r>
-      <w:r>
-        <w:rPr>
-          <w:rFonts w:ascii="Arial" w:hAnsi="Arial"/>
-          <w:sz w:val="20"/>
-        </w:rPr>
-        <w:t>. Ocean Engineering, 341, 122653. https://doi.org/10.1016/j.oceaneng.2025.122653</w:t>
+        <w:t xml:space="preserve"> Wei, X., Du, H., Yan, T., &amp; He, B. (2025). A Solution Method for Hydrodynamic Coefficients of Autonomous Underwater Vehicle Using Multi-Degree-of-Freedom Coupled Motion Data. Ocean Engineering, 341, 122653. https://doi.org/10.1016/j.oceaneng.2025.122653</w:t>
       </w:r>
     </w:p>
     <w:p>
@@ -18355,7 +17092,7 @@
       <w:r>
         <w:rPr>
           <w:rFonts w:ascii="Arial" w:hAnsi="Arial"/>
-          <w:b/>
+          <w:i/>
           <w:sz w:val="20"/>
         </w:rPr>
         <w:t>[35]</w:t>
@@ -18365,22 +17102,7 @@
           <w:rFonts w:ascii="Arial" w:hAnsi="Arial"/>
           <w:sz w:val="20"/>
         </w:rPr>
-        <w:t xml:space="preserve"> Westman, E., Kaess, M., &amp; Hollinger, G. A. (2021). </w:t>
-      </w:r>
-      <w:r>
-        <w:rPr>
-          <w:rFonts w:ascii="Arial" w:hAnsi="Arial"/>
-          <w:i/>
-          <w:sz w:val="20"/>
-        </w:rPr>
-        <w:t>Towards Modular and Accessible AUV Systems</w:t>
-      </w:r>
-      <w:r>
-        <w:rPr>
-          <w:rFonts w:ascii="Arial" w:hAnsi="Arial"/>
-          <w:sz w:val="20"/>
-        </w:rPr>
-        <w:t>. In 2021 IEEE Aerospace Conference (50100), pp. 1–10. https://doi.org/10.1109/AERO50100.2021.9438312</w:t>
+        <w:t xml:space="preserve"> Westman, E., Kaess, M., &amp; Hollinger, G. A. (2021). Towards Modular and Accessible AUV Systems. In 2021 IEEE Aerospace Conference (50100), pp. 1–10. https://doi.org/10.1109/AERO50100.2021.9438312</w:t>
       </w:r>
     </w:p>
     <w:p>
@@ -18397,7 +17119,7 @@
       <w:r>
         <w:rPr>
           <w:rFonts w:ascii="Arial" w:hAnsi="Arial"/>
-          <w:b/>
+          <w:i/>
           <w:sz w:val="20"/>
         </w:rPr>
         <w:t>[36]</w:t>
@@ -18407,22 +17129,7 @@
           <w:rFonts w:ascii="Arial" w:hAnsi="Arial"/>
           <w:sz w:val="20"/>
         </w:rPr>
-        <w:t xml:space="preserve"> Widhalm, D., Ohnsted, C., Knutson, C., Kutzke, D., Singh, S., Mukherjee, R., Schwidder, G., Wu, Y.-K., &amp; Sattar, J. (2025). </w:t>
-      </w:r>
-      <w:r>
-        <w:rPr>
-          <w:rFonts w:ascii="Arial" w:hAnsi="Arial"/>
-          <w:i/>
-          <w:sz w:val="20"/>
-        </w:rPr>
-        <w:t>Design and Development of the MeCO Open-Source Autonomous Underwater Vehicle</w:t>
-      </w:r>
-      <w:r>
-        <w:rPr>
-          <w:rFonts w:ascii="Arial" w:hAnsi="Arial"/>
-          <w:sz w:val="20"/>
-        </w:rPr>
-        <w:t>. In IEEE/RSJ International Conference on Intelligent Robots and Systems (IROS).</w:t>
+        <w:t xml:space="preserve"> Widhalm, D., Ohnsted, C., Knutson, C., Kutzke, D., Singh, S., Mukherjee, R., Schwidder, G., Wu, Y.-K., &amp; Sattar, J. (2025). Design and Development of the MeCO Open-Source Autonomous Underwater Vehicle. In IEEE/RSJ International Conference on Intelligent Robots and Systems (IROS).</w:t>
       </w:r>
     </w:p>
     <w:p>
@@ -18439,7 +17146,7 @@
       <w:r>
         <w:rPr>
           <w:rFonts w:ascii="Arial" w:hAnsi="Arial"/>
-          <w:b/>
+          <w:i/>
           <w:sz w:val="20"/>
         </w:rPr>
         <w:t>[37]</w:t>
@@ -18449,22 +17156,7 @@
           <w:rFonts w:ascii="Arial" w:hAnsi="Arial"/>
           <w:sz w:val="20"/>
         </w:rPr>
-        <w:t xml:space="preserve"> Xia, T., Liu, S., Wang, T., Li, J., Lin, W., Zhang, B., Cai, Y., &amp; Xu, W. (2025). </w:t>
-      </w:r>
-      <w:r>
-        <w:rPr>
-          <w:rFonts w:ascii="Arial" w:hAnsi="Arial"/>
-          <w:i/>
-          <w:sz w:val="20"/>
-        </w:rPr>
-        <w:t>Experimental and Numerical Analysis on Two-Way Hull–Propeller Coupled Effect of a Fully-Actuated AUV</w:t>
-      </w:r>
-      <w:r>
-        <w:rPr>
-          <w:rFonts w:ascii="Arial" w:hAnsi="Arial"/>
-          <w:sz w:val="20"/>
-        </w:rPr>
-        <w:t>. Ocean Engineering, 321, 120288. https://doi.org/10.1016/j.oceaneng.2025.120288</w:t>
+        <w:t xml:space="preserve"> Xia, T., Liu, S., Wang, T., Li, J., Lin, W., Zhang, B., Cai, Y., &amp; Xu, W. (2025). Experimental and Numerical Analysis on Two-Way Hull–Propeller Coupled Effect of a Fully-Actuated AUV. Ocean Engineering, 321, 120288. https://doi.org/10.1016/j.oceaneng.2025.120288</w:t>
       </w:r>
     </w:p>
     <w:p>
@@ -18481,7 +17173,7 @@
       <w:r>
         <w:rPr>
           <w:rFonts w:ascii="Arial" w:hAnsi="Arial"/>
-          <w:b/>
+          <w:i/>
           <w:sz w:val="20"/>
         </w:rPr>
         <w:t>[40]</w:t>
@@ -18491,22 +17183,7 @@
           <w:rFonts w:ascii="Arial" w:hAnsi="Arial"/>
           <w:sz w:val="20"/>
         </w:rPr>
-        <w:t xml:space="preserve"> Zhang, Y., Zhang, J., Guo, Z., Zhang, L., &amp; Shang, Y. (2025). </w:t>
-      </w:r>
-      <w:r>
-        <w:rPr>
-          <w:rFonts w:ascii="Arial" w:hAnsi="Arial"/>
-          <w:i/>
-          <w:sz w:val="20"/>
-        </w:rPr>
-        <w:t>An Adaptive NMPC for ROVs Trajectory Tracking with Environmental Disturbances and Model Uncertainties</w:t>
-      </w:r>
-      <w:r>
-        <w:rPr>
-          <w:rFonts w:ascii="Arial" w:hAnsi="Arial"/>
-          <w:sz w:val="20"/>
-        </w:rPr>
-        <w:t>. Brodogradnja, 76(1), 1–25. https://doi.org/10.21278/brod76101</w:t>
+        <w:t xml:space="preserve"> Zhang, Y., Zhang, J., Guo, Z., Zhang, L., &amp; Shang, Y. (2025). An Adaptive NMPC for ROVs Trajectory Tracking with Environmental Disturbances and Model Uncertainties. Brodogradnja, 76(1), 1–25. https://doi.org/10.21278/brod76101</w:t>
       </w:r>
     </w:p>
     <w:p>
@@ -18523,7 +17200,7 @@
       <w:r>
         <w:rPr>
           <w:rFonts w:ascii="Arial" w:hAnsi="Arial"/>
-          <w:b/>
+          <w:i/>
           <w:sz w:val="20"/>
         </w:rPr>
         <w:t>[41]</w:t>
@@ -18533,22 +17210,7 @@
           <w:rFonts w:ascii="Arial" w:hAnsi="Arial"/>
           <w:sz w:val="20"/>
         </w:rPr>
-        <w:t xml:space="preserve"> Zuluaga, C. A., Aristizábal, L. M., Rúa, S., Franco, D. A., Osorio, D. A., &amp; Vásquez, R. E. (2022). </w:t>
-      </w:r>
-      <w:r>
-        <w:rPr>
-          <w:rFonts w:ascii="Arial" w:hAnsi="Arial"/>
-          <w:i/>
-          <w:sz w:val="20"/>
-        </w:rPr>
-        <w:t>Development of a Modular Software Architecture for Underwater Vehicles Using Systems Engineering</w:t>
-      </w:r>
-      <w:r>
-        <w:rPr>
-          <w:rFonts w:ascii="Arial" w:hAnsi="Arial"/>
-          <w:sz w:val="20"/>
-        </w:rPr>
-        <w:t>. Journal of Marine Science and Engineering, 10(9), 1276. https://doi.org/10.3390/jmse10091276</w:t>
+        <w:t xml:space="preserve"> Zuluaga, C. A., Aristizábal, L. M., Rúa, S., Franco, D. A., Osorio, D. A., &amp; Vásquez, R. E. (2022). Development of a Modular Software Architecture for Underwater Vehicles Using Systems Engineering. Journal of Marine Science and Engineering, 10(9), 1276. https://doi.org/10.3390/jmse10091276</w:t>
       </w:r>
     </w:p>
     <w:sectPr>

</xml_diff>